<commit_message>
opdateret testfiler og protokoller
</commit_message>
<xml_diff>
--- a/docs/assets/CareCommunication_Testprotocol_Receive.docx
+++ b/docs/assets/CareCommunication_Testprotocol_Receive.docx
@@ -171,7 +171,7 @@
           <w:szCs w:val="56"/>
           <w:lang w:val="en-US"/>
         </w:rPr>
-        <w:t xml:space="preserve">October </w:t>
+        <w:t>July</w:t>
       </w:r>
       <w:r>
         <w:rPr>
@@ -182,29 +182,7 @@
           <w:szCs w:val="56"/>
           <w:lang w:val="en-US"/>
         </w:rPr>
-        <w:t>20</w:t>
-      </w:r>
-      <w:r>
-        <w:rPr>
-          <w:rFonts w:ascii="Calibri Light" w:eastAsia="Times New Roman" w:hAnsi="Calibri Light" w:cs="Times New Roman"/>
-          <w:spacing w:val="-10"/>
-          <w:kern w:val="28"/>
-          <w:sz w:val="56"/>
-          <w:szCs w:val="56"/>
-          <w:lang w:val="en-US"/>
-        </w:rPr>
-        <w:t>2</w:t>
-      </w:r>
-      <w:r>
-        <w:rPr>
-          <w:rFonts w:ascii="Calibri Light" w:eastAsia="Times New Roman" w:hAnsi="Calibri Light" w:cs="Times New Roman"/>
-          <w:spacing w:val="-10"/>
-          <w:kern w:val="28"/>
-          <w:sz w:val="56"/>
-          <w:szCs w:val="56"/>
-          <w:lang w:val="en-US"/>
-        </w:rPr>
-        <w:t>5</w:t>
+        <w:t xml:space="preserve"> 2026</w:t>
       </w:r>
     </w:p>
     <w:p>
@@ -2483,6 +2461,245 @@
           </w:p>
         </w:tc>
       </w:tr>
+      <w:tr>
+        <w:trPr>
+          <w:trHeight w:val="300"/>
+        </w:trPr>
+        <w:tc>
+          <w:tcPr>
+            <w:tcW w:w="468" w:type="pct"/>
+            <w:vAlign w:val="center"/>
+          </w:tcPr>
+          <w:p>
+            <w:pPr>
+              <w:jc w:val="center"/>
+              <w:rPr>
+                <w:sz w:val="20"/>
+                <w:szCs w:val="20"/>
+              </w:rPr>
+            </w:pPr>
+            <w:r>
+              <w:rPr>
+                <w:sz w:val="20"/>
+                <w:szCs w:val="20"/>
+              </w:rPr>
+              <w:lastRenderedPageBreak/>
+              <w:t>5.0.1</w:t>
+            </w:r>
+          </w:p>
+        </w:tc>
+        <w:tc>
+          <w:tcPr>
+            <w:tcW w:w="887" w:type="pct"/>
+            <w:vAlign w:val="center"/>
+          </w:tcPr>
+          <w:p>
+            <w:pPr>
+              <w:rPr>
+                <w:sz w:val="20"/>
+                <w:szCs w:val="20"/>
+              </w:rPr>
+            </w:pPr>
+            <w:r>
+              <w:rPr>
+                <w:sz w:val="20"/>
+                <w:szCs w:val="20"/>
+              </w:rPr>
+              <w:t>RCH</w:t>
+            </w:r>
+            <w:r>
+              <w:rPr>
+                <w:sz w:val="20"/>
+                <w:szCs w:val="20"/>
+              </w:rPr>
+              <w:t>/SKS</w:t>
+            </w:r>
+          </w:p>
+        </w:tc>
+        <w:tc>
+          <w:tcPr>
+            <w:tcW w:w="455" w:type="pct"/>
+            <w:vAlign w:val="center"/>
+          </w:tcPr>
+          <w:p>
+            <w:pPr>
+              <w:rPr>
+                <w:sz w:val="20"/>
+                <w:szCs w:val="20"/>
+              </w:rPr>
+            </w:pPr>
+            <w:r>
+              <w:rPr>
+                <w:sz w:val="20"/>
+                <w:szCs w:val="20"/>
+              </w:rPr>
+              <w:t>07-07</w:t>
+            </w:r>
+            <w:r>
+              <w:rPr>
+                <w:sz w:val="20"/>
+                <w:szCs w:val="20"/>
+              </w:rPr>
+              <w:t>-2026</w:t>
+            </w:r>
+          </w:p>
+        </w:tc>
+        <w:tc>
+          <w:tcPr>
+            <w:tcW w:w="3190" w:type="pct"/>
+            <w:vAlign w:val="center"/>
+          </w:tcPr>
+          <w:p>
+            <w:pPr>
+              <w:rPr>
+                <w:sz w:val="20"/>
+                <w:szCs w:val="20"/>
+                <w:lang w:val="en-US"/>
+              </w:rPr>
+            </w:pPr>
+            <w:r>
+              <w:rPr>
+                <w:sz w:val="20"/>
+                <w:szCs w:val="20"/>
+                <w:lang w:val="en-US"/>
+              </w:rPr>
+              <w:t xml:space="preserve">Updated wrong test file reference in test steps </w:t>
+            </w:r>
+            <w:r>
+              <w:rPr>
+                <w:sz w:val="20"/>
+                <w:szCs w:val="20"/>
+                <w:lang w:val="en-US"/>
+              </w:rPr>
+              <w:t>3.2.1.7 + 3.2.1.8</w:t>
+            </w:r>
+            <w:r>
+              <w:rPr>
+                <w:sz w:val="20"/>
+                <w:szCs w:val="20"/>
+                <w:lang w:val="en-US"/>
+              </w:rPr>
+              <w:t>.</w:t>
+            </w:r>
+          </w:p>
+          <w:p>
+            <w:pPr>
+              <w:rPr>
+                <w:sz w:val="20"/>
+                <w:szCs w:val="20"/>
+                <w:lang w:val="en-US"/>
+              </w:rPr>
+            </w:pPr>
+            <w:r>
+              <w:rPr>
+                <w:sz w:val="20"/>
+                <w:szCs w:val="20"/>
+                <w:lang w:val="en-US"/>
+              </w:rPr>
+              <w:t>Clarified</w:t>
+            </w:r>
+            <w:r>
+              <w:rPr>
+                <w:sz w:val="20"/>
+                <w:szCs w:val="20"/>
+                <w:lang w:val="en-US"/>
+              </w:rPr>
+              <w:t xml:space="preserve"> sender/signature and sender organization in test step 3.1.3.4</w:t>
+            </w:r>
+          </w:p>
+          <w:p>
+            <w:pPr>
+              <w:rPr>
+                <w:sz w:val="20"/>
+                <w:szCs w:val="20"/>
+                <w:lang w:val="en-US"/>
+              </w:rPr>
+            </w:pPr>
+            <w:r>
+              <w:rPr>
+                <w:sz w:val="20"/>
+                <w:szCs w:val="20"/>
+                <w:lang w:val="en-US"/>
+              </w:rPr>
+              <w:t xml:space="preserve">Added test step 3.1.3.5 to clarify </w:t>
+            </w:r>
+            <w:r>
+              <w:rPr>
+                <w:sz w:val="20"/>
+                <w:szCs w:val="20"/>
+                <w:lang w:val="en-US"/>
+              </w:rPr>
+              <w:t>handling of receiving organization in a forwarded message.</w:t>
+            </w:r>
+          </w:p>
+          <w:p>
+            <w:pPr>
+              <w:rPr>
+                <w:sz w:val="20"/>
+                <w:szCs w:val="20"/>
+                <w:lang w:val="en-US"/>
+              </w:rPr>
+            </w:pPr>
+            <w:r>
+              <w:rPr>
+                <w:sz w:val="20"/>
+                <w:szCs w:val="20"/>
+                <w:lang w:val="en-US"/>
+              </w:rPr>
+              <w:t>Added test step 3.2.3.4 re</w:t>
+            </w:r>
+            <w:r>
+              <w:rPr>
+                <w:sz w:val="20"/>
+                <w:szCs w:val="20"/>
+                <w:lang w:val="en-US"/>
+              </w:rPr>
+              <w:t>g</w:t>
+            </w:r>
+            <w:r>
+              <w:rPr>
+                <w:sz w:val="20"/>
+                <w:szCs w:val="20"/>
+                <w:lang w:val="en-US"/>
+              </w:rPr>
+              <w:t xml:space="preserve">arding receiving </w:t>
+            </w:r>
+            <w:r>
+              <w:rPr>
+                <w:sz w:val="20"/>
+                <w:szCs w:val="20"/>
+                <w:lang w:val="en-US"/>
+              </w:rPr>
+              <w:t>combinations of CPR and replacement CPR numbers.</w:t>
+            </w:r>
+          </w:p>
+          <w:p>
+            <w:pPr>
+              <w:rPr>
+                <w:sz w:val="20"/>
+                <w:szCs w:val="20"/>
+                <w:lang w:val="en-US"/>
+              </w:rPr>
+            </w:pPr>
+            <w:r>
+              <w:rPr>
+                <w:sz w:val="20"/>
+                <w:szCs w:val="20"/>
+                <w:lang w:val="en-US"/>
+              </w:rPr>
+              <w:t xml:space="preserve">Removed test regarding </w:t>
+            </w:r>
+            <w:r>
+              <w:rPr>
+                <w:sz w:val="20"/>
+                <w:szCs w:val="20"/>
+                <w:lang w:val="en-US"/>
+              </w:rPr>
+              <w:t>Handling of invalid messages is this is merged with handling of invalid doublets</w:t>
+            </w:r>
+          </w:p>
+        </w:tc>
+      </w:tr>
     </w:tbl>
     <w:p>
       <w:pPr>
@@ -2516,8 +2733,34 @@
         <w:p>
           <w:pPr>
             <w:pStyle w:val="Overskrift"/>
+            <w:rPr>
+              <w:rFonts w:asciiTheme="minorHAnsi" w:eastAsiaTheme="minorEastAsia" w:hAnsiTheme="minorHAnsi" w:cstheme="minorBidi"/>
+              <w:color w:val="auto"/>
+              <w:sz w:val="22"/>
+              <w:szCs w:val="22"/>
+              <w:lang w:eastAsia="en-US"/>
+            </w:rPr>
+          </w:pPr>
+        </w:p>
+        <w:p>
+          <w:pPr>
+            <w:rPr>
+              <w:rFonts w:eastAsiaTheme="minorEastAsia"/>
+            </w:rPr>
           </w:pPr>
           <w:r>
+            <w:rPr>
+              <w:rFonts w:eastAsiaTheme="minorEastAsia"/>
+            </w:rPr>
+            <w:br w:type="page"/>
+          </w:r>
+        </w:p>
+        <w:p>
+          <w:pPr>
+            <w:pStyle w:val="Overskrift"/>
+          </w:pPr>
+          <w:r>
+            <w:lastRenderedPageBreak/>
             <w:t>Content</w:t>
           </w:r>
         </w:p>
@@ -2543,7 +2786,7 @@
           <w:r>
             <w:fldChar w:fldCharType="separate"/>
           </w:r>
-          <w:hyperlink w:anchor="_Toc211862589" w:history="1">
+          <w:hyperlink w:anchor="_Toc234233363" w:history="1">
             <w:r>
               <w:rPr>
                 <w:rStyle w:val="Hyperlink"/>
@@ -2589,7 +2832,7 @@
                 <w:noProof/>
                 <w:webHidden/>
               </w:rPr>
-              <w:instrText xml:space="preserve"> PAGEREF _Toc211862589 \h </w:instrText>
+              <w:instrText xml:space="preserve"> PAGEREF _Toc234233363 \h </w:instrText>
             </w:r>
             <w:r>
               <w:rPr>
@@ -2609,7 +2852,7 @@
                 <w:noProof/>
                 <w:webHidden/>
               </w:rPr>
-              <w:t>4</w:t>
+              <w:t>5</w:t>
             </w:r>
             <w:r>
               <w:rPr>
@@ -2633,7 +2876,7 @@
               <w14:ligatures w14:val="standardContextual"/>
             </w:rPr>
           </w:pPr>
-          <w:hyperlink w:anchor="_Toc211862590" w:history="1">
+          <w:hyperlink w:anchor="_Toc234233364" w:history="1">
             <w:r>
               <w:rPr>
                 <w:rStyle w:val="Hyperlink"/>
@@ -2679,7 +2922,7 @@
                 <w:noProof/>
                 <w:webHidden/>
               </w:rPr>
-              <w:instrText xml:space="preserve"> PAGEREF _Toc211862590 \h </w:instrText>
+              <w:instrText xml:space="preserve"> PAGEREF _Toc234233364 \h </w:instrText>
             </w:r>
             <w:r>
               <w:rPr>
@@ -2699,7 +2942,7 @@
                 <w:noProof/>
                 <w:webHidden/>
               </w:rPr>
-              <w:t>4</w:t>
+              <w:t>5</w:t>
             </w:r>
             <w:r>
               <w:rPr>
@@ -2723,7 +2966,7 @@
               <w14:ligatures w14:val="standardContextual"/>
             </w:rPr>
           </w:pPr>
-          <w:hyperlink w:anchor="_Toc211862591" w:history="1">
+          <w:hyperlink w:anchor="_Toc234233365" w:history="1">
             <w:r>
               <w:rPr>
                 <w:rStyle w:val="Hyperlink"/>
@@ -2769,7 +3012,7 @@
                 <w:noProof/>
                 <w:webHidden/>
               </w:rPr>
-              <w:instrText xml:space="preserve"> PAGEREF _Toc211862591 \h </w:instrText>
+              <w:instrText xml:space="preserve"> PAGEREF _Toc234233365 \h </w:instrText>
             </w:r>
             <w:r>
               <w:rPr>
@@ -2789,7 +3032,7 @@
                 <w:noProof/>
                 <w:webHidden/>
               </w:rPr>
-              <w:t>4</w:t>
+              <w:t>5</w:t>
             </w:r>
             <w:r>
               <w:rPr>
@@ -2813,7 +3056,7 @@
               <w14:ligatures w14:val="standardContextual"/>
             </w:rPr>
           </w:pPr>
-          <w:hyperlink w:anchor="_Toc211862592" w:history="1">
+          <w:hyperlink w:anchor="_Toc234233366" w:history="1">
             <w:r>
               <w:rPr>
                 <w:rStyle w:val="Hyperlink"/>
@@ -2859,7 +3102,7 @@
                 <w:noProof/>
                 <w:webHidden/>
               </w:rPr>
-              <w:instrText xml:space="preserve"> PAGEREF _Toc211862592 \h </w:instrText>
+              <w:instrText xml:space="preserve"> PAGEREF _Toc234233366 \h </w:instrText>
             </w:r>
             <w:r>
               <w:rPr>
@@ -2879,7 +3122,7 @@
                 <w:noProof/>
                 <w:webHidden/>
               </w:rPr>
-              <w:t>5</w:t>
+              <w:t>6</w:t>
             </w:r>
             <w:r>
               <w:rPr>
@@ -2903,7 +3146,7 @@
               <w14:ligatures w14:val="standardContextual"/>
             </w:rPr>
           </w:pPr>
-          <w:hyperlink w:anchor="_Toc211862593" w:history="1">
+          <w:hyperlink w:anchor="_Toc234233367" w:history="1">
             <w:r>
               <w:rPr>
                 <w:rStyle w:val="Hyperlink"/>
@@ -2949,7 +3192,7 @@
                 <w:noProof/>
                 <w:webHidden/>
               </w:rPr>
-              <w:instrText xml:space="preserve"> PAGEREF _Toc211862593 \h </w:instrText>
+              <w:instrText xml:space="preserve"> PAGEREF _Toc234233367 \h </w:instrText>
             </w:r>
             <w:r>
               <w:rPr>
@@ -2969,7 +3212,7 @@
                 <w:noProof/>
                 <w:webHidden/>
               </w:rPr>
-              <w:t>6</w:t>
+              <w:t>7</w:t>
             </w:r>
             <w:r>
               <w:rPr>
@@ -2993,7 +3236,7 @@
               <w14:ligatures w14:val="standardContextual"/>
             </w:rPr>
           </w:pPr>
-          <w:hyperlink w:anchor="_Toc211862594" w:history="1">
+          <w:hyperlink w:anchor="_Toc234233368" w:history="1">
             <w:r>
               <w:rPr>
                 <w:rStyle w:val="Hyperlink"/>
@@ -3039,7 +3282,7 @@
                 <w:noProof/>
                 <w:webHidden/>
               </w:rPr>
-              <w:instrText xml:space="preserve"> PAGEREF _Toc211862594 \h </w:instrText>
+              <w:instrText xml:space="preserve"> PAGEREF _Toc234233368 \h </w:instrText>
             </w:r>
             <w:r>
               <w:rPr>
@@ -3059,7 +3302,7 @@
                 <w:noProof/>
                 <w:webHidden/>
               </w:rPr>
-              <w:t>7</w:t>
+              <w:t>8</w:t>
             </w:r>
             <w:r>
               <w:rPr>
@@ -3083,7 +3326,7 @@
               <w14:ligatures w14:val="standardContextual"/>
             </w:rPr>
           </w:pPr>
-          <w:hyperlink w:anchor="_Toc211862595" w:history="1">
+          <w:hyperlink w:anchor="_Toc234233369" w:history="1">
             <w:r>
               <w:rPr>
                 <w:rStyle w:val="Hyperlink"/>
@@ -3129,7 +3372,7 @@
                 <w:noProof/>
                 <w:webHidden/>
               </w:rPr>
-              <w:instrText xml:space="preserve"> PAGEREF _Toc211862595 \h </w:instrText>
+              <w:instrText xml:space="preserve"> PAGEREF _Toc234233369 \h </w:instrText>
             </w:r>
             <w:r>
               <w:rPr>
@@ -3149,7 +3392,7 @@
                 <w:noProof/>
                 <w:webHidden/>
               </w:rPr>
-              <w:t>7</w:t>
+              <w:t>8</w:t>
             </w:r>
             <w:r>
               <w:rPr>
@@ -3173,7 +3416,7 @@
               <w14:ligatures w14:val="standardContextual"/>
             </w:rPr>
           </w:pPr>
-          <w:hyperlink w:anchor="_Toc211862596" w:history="1">
+          <w:hyperlink w:anchor="_Toc234233370" w:history="1">
             <w:r>
               <w:rPr>
                 <w:rStyle w:val="Hyperlink"/>
@@ -3219,7 +3462,7 @@
                 <w:noProof/>
                 <w:webHidden/>
               </w:rPr>
-              <w:instrText xml:space="preserve"> PAGEREF _Toc211862596 \h </w:instrText>
+              <w:instrText xml:space="preserve"> PAGEREF _Toc234233370 \h </w:instrText>
             </w:r>
             <w:r>
               <w:rPr>
@@ -3239,7 +3482,7 @@
                 <w:noProof/>
                 <w:webHidden/>
               </w:rPr>
-              <w:t>8</w:t>
+              <w:t>9</w:t>
             </w:r>
             <w:r>
               <w:rPr>
@@ -3263,7 +3506,7 @@
               <w14:ligatures w14:val="standardContextual"/>
             </w:rPr>
           </w:pPr>
-          <w:hyperlink w:anchor="_Toc211862597" w:history="1">
+          <w:hyperlink w:anchor="_Toc234233371" w:history="1">
             <w:r>
               <w:rPr>
                 <w:rStyle w:val="Hyperlink"/>
@@ -3311,7 +3554,7 @@
                 <w:noProof/>
                 <w:webHidden/>
               </w:rPr>
-              <w:instrText xml:space="preserve"> PAGEREF _Toc211862597 \h </w:instrText>
+              <w:instrText xml:space="preserve"> PAGEREF _Toc234233371 \h </w:instrText>
             </w:r>
             <w:r>
               <w:rPr>
@@ -3331,7 +3574,7 @@
                 <w:noProof/>
                 <w:webHidden/>
               </w:rPr>
-              <w:t>9</w:t>
+              <w:t>10</w:t>
             </w:r>
             <w:r>
               <w:rPr>
@@ -3355,7 +3598,7 @@
               <w14:ligatures w14:val="standardContextual"/>
             </w:rPr>
           </w:pPr>
-          <w:hyperlink w:anchor="_Toc211862598" w:history="1">
+          <w:hyperlink w:anchor="_Toc234233372" w:history="1">
             <w:r>
               <w:rPr>
                 <w:rStyle w:val="Hyperlink"/>
@@ -3401,7 +3644,7 @@
                 <w:noProof/>
                 <w:webHidden/>
               </w:rPr>
-              <w:instrText xml:space="preserve"> PAGEREF _Toc211862598 \h </w:instrText>
+              <w:instrText xml:space="preserve"> PAGEREF _Toc234233372 \h </w:instrText>
             </w:r>
             <w:r>
               <w:rPr>
@@ -3421,7 +3664,7 @@
                 <w:noProof/>
                 <w:webHidden/>
               </w:rPr>
-              <w:t>9</w:t>
+              <w:t>10</w:t>
             </w:r>
             <w:r>
               <w:rPr>
@@ -3445,7 +3688,7 @@
               <w14:ligatures w14:val="standardContextual"/>
             </w:rPr>
           </w:pPr>
-          <w:hyperlink w:anchor="_Toc211862599" w:history="1">
+          <w:hyperlink w:anchor="_Toc234233373" w:history="1">
             <w:r>
               <w:rPr>
                 <w:rStyle w:val="Hyperlink"/>
@@ -3493,7 +3736,7 @@
                 <w:noProof/>
                 <w:webHidden/>
               </w:rPr>
-              <w:instrText xml:space="preserve"> PAGEREF _Toc211862599 \h </w:instrText>
+              <w:instrText xml:space="preserve"> PAGEREF _Toc234233373 \h </w:instrText>
             </w:r>
             <w:r>
               <w:rPr>
@@ -3513,7 +3756,7 @@
                 <w:noProof/>
                 <w:webHidden/>
               </w:rPr>
-              <w:t>9</w:t>
+              <w:t>10</w:t>
             </w:r>
             <w:r>
               <w:rPr>
@@ -3537,7 +3780,7 @@
               <w14:ligatures w14:val="standardContextual"/>
             </w:rPr>
           </w:pPr>
-          <w:hyperlink w:anchor="_Toc211862600" w:history="1">
+          <w:hyperlink w:anchor="_Toc234233374" w:history="1">
             <w:r>
               <w:rPr>
                 <w:rStyle w:val="Hyperlink"/>
@@ -3583,7 +3826,7 @@
                 <w:noProof/>
                 <w:webHidden/>
               </w:rPr>
-              <w:instrText xml:space="preserve"> PAGEREF _Toc211862600 \h </w:instrText>
+              <w:instrText xml:space="preserve"> PAGEREF _Toc234233374 \h </w:instrText>
             </w:r>
             <w:r>
               <w:rPr>
@@ -3603,7 +3846,7 @@
                 <w:noProof/>
                 <w:webHidden/>
               </w:rPr>
-              <w:t>9</w:t>
+              <w:t>10</w:t>
             </w:r>
             <w:r>
               <w:rPr>
@@ -3627,7 +3870,7 @@
               <w14:ligatures w14:val="standardContextual"/>
             </w:rPr>
           </w:pPr>
-          <w:hyperlink w:anchor="_Toc211862601" w:history="1">
+          <w:hyperlink w:anchor="_Toc234233375" w:history="1">
             <w:r>
               <w:rPr>
                 <w:rStyle w:val="Hyperlink"/>
@@ -3673,7 +3916,7 @@
                 <w:noProof/>
                 <w:webHidden/>
               </w:rPr>
-              <w:instrText xml:space="preserve"> PAGEREF _Toc211862601 \h </w:instrText>
+              <w:instrText xml:space="preserve"> PAGEREF _Toc234233375 \h </w:instrText>
             </w:r>
             <w:r>
               <w:rPr>
@@ -3693,7 +3936,7 @@
                 <w:noProof/>
                 <w:webHidden/>
               </w:rPr>
-              <w:t>10</w:t>
+              <w:t>11</w:t>
             </w:r>
             <w:r>
               <w:rPr>
@@ -3717,7 +3960,7 @@
               <w14:ligatures w14:val="standardContextual"/>
             </w:rPr>
           </w:pPr>
-          <w:hyperlink w:anchor="_Toc211862602" w:history="1">
+          <w:hyperlink w:anchor="_Toc234233376" w:history="1">
             <w:r>
               <w:rPr>
                 <w:rStyle w:val="Hyperlink"/>
@@ -3765,7 +4008,7 @@
                 <w:noProof/>
                 <w:webHidden/>
               </w:rPr>
-              <w:instrText xml:space="preserve"> PAGEREF _Toc211862602 \h </w:instrText>
+              <w:instrText xml:space="preserve"> PAGEREF _Toc234233376 \h </w:instrText>
             </w:r>
             <w:r>
               <w:rPr>
@@ -3785,7 +4028,7 @@
                 <w:noProof/>
                 <w:webHidden/>
               </w:rPr>
-              <w:t>10</w:t>
+              <w:t>11</w:t>
             </w:r>
             <w:r>
               <w:rPr>
@@ -3809,11 +4052,12 @@
               <w14:ligatures w14:val="standardContextual"/>
             </w:rPr>
           </w:pPr>
-          <w:hyperlink w:anchor="_Toc211862603" w:history="1">
+          <w:hyperlink w:anchor="_Toc234233377" w:history="1">
             <w:r>
               <w:rPr>
                 <w:rStyle w:val="Hyperlink"/>
                 <w:noProof/>
+                <w:lang w:val="en-US"/>
               </w:rPr>
               <w:t>3.2.</w:t>
             </w:r>
@@ -3833,6 +4077,7 @@
               <w:rPr>
                 <w:rStyle w:val="Hyperlink"/>
                 <w:noProof/>
+                <w:lang w:val="en-US"/>
               </w:rPr>
               <w:t>Test of general technical requirements</w:t>
             </w:r>
@@ -3855,7 +4100,7 @@
                 <w:noProof/>
                 <w:webHidden/>
               </w:rPr>
-              <w:instrText xml:space="preserve"> PAGEREF _Toc211862603 \h </w:instrText>
+              <w:instrText xml:space="preserve"> PAGEREF _Toc234233377 \h </w:instrText>
             </w:r>
             <w:r>
               <w:rPr>
@@ -3875,7 +4120,7 @@
                 <w:noProof/>
                 <w:webHidden/>
               </w:rPr>
-              <w:t>17</w:t>
+              <w:t>18</w:t>
             </w:r>
             <w:r>
               <w:rPr>
@@ -3891,13 +4136,13 @@
             <w:fldChar w:fldCharType="end"/>
           </w:r>
         </w:p>
+        <w:p>
+          <w:r>
+            <w:br w:type="page"/>
+          </w:r>
+        </w:p>
       </w:sdtContent>
     </w:sdt>
-    <w:p>
-      <w:r>
-        <w:br w:type="page"/>
-      </w:r>
-    </w:p>
     <w:p>
       <w:pPr>
         <w:pStyle w:val="Overskrift1"/>
@@ -3906,7 +4151,8 @@
           <w:numId w:val="27"/>
         </w:numPr>
       </w:pPr>
-      <w:bookmarkStart w:id="0" w:name="_Toc211862589"/>
+      <w:bookmarkStart w:id="0" w:name="_Ref231976861"/>
+      <w:bookmarkStart w:id="1" w:name="_Toc234233363"/>
       <w:r>
         <w:lastRenderedPageBreak/>
         <w:t>In</w:t>
@@ -3915,6 +4161,7 @@
         <w:t>troduction</w:t>
       </w:r>
       <w:bookmarkEnd w:id="0"/>
+      <w:bookmarkEnd w:id="1"/>
     </w:p>
     <w:p>
       <w:pPr>
@@ -4064,11 +4311,11 @@
           <w:numId w:val="28"/>
         </w:numPr>
       </w:pPr>
-      <w:bookmarkStart w:id="1" w:name="_Toc211862590"/>
+      <w:bookmarkStart w:id="2" w:name="_Toc234233364"/>
       <w:r>
         <w:t>Purpose</w:t>
       </w:r>
-      <w:bookmarkEnd w:id="1"/>
+      <w:bookmarkEnd w:id="2"/>
     </w:p>
     <w:p>
       <w:pPr>
@@ -4091,11 +4338,11 @@
           <w:numId w:val="28"/>
         </w:numPr>
       </w:pPr>
-      <w:bookmarkStart w:id="2" w:name="_Toc211862591"/>
+      <w:bookmarkStart w:id="3" w:name="_Toc234233365"/>
       <w:r>
         <w:t>Prerequisites for live test</w:t>
       </w:r>
-      <w:bookmarkEnd w:id="2"/>
+      <w:bookmarkEnd w:id="3"/>
     </w:p>
     <w:p>
       <w:pPr>
@@ -4399,7 +4646,7 @@
           <w:numId w:val="28"/>
         </w:numPr>
       </w:pPr>
-      <w:bookmarkStart w:id="3" w:name="_Toc211862592"/>
+      <w:bookmarkStart w:id="4" w:name="_Toc234233366"/>
       <w:r>
         <w:lastRenderedPageBreak/>
         <w:t>Do</w:t>
@@ -4422,7 +4669,7 @@
       <w:r>
         <w:t>test</w:t>
       </w:r>
-      <w:bookmarkEnd w:id="3"/>
+      <w:bookmarkEnd w:id="4"/>
     </w:p>
     <w:p>
       <w:r>
@@ -4492,7 +4739,7 @@
                                 <w:lang w:val="en-US"/>
                               </w:rPr>
                             </w:pPr>
-                            <w:bookmarkStart w:id="4" w:name="Egentest"/>
+                            <w:bookmarkStart w:id="5" w:name="Egentest"/>
                             <w:r>
                               <w:rPr>
                                 <w:b/>
@@ -4824,7 +5071,7 @@
                               </w:rPr>
                               <w:t>.xml</w:t>
                             </w:r>
-                            <w:bookmarkEnd w:id="4"/>
+                            <w:bookmarkEnd w:id="5"/>
                           </w:p>
                         </w:txbxContent>
                       </wps:txbx>
@@ -4855,7 +5102,7 @@
                           <w:lang w:val="en-US"/>
                         </w:rPr>
                       </w:pPr>
-                      <w:bookmarkStart w:id="5" w:name="Egentest"/>
+                      <w:bookmarkStart w:id="6" w:name="Egentest"/>
                       <w:r>
                         <w:rPr>
                           <w:b/>
@@ -5187,7 +5434,7 @@
                         </w:rPr>
                         <w:t>.xml</w:t>
                       </w:r>
-                      <w:bookmarkEnd w:id="5"/>
+                      <w:bookmarkEnd w:id="6"/>
                     </w:p>
                   </w:txbxContent>
                 </v:textbox>
@@ -5214,7 +5461,7 @@
       <w:bookmarkStart w:id="6" w:name="_Testeksempler_og_testpersoner"/>
       <w:bookmarkStart w:id="7" w:name="_Background_material"/>
       <w:bookmarkStart w:id="8" w:name="_Ref156468514"/>
-      <w:bookmarkStart w:id="9" w:name="_Toc211862593"/>
+      <w:bookmarkStart w:id="9" w:name="_Toc234233367"/>
       <w:bookmarkEnd w:id="6"/>
       <w:bookmarkEnd w:id="7"/>
       <w:r>
@@ -5824,7 +6071,7 @@
         </w:numPr>
       </w:pPr>
       <w:bookmarkStart w:id="10" w:name="_Testeksempler_og_testpersoner_1"/>
-      <w:bookmarkStart w:id="11" w:name="_Toc211862594"/>
+      <w:bookmarkStart w:id="11" w:name="_Toc234233368"/>
       <w:bookmarkEnd w:id="10"/>
       <w:r>
         <w:t>Test</w:t>
@@ -5980,16 +6227,16 @@
             <w:pPr>
               <w:keepNext/>
             </w:pPr>
-            <w:hyperlink r:id="rId19">
+            <w:hyperlink r:id="rId19" w:anchor="2-test-and-certification">
               <w:r>
                 <w:rPr>
                   <w:rStyle w:val="Hyperlink"/>
                 </w:rPr>
-                <w:t>https://medcomfhir.dk/ig/carecommunicationtestscripts/testexamples.html</w:t>
+                <w:t>https://medcomdk.github.io/dk-medcom-carecommunication/#2-test-and-certification</w:t>
               </w:r>
             </w:hyperlink>
             <w:r>
-              <w:t xml:space="preserve">   </w:t>
+              <w:t xml:space="preserve"> </w:t>
             </w:r>
           </w:p>
         </w:tc>
@@ -6150,7 +6397,7 @@
           <w:numId w:val="28"/>
         </w:numPr>
       </w:pPr>
-      <w:bookmarkStart w:id="12" w:name="_Toc211862595"/>
+      <w:bookmarkStart w:id="12" w:name="_Toc234233369"/>
       <w:r>
         <w:t>Test</w:t>
       </w:r>
@@ -6249,6 +6496,7 @@
           <w:p>
             <w:pPr>
               <w:rPr>
+                <w:rFonts w:ascii="Calibri" w:eastAsia="Calibri" w:hAnsi="Calibri" w:cs="Calibri"/>
                 <w:sz w:val="21"/>
                 <w:szCs w:val="21"/>
                 <w:lang w:val="en-US"/>
@@ -6256,28 +6504,23 @@
             </w:pPr>
             <w:r>
               <w:rPr>
+                <w:rFonts w:ascii="Calibri" w:eastAsia="Calibri" w:hAnsi="Calibri" w:cs="Calibri"/>
+                <w:color w:val="000000" w:themeColor="text1"/>
                 <w:sz w:val="21"/>
                 <w:szCs w:val="21"/>
-                <w:lang w:val="en-US"/>
-              </w:rPr>
-              <w:t>FHIR</w:t>
-            </w:r>
-            <w:r>
+                <w:lang w:val="en-GB"/>
+              </w:rPr>
+              <w:t>Interoperability Test Bed (ITB)</w:t>
+            </w:r>
+          </w:p>
+          <w:p>
+            <w:pPr>
               <w:rPr>
                 <w:sz w:val="21"/>
                 <w:szCs w:val="21"/>
                 <w:lang w:val="en-US"/>
               </w:rPr>
-              <w:t xml:space="preserve"> </w:t>
-            </w:r>
-            <w:r>
-              <w:rPr>
-                <w:sz w:val="21"/>
-                <w:szCs w:val="21"/>
-                <w:lang w:val="en-US"/>
-              </w:rPr>
-              <w:t>server with MedCom profiles</w:t>
-            </w:r>
+            </w:pPr>
           </w:p>
         </w:tc>
         <w:tc>
@@ -6287,8 +6530,6 @@
           <w:p>
             <w:pPr>
               <w:rPr>
-                <w:sz w:val="21"/>
-                <w:szCs w:val="21"/>
                 <w:lang w:val="en-US"/>
               </w:rPr>
             </w:pPr>
@@ -6296,24 +6537,34 @@
               <w:r>
                 <w:rPr>
                   <w:rStyle w:val="Hyperlink"/>
-                  <w:lang w:val="en-US"/>
+                  <w:lang w:val="en-GB"/>
                 </w:rPr>
-                <w:t>https://fhir.medcom.dk/fhir/swagger-ui/</w:t>
+                <w:t>https://test.itb.medcom.dk/</w:t>
               </w:r>
             </w:hyperlink>
             <w:r>
               <w:rPr>
-                <w:lang w:val="en-US"/>
+                <w:rFonts w:ascii="Calibri" w:eastAsia="Calibri" w:hAnsi="Calibri" w:cs="Calibri"/>
+                <w:color w:val="000000" w:themeColor="text1"/>
+                <w:lang w:val="en-GB"/>
               </w:rPr>
               <w:t xml:space="preserve"> </w:t>
             </w:r>
             <w:r>
               <w:rPr>
+                <w:rFonts w:ascii="Calibri" w:eastAsia="Calibri" w:hAnsi="Calibri" w:cs="Calibri"/>
                 <w:lang w:val="en-US"/>
               </w:rPr>
               <w:t xml:space="preserve"> </w:t>
             </w:r>
           </w:p>
+          <w:p>
+            <w:pPr>
+              <w:rPr>
+                <w:lang w:val="en-US"/>
+              </w:rPr>
+            </w:pPr>
+          </w:p>
         </w:tc>
         <w:tc>
           <w:tcPr>
@@ -6322,6 +6573,76 @@
           <w:p>
             <w:pPr>
               <w:rPr>
+                <w:rFonts w:ascii="Calibri" w:eastAsia="Calibri" w:hAnsi="Calibri" w:cs="Calibri"/>
+                <w:color w:val="000000" w:themeColor="text1"/>
+                <w:lang w:val="en-US"/>
+              </w:rPr>
+            </w:pPr>
+            <w:r>
+              <w:rPr>
+                <w:rFonts w:ascii="Calibri" w:eastAsia="Calibri" w:hAnsi="Calibri" w:cs="Calibri"/>
+                <w:color w:val="000000" w:themeColor="text1"/>
+                <w:lang w:val="en-US"/>
+              </w:rPr>
+              <w:t xml:space="preserve">Test tool for testing the FHIR standard. </w:t>
+            </w:r>
+          </w:p>
+          <w:p>
+            <w:pPr>
+              <w:rPr>
+                <w:rFonts w:ascii="Calibri" w:eastAsia="Calibri" w:hAnsi="Calibri" w:cs="Calibri"/>
+                <w:color w:val="000000" w:themeColor="text1"/>
+                <w:lang w:val="en-US"/>
+              </w:rPr>
+            </w:pPr>
+          </w:p>
+          <w:p>
+            <w:pPr>
+              <w:rPr>
+                <w:rFonts w:ascii="Calibri" w:eastAsia="Calibri" w:hAnsi="Calibri" w:cs="Calibri"/>
+                <w:color w:val="000000" w:themeColor="text1"/>
+                <w:lang w:val="en-US"/>
+              </w:rPr>
+            </w:pPr>
+            <w:r>
+              <w:rPr>
+                <w:rFonts w:ascii="Calibri" w:eastAsia="Calibri" w:hAnsi="Calibri" w:cs="Calibri"/>
+                <w:color w:val="000000" w:themeColor="text1"/>
+                <w:lang w:val="en-US"/>
+              </w:rPr>
+              <w:t xml:space="preserve">The vendor can get access to ITB as an </w:t>
+            </w:r>
+            <w:r>
+              <w:rPr>
+                <w:rFonts w:ascii="Calibri" w:eastAsia="Calibri" w:hAnsi="Calibri" w:cs="Calibri"/>
+                <w:color w:val="000000" w:themeColor="text1"/>
+                <w:lang w:val="en-GB"/>
+              </w:rPr>
+              <w:t>organisation and assign test suites to themselves</w:t>
+            </w:r>
+            <w:r>
+              <w:rPr>
+                <w:rFonts w:ascii="Calibri" w:eastAsia="Calibri" w:hAnsi="Calibri" w:cs="Calibri"/>
+                <w:color w:val="000000" w:themeColor="text1"/>
+                <w:lang w:val="en-US"/>
+              </w:rPr>
+              <w:t>.</w:t>
+            </w:r>
+          </w:p>
+          <w:p>
+            <w:pPr>
+              <w:rPr>
+                <w:rFonts w:ascii="Calibri" w:eastAsia="Calibri" w:hAnsi="Calibri" w:cs="Calibri"/>
+                <w:color w:val="000000" w:themeColor="text1"/>
+                <w:lang w:val="en-US"/>
+              </w:rPr>
+            </w:pPr>
+          </w:p>
+          <w:p>
+            <w:pPr>
+              <w:rPr>
+                <w:rFonts w:ascii="Calibri" w:eastAsia="Calibri" w:hAnsi="Calibri" w:cs="Calibri"/>
+                <w:color w:val="000000" w:themeColor="text1"/>
                 <w:sz w:val="21"/>
                 <w:szCs w:val="21"/>
                 <w:lang w:val="en-US"/>
@@ -6329,72 +6650,21 @@
             </w:pPr>
             <w:r>
               <w:rPr>
-                <w:sz w:val="21"/>
-                <w:szCs w:val="21"/>
-                <w:lang w:val="en-US"/>
-              </w:rPr>
-              <w:t>Public server that validates against MedCom's FHIR profiles. It is permitted to use the server for testing the upload/download of FHIR resources.</w:t>
-            </w:r>
-          </w:p>
-          <w:p>
-            <w:pPr>
-              <w:rPr>
-                <w:sz w:val="21"/>
-                <w:szCs w:val="21"/>
-                <w:lang w:val="en-US"/>
-              </w:rPr>
-            </w:pPr>
-          </w:p>
-          <w:p>
-            <w:pPr>
-              <w:rPr>
-                <w:sz w:val="21"/>
-                <w:szCs w:val="21"/>
-                <w:lang w:val="en-US"/>
-              </w:rPr>
-            </w:pPr>
-            <w:r>
-              <w:rPr>
-                <w:sz w:val="21"/>
-                <w:szCs w:val="21"/>
-                <w:lang w:val="en-US"/>
-              </w:rPr>
-              <w:t xml:space="preserve">Vendors can get access by </w:t>
-            </w:r>
-            <w:r>
-              <w:rPr>
-                <w:sz w:val="21"/>
-                <w:szCs w:val="21"/>
-                <w:lang w:val="en-US"/>
-              </w:rPr>
-              <w:t>inqu</w:t>
-            </w:r>
-            <w:r>
-              <w:rPr>
-                <w:sz w:val="21"/>
-                <w:szCs w:val="21"/>
-                <w:lang w:val="en-US"/>
-              </w:rPr>
-              <w:t xml:space="preserve">iry this at </w:t>
+                <w:rFonts w:ascii="Calibri" w:eastAsia="Calibri" w:hAnsi="Calibri" w:cs="Calibri"/>
+                <w:color w:val="000000" w:themeColor="text1"/>
+                <w:lang w:val="en-GB"/>
+              </w:rPr>
+              <w:t xml:space="preserve">Find </w:t>
             </w:r>
             <w:hyperlink r:id="rId22">
               <w:r>
                 <w:rPr>
                   <w:rStyle w:val="Hyperlink"/>
-                  <w:rFonts w:ascii="Calibri" w:hAnsi="Calibri"/>
-                  <w:lang w:val="en-US"/>
+                  <w:lang w:val="en-GB"/>
                 </w:rPr>
-                <w:t>fhir@medcom.dk</w:t>
+                <w:t>instructions for ITB here.</w:t>
               </w:r>
             </w:hyperlink>
-            <w:r>
-              <w:rPr>
-                <w:rStyle w:val="Hyperlink"/>
-                <w:rFonts w:ascii="Calibri" w:hAnsi="Calibri"/>
-                <w:lang w:val="en-US"/>
-              </w:rPr>
-              <w:t>.</w:t>
-            </w:r>
           </w:p>
         </w:tc>
       </w:tr>
@@ -6431,7 +6701,7 @@
           <w:numId w:val="28"/>
         </w:numPr>
       </w:pPr>
-      <w:bookmarkStart w:id="13" w:name="_Toc211862596"/>
+      <w:bookmarkStart w:id="13" w:name="_Toc234233370"/>
       <w:r>
         <w:lastRenderedPageBreak/>
         <w:t>T</w:t>
@@ -6929,7 +7199,7 @@
           <w:lang w:val="en-US"/>
         </w:rPr>
       </w:pPr>
-      <w:bookmarkStart w:id="14" w:name="_Toc211862597"/>
+      <w:bookmarkStart w:id="14" w:name="_Toc234233371"/>
       <w:bookmarkStart w:id="15" w:name="_Toc130815583"/>
       <w:r>
         <w:rPr>
@@ -6960,7 +7230,7 @@
           <w:numId w:val="32"/>
         </w:numPr>
       </w:pPr>
-      <w:bookmarkStart w:id="16" w:name="_Toc211862598"/>
+      <w:bookmarkStart w:id="16" w:name="_Toc234233372"/>
       <w:bookmarkEnd w:id="15"/>
       <w:r>
         <w:t>Information about the vendor</w:t>
@@ -7266,7 +7536,7 @@
       </w:pPr>
       <w:bookmarkStart w:id="17" w:name="_Toc110845739"/>
       <w:bookmarkStart w:id="18" w:name="_Toc130815585"/>
-      <w:bookmarkStart w:id="19" w:name="_Toc211862599"/>
+      <w:bookmarkStart w:id="19" w:name="_Toc234233373"/>
       <w:r>
         <w:rPr>
           <w:lang w:val="en-US"/>
@@ -7570,7 +7840,7 @@
       </w:pPr>
       <w:bookmarkStart w:id="20" w:name="_Toc110845740"/>
       <w:bookmarkStart w:id="21" w:name="_Toc130815586"/>
-      <w:bookmarkStart w:id="22" w:name="_Toc211862600"/>
+      <w:bookmarkStart w:id="22" w:name="_Toc234233374"/>
       <w:r>
         <w:t xml:space="preserve">Information about test </w:t>
       </w:r>
@@ -7918,7 +8188,7 @@
         </w:rPr>
       </w:pPr>
       <w:bookmarkStart w:id="23" w:name="_Toc130815587"/>
-      <w:bookmarkStart w:id="24" w:name="_Toc211862601"/>
+      <w:bookmarkStart w:id="24" w:name="_Toc234233375"/>
       <w:r>
         <w:rPr>
           <w:color w:val="152F4A"/>
@@ -8037,7 +8307,7 @@
         </w:rPr>
       </w:pPr>
       <w:bookmarkStart w:id="25" w:name="_Toc130815590"/>
-      <w:bookmarkStart w:id="26" w:name="_Toc211862602"/>
+      <w:bookmarkStart w:id="26" w:name="_Toc234233376"/>
       <w:r>
         <w:rPr>
           <w:color w:val="152F4A"/>
@@ -13015,39 +13285,7 @@
                 <w:szCs w:val="20"/>
                 <w:lang w:val="en-US"/>
               </w:rPr>
-              <w:t xml:space="preserve">sender </w:t>
-            </w:r>
-            <w:r>
-              <w:rPr>
-                <w:sz w:val="20"/>
-                <w:szCs w:val="20"/>
-                <w:lang w:val="en-US"/>
-              </w:rPr>
-              <w:t xml:space="preserve">(signature) </w:t>
-            </w:r>
-            <w:r>
-              <w:rPr>
-                <w:sz w:val="20"/>
-                <w:szCs w:val="20"/>
-                <w:lang w:val="en-US"/>
-              </w:rPr>
-              <w:t xml:space="preserve">and sender organization </w:t>
-            </w:r>
-            <w:r>
-              <w:rPr>
-                <w:sz w:val="20"/>
-                <w:szCs w:val="20"/>
-                <w:lang w:val="en-US"/>
-              </w:rPr>
-              <w:t xml:space="preserve">that matches </w:t>
-            </w:r>
-            <w:r>
-              <w:rPr>
-                <w:sz w:val="20"/>
-                <w:szCs w:val="20"/>
-                <w:lang w:val="en-US"/>
-              </w:rPr>
-              <w:t>each</w:t>
+              <w:t>sender</w:t>
             </w:r>
             <w:r>
               <w:rPr>
@@ -13063,51 +13301,199 @@
                 <w:szCs w:val="20"/>
                 <w:lang w:val="en-US"/>
               </w:rPr>
+              <w:t xml:space="preserve">signature </w:t>
+            </w:r>
+            <w:r>
+              <w:rPr>
+                <w:sz w:val="20"/>
+                <w:szCs w:val="20"/>
+                <w:lang w:val="en-US"/>
+              </w:rPr>
+              <w:t xml:space="preserve">and sender organization that </w:t>
+            </w:r>
+            <w:r>
+              <w:rPr>
+                <w:sz w:val="20"/>
+                <w:szCs w:val="20"/>
+                <w:lang w:val="en-US"/>
+              </w:rPr>
               <w:lastRenderedPageBreak/>
-              <w:t>individual message segment</w:t>
-            </w:r>
-            <w:r>
-              <w:rPr>
-                <w:sz w:val="20"/>
-                <w:szCs w:val="20"/>
-                <w:lang w:val="en-US"/>
-              </w:rPr>
-              <w:t xml:space="preserve"> in the message thread</w:t>
-            </w:r>
-            <w:r>
-              <w:rPr>
-                <w:sz w:val="20"/>
-                <w:szCs w:val="20"/>
-                <w:lang w:val="en-US"/>
-              </w:rPr>
-              <w:t xml:space="preserve">. </w:t>
-            </w:r>
-          </w:p>
-        </w:tc>
-        <w:tc>
-          <w:tcPr>
-            <w:tcW w:w="2126" w:type="dxa"/>
-          </w:tcPr>
-          <w:p>
-            <w:pPr>
-              <w:rPr>
-                <w:color w:val="3B3838" w:themeColor="background2" w:themeShade="40"/>
-                <w:sz w:val="20"/>
-                <w:szCs w:val="20"/>
-                <w:lang w:val="en-US"/>
-              </w:rPr>
-            </w:pPr>
-          </w:p>
-        </w:tc>
-        <w:tc>
-          <w:tcPr>
-            <w:tcW w:w="2977" w:type="dxa"/>
-          </w:tcPr>
+              <w:t>matches each individual message segment in the message thread.</w:t>
+            </w:r>
+          </w:p>
           <w:p>
             <w:pPr>
               <w:keepNext/>
               <w:spacing w:before="60" w:after="120"/>
               <w:rPr>
+                <w:lang w:val="en-US"/>
+              </w:rPr>
+            </w:pPr>
+            <w:r>
+              <w:rPr>
+                <w:sz w:val="20"/>
+                <w:szCs w:val="20"/>
+                <w:lang w:val="en-US"/>
+              </w:rPr>
+              <w:t xml:space="preserve">The </w:t>
+            </w:r>
+            <w:r>
+              <w:rPr>
+                <w:sz w:val="20"/>
+                <w:szCs w:val="20"/>
+                <w:lang w:val="en-US"/>
+              </w:rPr>
+              <w:t>sender</w:t>
+            </w:r>
+            <w:r>
+              <w:rPr>
+                <w:sz w:val="20"/>
+                <w:szCs w:val="20"/>
+                <w:lang w:val="en-US"/>
+              </w:rPr>
+              <w:t xml:space="preserve"> </w:t>
+            </w:r>
+            <w:r>
+              <w:rPr>
+                <w:sz w:val="20"/>
+                <w:szCs w:val="20"/>
+                <w:lang w:val="en-US"/>
+              </w:rPr>
+              <w:t xml:space="preserve">signature </w:t>
+            </w:r>
+            <w:r>
+              <w:rPr>
+                <w:sz w:val="20"/>
+                <w:szCs w:val="20"/>
+                <w:lang w:val="en-US"/>
+              </w:rPr>
+              <w:t xml:space="preserve">MUST be </w:t>
+            </w:r>
+            <w:r>
+              <w:rPr>
+                <w:sz w:val="20"/>
+                <w:szCs w:val="20"/>
+                <w:lang w:val="en-US"/>
+              </w:rPr>
+              <w:t>derived</w:t>
+            </w:r>
+            <w:r>
+              <w:rPr>
+                <w:sz w:val="20"/>
+                <w:szCs w:val="20"/>
+                <w:lang w:val="en-US"/>
+              </w:rPr>
+              <w:t xml:space="preserve"> from the </w:t>
+            </w:r>
+            <w:r>
+              <w:rPr>
+                <w:sz w:val="20"/>
+                <w:szCs w:val="20"/>
+                <w:lang w:val="en-US"/>
+              </w:rPr>
+              <w:t xml:space="preserve">individual </w:t>
+            </w:r>
+            <w:r>
+              <w:rPr>
+                <w:sz w:val="20"/>
+                <w:szCs w:val="20"/>
+                <w:lang w:val="en-US"/>
+              </w:rPr>
+              <w:t>payload’s PractitionerRole reference in the medcom-core-practitioner-extension.</w:t>
+            </w:r>
+          </w:p>
+          <w:p>
+            <w:pPr>
+              <w:keepNext/>
+              <w:spacing w:before="60" w:after="120"/>
+              <w:rPr>
+                <w:sz w:val="20"/>
+                <w:szCs w:val="20"/>
+                <w:lang w:val="en-US"/>
+              </w:rPr>
+            </w:pPr>
+            <w:r>
+              <w:rPr>
+                <w:sz w:val="20"/>
+                <w:szCs w:val="20"/>
+                <w:lang w:val="en-US"/>
+              </w:rPr>
+              <w:t xml:space="preserve">The sender organization MUST be </w:t>
+            </w:r>
+            <w:r>
+              <w:rPr>
+                <w:sz w:val="20"/>
+                <w:szCs w:val="20"/>
+                <w:lang w:val="en-US"/>
+              </w:rPr>
+              <w:t>derived</w:t>
+            </w:r>
+            <w:r>
+              <w:rPr>
+                <w:sz w:val="20"/>
+                <w:szCs w:val="20"/>
+                <w:lang w:val="en-US"/>
+              </w:rPr>
+              <w:t xml:space="preserve"> from the </w:t>
+            </w:r>
+            <w:r>
+              <w:rPr>
+                <w:sz w:val="20"/>
+                <w:szCs w:val="20"/>
+                <w:lang w:val="en-US"/>
+              </w:rPr>
+              <w:t xml:space="preserve">individual payload’s </w:t>
+            </w:r>
+            <w:r>
+              <w:rPr>
+                <w:sz w:val="20"/>
+                <w:szCs w:val="20"/>
+                <w:lang w:val="en-US"/>
+              </w:rPr>
+              <w:t xml:space="preserve">matching Provenance.agent.who reference to an </w:t>
+            </w:r>
+            <w:r>
+              <w:rPr>
+                <w:sz w:val="20"/>
+                <w:szCs w:val="20"/>
+                <w:lang w:val="en-US"/>
+              </w:rPr>
+              <w:t>organization</w:t>
+            </w:r>
+            <w:r>
+              <w:rPr>
+                <w:sz w:val="20"/>
+                <w:szCs w:val="20"/>
+                <w:lang w:val="en-US"/>
+              </w:rPr>
+              <w:t>.</w:t>
+            </w:r>
+          </w:p>
+        </w:tc>
+        <w:tc>
+          <w:tcPr>
+            <w:tcW w:w="2126" w:type="dxa"/>
+          </w:tcPr>
+          <w:p>
+            <w:pPr>
+              <w:rPr>
+                <w:color w:val="3B3838" w:themeColor="background2" w:themeShade="40"/>
+                <w:sz w:val="20"/>
+                <w:szCs w:val="20"/>
+                <w:lang w:val="en-US"/>
+              </w:rPr>
+            </w:pPr>
+          </w:p>
+        </w:tc>
+        <w:tc>
+          <w:tcPr>
+            <w:tcW w:w="2977" w:type="dxa"/>
+          </w:tcPr>
+          <w:p>
+            <w:pPr>
+              <w:keepNext/>
+              <w:spacing w:before="60" w:after="120"/>
+              <w:rPr>
                 <w:sz w:val="20"/>
                 <w:szCs w:val="20"/>
                 <w:lang w:val="en-US"/>
@@ -13128,7 +13514,31 @@
                 <w:lang w:val="en-US"/>
               </w:rPr>
               <w:lastRenderedPageBreak/>
-              <w:t xml:space="preserve">corresponding sender and sender organization. </w:t>
+              <w:t>corresponding sender</w:t>
+            </w:r>
+            <w:r>
+              <w:rPr>
+                <w:sz w:val="20"/>
+                <w:szCs w:val="20"/>
+                <w:lang w:val="en-US"/>
+              </w:rPr>
+              <w:t xml:space="preserve"> </w:t>
+            </w:r>
+            <w:r>
+              <w:rPr>
+                <w:sz w:val="20"/>
+                <w:szCs w:val="20"/>
+                <w:lang w:val="en-US"/>
+              </w:rPr>
+              <w:t>signature</w:t>
+            </w:r>
+            <w:r>
+              <w:rPr>
+                <w:sz w:val="20"/>
+                <w:szCs w:val="20"/>
+                <w:lang w:val="en-US"/>
+              </w:rPr>
+              <w:t xml:space="preserve"> and sender organization.</w:t>
             </w:r>
           </w:p>
         </w:tc>
@@ -13194,9 +13604,267 @@
           </w:p>
         </w:tc>
       </w:tr>
+      <w:tr>
+        <w:tc>
+          <w:tcPr>
+            <w:tcW w:w="901" w:type="dxa"/>
+          </w:tcPr>
+          <w:p>
+            <w:pPr>
+              <w:pStyle w:val="Listeafsnit"/>
+              <w:numPr>
+                <w:ilvl w:val="3"/>
+                <w:numId w:val="5"/>
+              </w:numPr>
+              <w:spacing w:line="240" w:lineRule="auto"/>
+              <w:rPr>
+                <w:sz w:val="20"/>
+                <w:szCs w:val="20"/>
+              </w:rPr>
+            </w:pPr>
+          </w:p>
+        </w:tc>
+        <w:tc>
+          <w:tcPr>
+            <w:tcW w:w="2922" w:type="dxa"/>
+          </w:tcPr>
+          <w:p>
+            <w:pPr>
+              <w:keepNext/>
+              <w:spacing w:before="60" w:after="120"/>
+              <w:rPr>
+                <w:sz w:val="20"/>
+                <w:szCs w:val="20"/>
+                <w:lang w:val="en-US"/>
+              </w:rPr>
+            </w:pPr>
+            <w:r>
+              <w:rPr>
+                <w:sz w:val="20"/>
+                <w:szCs w:val="20"/>
+                <w:lang w:val="en-US"/>
+              </w:rPr>
+              <w:t xml:space="preserve">Demonstrate that the </w:t>
+            </w:r>
+            <w:r>
+              <w:rPr>
+                <w:sz w:val="20"/>
+                <w:szCs w:val="20"/>
+                <w:lang w:val="en-US"/>
+              </w:rPr>
+              <w:t xml:space="preserve">receiving </w:t>
+            </w:r>
+            <w:r>
+              <w:rPr>
+                <w:sz w:val="20"/>
+                <w:szCs w:val="20"/>
+                <w:lang w:val="en-US"/>
+              </w:rPr>
+              <w:t xml:space="preserve">organization in the current correspondence between the current sender and </w:t>
+            </w:r>
+            <w:r>
+              <w:rPr>
+                <w:sz w:val="20"/>
+                <w:szCs w:val="20"/>
+                <w:lang w:val="en-US"/>
+              </w:rPr>
+              <w:t>receiver</w:t>
+            </w:r>
+            <w:r>
+              <w:rPr>
+                <w:sz w:val="20"/>
+                <w:szCs w:val="20"/>
+                <w:lang w:val="en-US"/>
+              </w:rPr>
+              <w:t xml:space="preserve"> </w:t>
+            </w:r>
+            <w:r>
+              <w:rPr>
+                <w:sz w:val="20"/>
+                <w:szCs w:val="20"/>
+                <w:lang w:val="en-US"/>
+              </w:rPr>
+              <w:t>is</w:t>
+            </w:r>
+            <w:r>
+              <w:rPr>
+                <w:sz w:val="20"/>
+                <w:szCs w:val="20"/>
+                <w:lang w:val="en-US"/>
+              </w:rPr>
+              <w:t xml:space="preserve"> clear to the user.</w:t>
+            </w:r>
+          </w:p>
+        </w:tc>
+        <w:tc>
+          <w:tcPr>
+            <w:tcW w:w="2126" w:type="dxa"/>
+          </w:tcPr>
+          <w:p>
+            <w:pPr>
+              <w:rPr>
+                <w:color w:val="3B3838" w:themeColor="background2" w:themeShade="40"/>
+                <w:sz w:val="20"/>
+                <w:szCs w:val="20"/>
+                <w:lang w:val="en-US"/>
+              </w:rPr>
+            </w:pPr>
+          </w:p>
+        </w:tc>
+        <w:tc>
+          <w:tcPr>
+            <w:tcW w:w="2977" w:type="dxa"/>
+          </w:tcPr>
+          <w:p>
+            <w:pPr>
+              <w:keepNext/>
+              <w:spacing w:before="60" w:after="120"/>
+              <w:rPr>
+                <w:sz w:val="20"/>
+                <w:szCs w:val="20"/>
+                <w:lang w:val="en-US"/>
+              </w:rPr>
+            </w:pPr>
+            <w:r>
+              <w:rPr>
+                <w:sz w:val="20"/>
+                <w:szCs w:val="20"/>
+                <w:lang w:val="en-US"/>
+              </w:rPr>
+              <w:t>T</w:t>
+            </w:r>
+            <w:r>
+              <w:rPr>
+                <w:sz w:val="20"/>
+                <w:szCs w:val="20"/>
+                <w:lang w:val="en-US"/>
+              </w:rPr>
+              <w:t xml:space="preserve">he </w:t>
+            </w:r>
+            <w:r>
+              <w:rPr>
+                <w:sz w:val="20"/>
+                <w:szCs w:val="20"/>
+                <w:lang w:val="en-US"/>
+              </w:rPr>
+              <w:t xml:space="preserve">receiving </w:t>
+            </w:r>
+            <w:r>
+              <w:rPr>
+                <w:sz w:val="20"/>
+                <w:szCs w:val="20"/>
+                <w:lang w:val="en-US"/>
+              </w:rPr>
+              <w:t xml:space="preserve">organization in the current correspondence between the current sender and </w:t>
+            </w:r>
+            <w:r>
+              <w:rPr>
+                <w:sz w:val="20"/>
+                <w:szCs w:val="20"/>
+                <w:lang w:val="en-US"/>
+              </w:rPr>
+              <w:t>receiver</w:t>
+            </w:r>
+            <w:r>
+              <w:rPr>
+                <w:sz w:val="20"/>
+                <w:szCs w:val="20"/>
+                <w:lang w:val="en-US"/>
+              </w:rPr>
+              <w:t xml:space="preserve"> </w:t>
+            </w:r>
+            <w:r>
+              <w:rPr>
+                <w:sz w:val="20"/>
+                <w:szCs w:val="20"/>
+                <w:lang w:val="en-US"/>
+              </w:rPr>
+              <w:t>is</w:t>
+            </w:r>
+            <w:r>
+              <w:rPr>
+                <w:sz w:val="20"/>
+                <w:szCs w:val="20"/>
+                <w:lang w:val="en-US"/>
+              </w:rPr>
+              <w:t xml:space="preserve"> clear to the user.</w:t>
+            </w:r>
+          </w:p>
+        </w:tc>
+        <w:tc>
+          <w:tcPr>
+            <w:tcW w:w="3513" w:type="dxa"/>
+          </w:tcPr>
+          <w:p>
+            <w:pPr>
+              <w:rPr>
+                <w:sz w:val="20"/>
+                <w:szCs w:val="20"/>
+                <w:lang w:val="en-US"/>
+              </w:rPr>
+            </w:pPr>
+          </w:p>
+        </w:tc>
+        <w:tc>
+          <w:tcPr>
+            <w:tcW w:w="1223" w:type="dxa"/>
+          </w:tcPr>
+          <w:p>
+            <w:pPr>
+              <w:rPr>
+                <w:sz w:val="20"/>
+                <w:szCs w:val="20"/>
+                <w:lang w:val="en-US"/>
+              </w:rPr>
+            </w:pPr>
+            <w:sdt>
+              <w:sdtPr>
+                <w:rPr>
+                  <w:sz w:val="20"/>
+                  <w:szCs w:val="20"/>
+                </w:rPr>
+                <w:alias w:val="MedCom vurdering"/>
+                <w:tag w:val="MedCom vurdering"/>
+                <w:id w:val="326166811"/>
+                <w:placeholder>
+                  <w:docPart w:val="04316D5D34F84F3CA200EFAAD972C321"/>
+                </w:placeholder>
+                <w:dropDownList>
+                  <w:listItem w:value="Vælg"/>
+                  <w:listItem w:displayText="F1" w:value="F1"/>
+                  <w:listItem w:displayText="F2" w:value="F2"/>
+                  <w:listItem w:displayText="F3" w:value="F3"/>
+                  <w:listItem w:displayText="F4" w:value="F4"/>
+                  <w:listItem w:displayText="OK" w:value="OK"/>
+                  <w:listItem w:displayText="Ej relevant" w:value="Ej relevant"/>
+                </w:dropDownList>
+              </w:sdtPr>
+              <w:sdtEndPr/>
+              <w:sdtContent>
+                <w:r>
+                  <w:rPr>
+                    <w:rStyle w:val="Pladsholdertekst"/>
+                    <w:sz w:val="20"/>
+                    <w:szCs w:val="20"/>
+                  </w:rPr>
+                  <w:t>Choose</w:t>
+                </w:r>
+              </w:sdtContent>
+            </w:sdt>
+          </w:p>
+        </w:tc>
+      </w:tr>
     </w:tbl>
     <w:p>
+      <w:pPr>
+        <w:rPr>
+          <w:lang w:val="en-US"/>
+        </w:rPr>
+      </w:pPr>
       <w:r>
+        <w:rPr>
+          <w:lang w:val="en-US"/>
+        </w:rPr>
         <w:br w:type="page"/>
       </w:r>
     </w:p>
@@ -13213,7 +13881,7 @@
         </w:rPr>
       </w:pPr>
       <w:bookmarkStart w:id="32" w:name="_Toc140051305"/>
-      <w:bookmarkStart w:id="33" w:name="_Toc211862603"/>
+      <w:bookmarkStart w:id="33" w:name="_Toc234233377"/>
       <w:r>
         <w:rPr>
           <w:color w:val="152F4A"/>
@@ -14395,6 +15063,316 @@
                 <w:sz w:val="20"/>
                 <w:szCs w:val="20"/>
               </w:rPr>
+              <w:t>EpisodeofCare-identifier</w:t>
+            </w:r>
+          </w:p>
+        </w:tc>
+      </w:tr>
+      <w:tr>
+        <w:tc>
+          <w:tcPr>
+            <w:tcW w:w="999" w:type="dxa"/>
+          </w:tcPr>
+          <w:p>
+            <w:pPr>
+              <w:pStyle w:val="Listeafsnit"/>
+              <w:numPr>
+                <w:ilvl w:val="3"/>
+                <w:numId w:val="5"/>
+              </w:numPr>
+              <w:spacing w:line="240" w:lineRule="auto"/>
+              <w:rPr>
+                <w:sz w:val="20"/>
+                <w:szCs w:val="20"/>
+              </w:rPr>
+            </w:pPr>
+          </w:p>
+        </w:tc>
+        <w:tc>
+          <w:tcPr>
+            <w:tcW w:w="3404" w:type="dxa"/>
+          </w:tcPr>
+          <w:p>
+            <w:pPr>
+              <w:widowControl w:val="0"/>
+              <w:rPr>
+                <w:sz w:val="20"/>
+                <w:szCs w:val="20"/>
+                <w:lang w:val="en-US"/>
+              </w:rPr>
+            </w:pPr>
+            <w:r>
+              <w:rPr>
+                <w:i/>
+                <w:sz w:val="20"/>
+                <w:szCs w:val="20"/>
+                <w:lang w:val="en-US"/>
+              </w:rPr>
+              <w:t>If relevant for the user, display the included episodeOfCare-identifier</w:t>
+            </w:r>
+            <w:r>
+              <w:rPr>
+                <w:sz w:val="20"/>
+                <w:szCs w:val="20"/>
+                <w:lang w:val="en-US"/>
+              </w:rPr>
+              <w:t>.</w:t>
+            </w:r>
+          </w:p>
+          <w:p>
+            <w:pPr>
+              <w:widowControl w:val="0"/>
+              <w:rPr>
+                <w:sz w:val="20"/>
+                <w:szCs w:val="20"/>
+                <w:lang w:val="en-US"/>
+              </w:rPr>
+            </w:pPr>
+          </w:p>
+          <w:p>
+            <w:pPr>
+              <w:widowControl w:val="0"/>
+              <w:rPr>
+                <w:sz w:val="20"/>
+                <w:szCs w:val="20"/>
+                <w:lang w:val="en-US"/>
+              </w:rPr>
+            </w:pPr>
+            <w:r>
+              <w:rPr>
+                <w:sz w:val="20"/>
+                <w:szCs w:val="20"/>
+                <w:lang w:val="en-US"/>
+              </w:rPr>
+              <w:t>Load the test data and demonstrate that episodeOfCare-identifier is displayed correctly.</w:t>
+            </w:r>
+          </w:p>
+          <w:p>
+            <w:pPr>
+              <w:widowControl w:val="0"/>
+              <w:rPr>
+                <w:b/>
+                <w:sz w:val="20"/>
+                <w:szCs w:val="20"/>
+                <w:lang w:val="en-US"/>
+              </w:rPr>
+            </w:pPr>
+          </w:p>
+        </w:tc>
+        <w:tc>
+          <w:tcPr>
+            <w:tcW w:w="2889" w:type="dxa"/>
+          </w:tcPr>
+          <w:p>
+            <w:pPr>
+              <w:widowControl w:val="0"/>
+              <w:rPr>
+                <w:color w:val="3B3838" w:themeColor="background2" w:themeShade="40"/>
+                <w:sz w:val="20"/>
+                <w:szCs w:val="20"/>
+                <w:lang w:val="en-US"/>
+              </w:rPr>
+            </w:pPr>
+            <w:r>
+              <w:rPr>
+                <w:color w:val="3B3838" w:themeColor="background2" w:themeShade="40"/>
+                <w:sz w:val="20"/>
+                <w:szCs w:val="20"/>
+              </w:rPr>
+              <w:t xml:space="preserve">Use test </w:t>
+            </w:r>
+            <w:r>
+              <w:rPr>
+                <w:sz w:val="20"/>
+                <w:szCs w:val="20"/>
+              </w:rPr>
+              <w:t xml:space="preserve">example </w:t>
+            </w:r>
+            <w:r>
+              <w:rPr>
+                <w:color w:val="3B3838" w:themeColor="background2" w:themeShade="40"/>
+                <w:sz w:val="20"/>
+                <w:szCs w:val="20"/>
+              </w:rPr>
+              <w:t xml:space="preserve">from </w:t>
+            </w:r>
+            <w:r>
+              <w:rPr>
+                <w:color w:val="3B3838" w:themeColor="background2" w:themeShade="40"/>
+                <w:sz w:val="20"/>
+                <w:szCs w:val="20"/>
+              </w:rPr>
+              <w:fldChar w:fldCharType="begin"/>
+            </w:r>
+            <w:r>
+              <w:rPr>
+                <w:color w:val="3B3838" w:themeColor="background2" w:themeShade="40"/>
+                <w:sz w:val="20"/>
+                <w:szCs w:val="20"/>
+              </w:rPr>
+              <w:instrText xml:space="preserve"> REF _Ref194929948 \r \h </w:instrText>
+            </w:r>
+            <w:r>
+              <w:rPr>
+                <w:color w:val="3B3838" w:themeColor="background2" w:themeShade="40"/>
+                <w:sz w:val="20"/>
+                <w:szCs w:val="20"/>
+              </w:rPr>
+            </w:r>
+            <w:r>
+              <w:rPr>
+                <w:color w:val="3B3838" w:themeColor="background2" w:themeShade="40"/>
+                <w:sz w:val="20"/>
+                <w:szCs w:val="20"/>
+              </w:rPr>
+              <w:fldChar w:fldCharType="separate"/>
+            </w:r>
+            <w:r>
+              <w:rPr>
+                <w:color w:val="3B3838" w:themeColor="background2" w:themeShade="40"/>
+                <w:sz w:val="20"/>
+                <w:szCs w:val="20"/>
+              </w:rPr>
+              <w:t>3.2.1.1</w:t>
+            </w:r>
+            <w:r>
+              <w:rPr>
+                <w:color w:val="3B3838" w:themeColor="background2" w:themeShade="40"/>
+                <w:sz w:val="20"/>
+                <w:szCs w:val="20"/>
+              </w:rPr>
+              <w:fldChar w:fldCharType="end"/>
+            </w:r>
+          </w:p>
+        </w:tc>
+        <w:tc>
+          <w:tcPr>
+            <w:tcW w:w="2576" w:type="dxa"/>
+          </w:tcPr>
+          <w:p>
+            <w:pPr>
+              <w:widowControl w:val="0"/>
+              <w:rPr>
+                <w:sz w:val="20"/>
+                <w:szCs w:val="20"/>
+                <w:lang w:val="en-US"/>
+              </w:rPr>
+            </w:pPr>
+            <w:r>
+              <w:rPr>
+                <w:sz w:val="20"/>
+                <w:szCs w:val="20"/>
+                <w:lang w:val="en-US"/>
+              </w:rPr>
+              <w:t xml:space="preserve">The episodeOfCare-identifier is displayed </w:t>
+            </w:r>
+            <w:r>
+              <w:rPr>
+                <w:sz w:val="20"/>
+                <w:szCs w:val="20"/>
+                <w:lang w:val="en-US"/>
+              </w:rPr>
+              <w:t>to the user</w:t>
+            </w:r>
+            <w:r>
+              <w:rPr>
+                <w:sz w:val="20"/>
+                <w:szCs w:val="20"/>
+                <w:lang w:val="en-US"/>
+              </w:rPr>
+              <w:t>.</w:t>
+            </w:r>
+          </w:p>
+        </w:tc>
+        <w:tc>
+          <w:tcPr>
+            <w:tcW w:w="2254" w:type="dxa"/>
+          </w:tcPr>
+          <w:p>
+            <w:pPr>
+              <w:widowControl w:val="0"/>
+              <w:jc w:val="center"/>
+              <w:rPr>
+                <w:sz w:val="20"/>
+                <w:szCs w:val="20"/>
+                <w:lang w:val="en-US"/>
+              </w:rPr>
+            </w:pPr>
+          </w:p>
+        </w:tc>
+        <w:tc>
+          <w:tcPr>
+            <w:tcW w:w="1304" w:type="dxa"/>
+          </w:tcPr>
+          <w:p>
+            <w:pPr>
+              <w:widowControl w:val="0"/>
+              <w:jc w:val="center"/>
+              <w:rPr>
+                <w:sz w:val="20"/>
+                <w:szCs w:val="20"/>
+                <w:lang w:val="en-US"/>
+              </w:rPr>
+            </w:pPr>
+            <w:sdt>
+              <w:sdtPr>
+                <w:rPr>
+                  <w:sz w:val="20"/>
+                  <w:szCs w:val="20"/>
+                </w:rPr>
+                <w:alias w:val="MedCom vurdering"/>
+                <w:tag w:val="MedCom vurdering"/>
+                <w:id w:val="-1517611108"/>
+                <w:placeholder>
+                  <w:docPart w:val="22B6ABDDFAB0477480575E68CFC89193"/>
+                </w:placeholder>
+                <w:dropDownList>
+                  <w:listItem w:value="Vælg"/>
+                  <w:listItem w:displayText="F1" w:value="F1"/>
+                  <w:listItem w:displayText="F2" w:value="F2"/>
+                  <w:listItem w:displayText="F3" w:value="F3"/>
+                  <w:listItem w:displayText="F4" w:value="F4"/>
+                  <w:listItem w:displayText="OK" w:value="OK"/>
+                  <w:listItem w:displayText="Ej relevant" w:value="Ej relevant"/>
+                </w:dropDownList>
+              </w:sdtPr>
+              <w:sdtEndPr/>
+              <w:sdtContent>
+                <w:r>
+                  <w:rPr>
+                    <w:rStyle w:val="Pladsholdertekst"/>
+                    <w:sz w:val="20"/>
+                    <w:szCs w:val="20"/>
+                  </w:rPr>
+                  <w:t>Choose</w:t>
+                </w:r>
+              </w:sdtContent>
+            </w:sdt>
+          </w:p>
+        </w:tc>
+      </w:tr>
+      <w:tr>
+        <w:tc>
+          <w:tcPr>
+            <w:tcW w:w="13426" w:type="dxa"/>
+            <w:gridSpan w:val="6"/>
+            <w:shd w:val="clear" w:color="auto" w:fill="DEEAF6" w:themeFill="accent5" w:themeFillTint="33"/>
+          </w:tcPr>
+          <w:p>
+            <w:pPr>
+              <w:widowControl w:val="0"/>
+              <w:jc w:val="center"/>
+              <w:rPr>
+                <w:sz w:val="20"/>
+                <w:szCs w:val="20"/>
+              </w:rPr>
+            </w:pPr>
+            <w:r>
+              <w:rPr>
+                <w:sz w:val="20"/>
+                <w:szCs w:val="20"/>
+              </w:rPr>
+              <w:lastRenderedPageBreak/>
               <w:t>Timezone</w:t>
             </w:r>
           </w:p>
@@ -14658,8 +15636,10 @@
                 <w:szCs w:val="20"/>
               </w:rPr>
             </w:pPr>
-          </w:p>
-        </w:tc>
+            <w:bookmarkStart w:id="35" w:name="_Ref231976898"/>
+          </w:p>
+        </w:tc>
+        <w:bookmarkEnd w:id="35"/>
         <w:tc>
           <w:tcPr>
             <w:tcW w:w="3404" w:type="dxa"/>
@@ -14832,307 +15812,6 @@
                 <w:sz w:val="20"/>
                 <w:szCs w:val="20"/>
               </w:rPr>
-              <w:lastRenderedPageBreak/>
-              <w:t>EpisodeofCare-identifier</w:t>
-            </w:r>
-          </w:p>
-        </w:tc>
-      </w:tr>
-      <w:tr>
-        <w:tc>
-          <w:tcPr>
-            <w:tcW w:w="999" w:type="dxa"/>
-          </w:tcPr>
-          <w:p>
-            <w:pPr>
-              <w:pStyle w:val="Listeafsnit"/>
-              <w:numPr>
-                <w:ilvl w:val="3"/>
-                <w:numId w:val="5"/>
-              </w:numPr>
-              <w:spacing w:line="240" w:lineRule="auto"/>
-              <w:rPr>
-                <w:sz w:val="20"/>
-                <w:szCs w:val="20"/>
-              </w:rPr>
-            </w:pPr>
-            <w:bookmarkStart w:id="35" w:name="_Ref212035212"/>
-          </w:p>
-        </w:tc>
-        <w:bookmarkEnd w:id="35"/>
-        <w:tc>
-          <w:tcPr>
-            <w:tcW w:w="3404" w:type="dxa"/>
-          </w:tcPr>
-          <w:p>
-            <w:pPr>
-              <w:widowControl w:val="0"/>
-              <w:rPr>
-                <w:sz w:val="20"/>
-                <w:szCs w:val="20"/>
-                <w:lang w:val="en-US"/>
-              </w:rPr>
-            </w:pPr>
-            <w:r>
-              <w:rPr>
-                <w:i/>
-                <w:sz w:val="20"/>
-                <w:szCs w:val="20"/>
-                <w:lang w:val="en-US"/>
-              </w:rPr>
-              <w:t>If relevant for the user, display the included episodeOfCare-identifier</w:t>
-            </w:r>
-            <w:r>
-              <w:rPr>
-                <w:sz w:val="20"/>
-                <w:szCs w:val="20"/>
-                <w:lang w:val="en-US"/>
-              </w:rPr>
-              <w:t>.</w:t>
-            </w:r>
-          </w:p>
-          <w:p>
-            <w:pPr>
-              <w:widowControl w:val="0"/>
-              <w:rPr>
-                <w:sz w:val="20"/>
-                <w:szCs w:val="20"/>
-                <w:lang w:val="en-US"/>
-              </w:rPr>
-            </w:pPr>
-          </w:p>
-          <w:p>
-            <w:pPr>
-              <w:widowControl w:val="0"/>
-              <w:rPr>
-                <w:sz w:val="20"/>
-                <w:szCs w:val="20"/>
-                <w:lang w:val="en-US"/>
-              </w:rPr>
-            </w:pPr>
-            <w:r>
-              <w:rPr>
-                <w:sz w:val="20"/>
-                <w:szCs w:val="20"/>
-                <w:lang w:val="en-US"/>
-              </w:rPr>
-              <w:t>Load the test data and demonstrate that episodeOfCare-identifier is displayed correctly.</w:t>
-            </w:r>
-          </w:p>
-          <w:p>
-            <w:pPr>
-              <w:widowControl w:val="0"/>
-              <w:rPr>
-                <w:b/>
-                <w:sz w:val="20"/>
-                <w:szCs w:val="20"/>
-                <w:lang w:val="en-US"/>
-              </w:rPr>
-            </w:pPr>
-          </w:p>
-        </w:tc>
-        <w:tc>
-          <w:tcPr>
-            <w:tcW w:w="2889" w:type="dxa"/>
-          </w:tcPr>
-          <w:p>
-            <w:pPr>
-              <w:widowControl w:val="0"/>
-              <w:rPr>
-                <w:color w:val="3B3838" w:themeColor="background2" w:themeShade="40"/>
-                <w:sz w:val="20"/>
-                <w:szCs w:val="20"/>
-              </w:rPr>
-            </w:pPr>
-            <w:r>
-              <w:rPr>
-                <w:color w:val="3B3838" w:themeColor="background2" w:themeShade="40"/>
-                <w:sz w:val="20"/>
-                <w:szCs w:val="20"/>
-              </w:rPr>
-              <w:t xml:space="preserve">Use test </w:t>
-            </w:r>
-            <w:r>
-              <w:rPr>
-                <w:sz w:val="20"/>
-                <w:szCs w:val="20"/>
-              </w:rPr>
-              <w:t>example</w:t>
-            </w:r>
-            <w:r>
-              <w:rPr>
-                <w:sz w:val="20"/>
-                <w:szCs w:val="20"/>
-              </w:rPr>
-              <w:t xml:space="preserve"> </w:t>
-            </w:r>
-            <w:r>
-              <w:rPr>
-                <w:color w:val="3B3838" w:themeColor="background2" w:themeShade="40"/>
-                <w:sz w:val="20"/>
-                <w:szCs w:val="20"/>
-              </w:rPr>
-              <w:t xml:space="preserve">from </w:t>
-            </w:r>
-            <w:r>
-              <w:rPr>
-                <w:color w:val="3B3838" w:themeColor="background2" w:themeShade="40"/>
-                <w:sz w:val="20"/>
-                <w:szCs w:val="20"/>
-              </w:rPr>
-              <w:fldChar w:fldCharType="begin"/>
-            </w:r>
-            <w:r>
-              <w:rPr>
-                <w:color w:val="3B3838" w:themeColor="background2" w:themeShade="40"/>
-                <w:sz w:val="20"/>
-                <w:szCs w:val="20"/>
-              </w:rPr>
-              <w:instrText xml:space="preserve"> REF _Ref194929948 \r \h </w:instrText>
-            </w:r>
-            <w:r>
-              <w:rPr>
-                <w:color w:val="3B3838" w:themeColor="background2" w:themeShade="40"/>
-                <w:sz w:val="20"/>
-                <w:szCs w:val="20"/>
-              </w:rPr>
-            </w:r>
-            <w:r>
-              <w:rPr>
-                <w:color w:val="3B3838" w:themeColor="background2" w:themeShade="40"/>
-                <w:sz w:val="20"/>
-                <w:szCs w:val="20"/>
-              </w:rPr>
-              <w:fldChar w:fldCharType="separate"/>
-            </w:r>
-            <w:r>
-              <w:rPr>
-                <w:color w:val="3B3838" w:themeColor="background2" w:themeShade="40"/>
-                <w:sz w:val="20"/>
-                <w:szCs w:val="20"/>
-              </w:rPr>
-              <w:t>3.2.1.1</w:t>
-            </w:r>
-            <w:r>
-              <w:rPr>
-                <w:color w:val="3B3838" w:themeColor="background2" w:themeShade="40"/>
-                <w:sz w:val="20"/>
-                <w:szCs w:val="20"/>
-              </w:rPr>
-              <w:fldChar w:fldCharType="end"/>
-            </w:r>
-          </w:p>
-        </w:tc>
-        <w:tc>
-          <w:tcPr>
-            <w:tcW w:w="2576" w:type="dxa"/>
-          </w:tcPr>
-          <w:p>
-            <w:pPr>
-              <w:widowControl w:val="0"/>
-              <w:rPr>
-                <w:sz w:val="20"/>
-                <w:szCs w:val="20"/>
-                <w:lang w:val="en-US"/>
-              </w:rPr>
-            </w:pPr>
-            <w:r>
-              <w:rPr>
-                <w:sz w:val="20"/>
-                <w:szCs w:val="20"/>
-                <w:lang w:val="en-US"/>
-              </w:rPr>
-              <w:t>The episodeOfCare-identifier is displayed correctly.</w:t>
-            </w:r>
-          </w:p>
-        </w:tc>
-        <w:tc>
-          <w:tcPr>
-            <w:tcW w:w="2254" w:type="dxa"/>
-          </w:tcPr>
-          <w:p>
-            <w:pPr>
-              <w:widowControl w:val="0"/>
-              <w:jc w:val="center"/>
-              <w:rPr>
-                <w:sz w:val="20"/>
-                <w:szCs w:val="20"/>
-                <w:lang w:val="en-US"/>
-              </w:rPr>
-            </w:pPr>
-          </w:p>
-        </w:tc>
-        <w:tc>
-          <w:tcPr>
-            <w:tcW w:w="1304" w:type="dxa"/>
-          </w:tcPr>
-          <w:p>
-            <w:pPr>
-              <w:widowControl w:val="0"/>
-              <w:jc w:val="center"/>
-              <w:rPr>
-                <w:sz w:val="20"/>
-                <w:szCs w:val="20"/>
-              </w:rPr>
-            </w:pPr>
-            <w:sdt>
-              <w:sdtPr>
-                <w:rPr>
-                  <w:sz w:val="20"/>
-                  <w:szCs w:val="20"/>
-                </w:rPr>
-                <w:alias w:val="MedCom vurdering"/>
-                <w:tag w:val="MedCom vurdering"/>
-                <w:id w:val="-240648529"/>
-                <w:placeholder>
-                  <w:docPart w:val="77ECC03760164BECBDE97E2846ABB61D"/>
-                </w:placeholder>
-                <w:dropDownList>
-                  <w:listItem w:value="Vælg"/>
-                  <w:listItem w:displayText="F1" w:value="F1"/>
-                  <w:listItem w:displayText="F2" w:value="F2"/>
-                  <w:listItem w:displayText="F3" w:value="F3"/>
-                  <w:listItem w:displayText="F4" w:value="F4"/>
-                  <w:listItem w:displayText="OK" w:value="OK"/>
-                  <w:listItem w:displayText="Ej relevant" w:value="Ej relevant"/>
-                </w:dropDownList>
-              </w:sdtPr>
-              <w:sdtEndPr/>
-              <w:sdtContent>
-                <w:r>
-                  <w:rPr>
-                    <w:rStyle w:val="Pladsholdertekst"/>
-                    <w:sz w:val="20"/>
-                    <w:szCs w:val="20"/>
-                  </w:rPr>
-                  <w:t>Choose</w:t>
-                </w:r>
-              </w:sdtContent>
-            </w:sdt>
-          </w:p>
-        </w:tc>
-      </w:tr>
-      <w:tr>
-        <w:tc>
-          <w:tcPr>
-            <w:tcW w:w="13426" w:type="dxa"/>
-            <w:gridSpan w:val="6"/>
-            <w:shd w:val="clear" w:color="auto" w:fill="DEEAF6" w:themeFill="accent5" w:themeFillTint="33"/>
-          </w:tcPr>
-          <w:p>
-            <w:pPr>
-              <w:widowControl w:val="0"/>
-              <w:jc w:val="center"/>
-              <w:rPr>
-                <w:sz w:val="20"/>
-                <w:szCs w:val="20"/>
-              </w:rPr>
-            </w:pPr>
-            <w:r>
-              <w:rPr>
-                <w:sz w:val="20"/>
-                <w:szCs w:val="20"/>
-              </w:rPr>
               <w:t>Replacement-CPR</w:t>
             </w:r>
           </w:p>
@@ -15282,15 +15961,7 @@
                 <w:szCs w:val="20"/>
                 <w:lang w:val="en-US"/>
               </w:rPr>
-              <w:instrText xml:space="preserve"> REF _Ref212035212 \r \h </w:instrText>
-            </w:r>
-            <w:r>
-              <w:rPr>
-                <w:color w:val="3B3838" w:themeColor="background2" w:themeShade="40"/>
-                <w:sz w:val="20"/>
-                <w:szCs w:val="20"/>
-                <w:lang w:val="en-US"/>
-              </w:rPr>
+              <w:instrText xml:space="preserve"> REF _Ref231976898 \r </w:instrText>
             </w:r>
             <w:r>
               <w:rPr>
@@ -15576,15 +16247,7 @@
                 <w:szCs w:val="20"/>
                 <w:lang w:val="en-US"/>
               </w:rPr>
-              <w:instrText xml:space="preserve"> REF _Ref212035212 \r \h </w:instrText>
-            </w:r>
-            <w:r>
-              <w:rPr>
-                <w:color w:val="3B3838" w:themeColor="background2" w:themeShade="40"/>
-                <w:sz w:val="20"/>
-                <w:szCs w:val="20"/>
-                <w:lang w:val="en-US"/>
-              </w:rPr>
+              <w:instrText xml:space="preserve"> REF _Ref231976898 \r </w:instrText>
             </w:r>
             <w:r>
               <w:rPr>
@@ -16027,7 +16690,17 @@
                 <w:szCs w:val="20"/>
                 <w:lang w:val="en-US"/>
               </w:rPr>
-              <w:t>A CareCommunication can be answered by multiple practitionerRoles/practitioners from the same organization.</w:t>
+              <w:t xml:space="preserve">A CareCommunication can be answered by multiple </w:t>
+            </w:r>
+            <w:r>
+              <w:rPr>
+                <w:i/>
+                <w:sz w:val="20"/>
+                <w:szCs w:val="20"/>
+                <w:lang w:val="en-US"/>
+              </w:rPr>
+              <w:lastRenderedPageBreak/>
+              <w:t>practitionerRoles/practitioners from the same organization.</w:t>
             </w:r>
           </w:p>
           <w:p>
@@ -16171,7 +16844,17 @@
                 <w:szCs w:val="20"/>
                 <w:lang w:val="en-US"/>
               </w:rPr>
-              <w:t>Both are shown in correlation to the correct message segment.</w:t>
+              <w:lastRenderedPageBreak/>
+              <w:t xml:space="preserve">Both are shown in correlation to the correct </w:t>
+            </w:r>
+            <w:r>
+              <w:rPr>
+                <w:sz w:val="20"/>
+                <w:szCs w:val="20"/>
+                <w:lang w:val="en-US"/>
+              </w:rPr>
+              <w:lastRenderedPageBreak/>
+              <w:t>message segment.</w:t>
             </w:r>
           </w:p>
         </w:tc>
@@ -17306,7 +17989,23 @@
                 <w:szCs w:val="20"/>
                 <w:lang w:val="en-US"/>
               </w:rPr>
-              <w:t>The SUT must perform FHIR validation of the CareCommunication message against the updated Implementation Guides, before the message is shown to the user, to ensure conformance with the defined FHIR profiles and constraints.</w:t>
+              <w:t xml:space="preserve">The SUT </w:t>
+            </w:r>
+            <w:r>
+              <w:rPr>
+                <w:sz w:val="20"/>
+                <w:szCs w:val="20"/>
+                <w:lang w:val="en-US"/>
+              </w:rPr>
+              <w:t>MUST</w:t>
+            </w:r>
+            <w:r>
+              <w:rPr>
+                <w:sz w:val="20"/>
+                <w:szCs w:val="20"/>
+                <w:lang w:val="en-US"/>
+              </w:rPr>
+              <w:t xml:space="preserve"> perform FHIR validation of the CareCommunication message against the updated Implementation Guides, before the message is shown to the user, to ensure conformance with the defined FHIR profiles and constraints.</w:t>
             </w:r>
           </w:p>
           <w:p>
@@ -17334,8 +18033,63 @@
                 <w:szCs w:val="20"/>
                 <w:lang w:val="en-US"/>
               </w:rPr>
-              <w:t>Explain how the SUT validates incoming CareCommunication messages.</w:t>
-            </w:r>
+              <w:t>Explain how the SUT validates incoming CareCommunication messages</w:t>
+            </w:r>
+            <w:r>
+              <w:rPr>
+                <w:sz w:val="20"/>
+                <w:szCs w:val="20"/>
+                <w:lang w:val="en-US"/>
+              </w:rPr>
+              <w:t xml:space="preserve"> using FHIR validation</w:t>
+            </w:r>
+            <w:r>
+              <w:rPr>
+                <w:sz w:val="20"/>
+                <w:szCs w:val="20"/>
+                <w:lang w:val="en-US"/>
+              </w:rPr>
+              <w:t>.</w:t>
+            </w:r>
+          </w:p>
+          <w:p>
+            <w:pPr>
+              <w:widowControl w:val="0"/>
+              <w:rPr>
+                <w:sz w:val="20"/>
+                <w:szCs w:val="20"/>
+                <w:lang w:val="en-US"/>
+              </w:rPr>
+            </w:pPr>
+          </w:p>
+          <w:p>
+            <w:pPr>
+              <w:widowControl w:val="0"/>
+              <w:rPr>
+                <w:sz w:val="20"/>
+                <w:szCs w:val="20"/>
+                <w:lang w:val="en-US"/>
+              </w:rPr>
+            </w:pPr>
+            <w:r>
+              <w:rPr>
+                <w:sz w:val="20"/>
+                <w:szCs w:val="20"/>
+                <w:lang w:val="en-US"/>
+              </w:rPr>
+              <w:t xml:space="preserve">For more information, see the </w:t>
+            </w:r>
+            <w:hyperlink r:id="rId24" w:history="1">
+              <w:r>
+                <w:rPr>
+                  <w:rStyle w:val="Hyperlink"/>
+                  <w:sz w:val="20"/>
+                  <w:szCs w:val="20"/>
+                  <w:lang w:val="en-US"/>
+                </w:rPr>
+                <w:t>MedCom FHIR Validation Governance.</w:t>
+              </w:r>
+            </w:hyperlink>
           </w:p>
         </w:tc>
         <w:tc>
@@ -17663,20 +18417,29 @@
           <w:p>
             <w:pPr>
               <w:rPr>
+                <w:sz w:val="20"/>
+                <w:szCs w:val="20"/>
+                <w:lang w:val="en-US"/>
+              </w:rPr>
+            </w:pPr>
+            <w:r>
+              <w:rPr>
+                <w:sz w:val="20"/>
+                <w:szCs w:val="20"/>
+                <w:lang w:val="en-US"/>
+              </w:rPr>
+              <w:t xml:space="preserve">Load the test example. </w:t>
+            </w:r>
+          </w:p>
+          <w:p>
+            <w:pPr>
+              <w:rPr>
                 <w:rFonts w:cs="Calibri"/>
                 <w:sz w:val="20"/>
                 <w:szCs w:val="20"/>
                 <w:lang w:val="en-US"/>
               </w:rPr>
             </w:pPr>
-            <w:r>
-              <w:rPr>
-                <w:sz w:val="20"/>
-                <w:szCs w:val="20"/>
-                <w:lang w:val="en-US"/>
-              </w:rPr>
-              <w:t xml:space="preserve">Load the test example. </w:t>
-            </w:r>
             <w:r>
               <w:rPr>
                 <w:rFonts w:cs="Calibri"/>
@@ -17895,6 +18658,23 @@
           <w:p>
             <w:pPr>
               <w:rPr>
+                <w:sz w:val="20"/>
+                <w:szCs w:val="20"/>
+                <w:lang w:val="en-US"/>
+              </w:rPr>
+            </w:pPr>
+            <w:r>
+              <w:rPr>
+                <w:sz w:val="20"/>
+                <w:szCs w:val="20"/>
+                <w:lang w:val="en-US"/>
+              </w:rPr>
+              <w:t xml:space="preserve">Load the test example. </w:t>
+            </w:r>
+          </w:p>
+          <w:p>
+            <w:pPr>
+              <w:rPr>
                 <w:rFonts w:cs="Calibri"/>
                 <w:sz w:val="20"/>
                 <w:szCs w:val="20"/>
@@ -17903,20 +18683,48 @@
             </w:pPr>
             <w:r>
               <w:rPr>
-                <w:sz w:val="20"/>
-                <w:szCs w:val="20"/>
-                <w:lang w:val="en-US"/>
-              </w:rPr>
-              <w:t xml:space="preserve">Load the test example. </w:t>
-            </w:r>
-            <w:r>
-              <w:rPr>
                 <w:rFonts w:cs="Calibri"/>
                 <w:sz w:val="20"/>
                 <w:szCs w:val="20"/>
                 <w:lang w:val="en-US"/>
               </w:rPr>
-              <w:t xml:space="preserve">The provided CareCommunication has one regular CPR-number and two replacement CPR-numbers of different types included in the patient resource. </w:t>
+              <w:t>The provided CareCommunication has one regular CPR</w:t>
+            </w:r>
+            <w:r>
+              <w:rPr>
+                <w:rFonts w:cs="Calibri"/>
+                <w:sz w:val="20"/>
+                <w:szCs w:val="20"/>
+                <w:lang w:val="en-US"/>
+              </w:rPr>
+              <w:t xml:space="preserve"> </w:t>
+            </w:r>
+            <w:r>
+              <w:rPr>
+                <w:rFonts w:cs="Calibri"/>
+                <w:sz w:val="20"/>
+                <w:szCs w:val="20"/>
+                <w:lang w:val="en-US"/>
+              </w:rPr>
+              <w:t>number and two replacement CPR</w:t>
+            </w:r>
+            <w:r>
+              <w:rPr>
+                <w:rFonts w:cs="Calibri"/>
+                <w:sz w:val="20"/>
+                <w:szCs w:val="20"/>
+                <w:lang w:val="en-US"/>
+              </w:rPr>
+              <w:t xml:space="preserve"> </w:t>
+            </w:r>
+            <w:r>
+              <w:rPr>
+                <w:rFonts w:cs="Calibri"/>
+                <w:sz w:val="20"/>
+                <w:szCs w:val="20"/>
+                <w:lang w:val="en-US"/>
+              </w:rPr>
+              <w:t xml:space="preserve">numbers of different types included in the patient resource. </w:t>
             </w:r>
           </w:p>
           <w:p>
@@ -18099,12 +18907,14 @@
                 <w:rFonts w:cs="Calibri"/>
                 <w:sz w:val="20"/>
                 <w:szCs w:val="20"/>
-              </w:rPr>
-            </w:pPr>
-            <w:r>
-              <w:rPr>
-                <w:sz w:val="20"/>
-                <w:szCs w:val="20"/>
+                <w:lang w:val="en-US"/>
+              </w:rPr>
+            </w:pPr>
+            <w:r>
+              <w:rPr>
+                <w:sz w:val="20"/>
+                <w:szCs w:val="20"/>
+                <w:lang w:val="en-US"/>
               </w:rPr>
               <w:t>Load the test example.</w:t>
             </w:r>
@@ -18125,7 +18935,25 @@
                 <w:szCs w:val="20"/>
                 <w:lang w:val="en-US"/>
               </w:rPr>
-              <w:t xml:space="preserve">The provided CareCommunication has two replacement CPR-numbers included in the patient resource. </w:t>
+              <w:t>The provided CareCommunication has two replacement CPR</w:t>
+            </w:r>
+            <w:r>
+              <w:rPr>
+                <w:rFonts w:cs="Calibri"/>
+                <w:sz w:val="20"/>
+                <w:szCs w:val="20"/>
+                <w:lang w:val="en-US"/>
+              </w:rPr>
+              <w:t xml:space="preserve"> </w:t>
+            </w:r>
+            <w:r>
+              <w:rPr>
+                <w:rFonts w:cs="Calibri"/>
+                <w:sz w:val="20"/>
+                <w:szCs w:val="20"/>
+                <w:lang w:val="en-US"/>
+              </w:rPr>
+              <w:t xml:space="preserve">numbers included in the patient resource. </w:t>
             </w:r>
           </w:p>
           <w:p>
@@ -18268,13 +19096,228 @@
           </w:p>
         </w:tc>
       </w:tr>
+      <w:tr>
+        <w:tc>
+          <w:tcPr>
+            <w:tcW w:w="901" w:type="dxa"/>
+          </w:tcPr>
+          <w:p>
+            <w:pPr>
+              <w:pStyle w:val="Listeafsnit"/>
+              <w:numPr>
+                <w:ilvl w:val="3"/>
+                <w:numId w:val="5"/>
+              </w:numPr>
+              <w:spacing w:line="240" w:lineRule="auto"/>
+              <w:rPr>
+                <w:sz w:val="20"/>
+                <w:szCs w:val="20"/>
+              </w:rPr>
+            </w:pPr>
+          </w:p>
+        </w:tc>
+        <w:tc>
+          <w:tcPr>
+            <w:tcW w:w="2922" w:type="dxa"/>
+          </w:tcPr>
+          <w:p>
+            <w:pPr>
+              <w:rPr>
+                <w:rFonts w:cs="Calibri"/>
+                <w:sz w:val="20"/>
+                <w:szCs w:val="20"/>
+                <w:lang w:val="en-US"/>
+              </w:rPr>
+            </w:pPr>
+            <w:r>
+              <w:rPr>
+                <w:rFonts w:cs="Calibri"/>
+                <w:sz w:val="20"/>
+                <w:szCs w:val="20"/>
+                <w:lang w:val="en-US"/>
+              </w:rPr>
+              <w:t xml:space="preserve">It is </w:t>
+            </w:r>
+            <w:r>
+              <w:rPr>
+                <w:rFonts w:cs="Calibri"/>
+                <w:sz w:val="20"/>
+                <w:szCs w:val="20"/>
+                <w:lang w:val="en-US"/>
+              </w:rPr>
+              <w:t xml:space="preserve">possible </w:t>
+            </w:r>
+            <w:r>
+              <w:rPr>
+                <w:rFonts w:cs="Calibri"/>
+                <w:sz w:val="20"/>
+                <w:szCs w:val="20"/>
+                <w:lang w:val="en-US"/>
+              </w:rPr>
+              <w:t>to combine CPR and replacement CPR numbers for the same patient</w:t>
+            </w:r>
+            <w:r>
+              <w:rPr>
+                <w:rFonts w:cs="Calibri"/>
+                <w:sz w:val="20"/>
+                <w:szCs w:val="20"/>
+                <w:lang w:val="en-US"/>
+              </w:rPr>
+              <w:t xml:space="preserve">. </w:t>
+            </w:r>
+            <w:r>
+              <w:rPr>
+                <w:rFonts w:cs="Calibri"/>
+                <w:sz w:val="20"/>
+                <w:szCs w:val="20"/>
+                <w:lang w:val="en-US"/>
+              </w:rPr>
+              <w:t>However, the CPR, x-eCPR and d-eCPR identifier types are limited to one of each.</w:t>
+            </w:r>
+          </w:p>
+          <w:p>
+            <w:pPr>
+              <w:rPr>
+                <w:sz w:val="20"/>
+                <w:szCs w:val="20"/>
+                <w:lang w:val="en-US"/>
+              </w:rPr>
+            </w:pPr>
+            <w:r>
+              <w:rPr>
+                <w:rFonts w:cs="Calibri"/>
+                <w:sz w:val="20"/>
+                <w:szCs w:val="20"/>
+                <w:lang w:val="en-US"/>
+              </w:rPr>
+              <w:lastRenderedPageBreak/>
+              <w:t>E</w:t>
+            </w:r>
+            <w:r>
+              <w:rPr>
+                <w:rFonts w:cs="Calibri"/>
+                <w:sz w:val="20"/>
+                <w:szCs w:val="20"/>
+                <w:lang w:val="en-US"/>
+              </w:rPr>
+              <w:t>xplain which received CPR and replacement CPR numbers the SUT displays.</w:t>
+            </w:r>
+          </w:p>
+        </w:tc>
+        <w:tc>
+          <w:tcPr>
+            <w:tcW w:w="2126" w:type="dxa"/>
+          </w:tcPr>
+          <w:p>
+            <w:pPr>
+              <w:keepNext/>
+              <w:rPr>
+                <w:color w:val="3B3838" w:themeColor="background2" w:themeShade="40"/>
+                <w:sz w:val="20"/>
+                <w:szCs w:val="20"/>
+                <w:lang w:val="en-US"/>
+              </w:rPr>
+            </w:pPr>
+          </w:p>
+        </w:tc>
+        <w:tc>
+          <w:tcPr>
+            <w:tcW w:w="2977" w:type="dxa"/>
+          </w:tcPr>
+          <w:p>
+            <w:pPr>
+              <w:keepNext/>
+              <w:spacing w:before="60" w:after="120"/>
+              <w:rPr>
+                <w:sz w:val="20"/>
+                <w:szCs w:val="20"/>
+                <w:lang w:val="en-US"/>
+              </w:rPr>
+            </w:pPr>
+            <w:r>
+              <w:rPr>
+                <w:rFonts w:cs="Calibri"/>
+                <w:sz w:val="20"/>
+                <w:szCs w:val="20"/>
+                <w:lang w:val="en-US"/>
+              </w:rPr>
+              <w:t>Explain</w:t>
+            </w:r>
+            <w:r>
+              <w:rPr>
+                <w:rFonts w:cs="Calibri"/>
+                <w:sz w:val="20"/>
+                <w:szCs w:val="20"/>
+                <w:lang w:val="en-US"/>
+              </w:rPr>
+              <w:t xml:space="preserve"> which received CPR and replacement CPR numbers the SUT displays.</w:t>
+            </w:r>
+          </w:p>
+        </w:tc>
+        <w:tc>
+          <w:tcPr>
+            <w:tcW w:w="3513" w:type="dxa"/>
+          </w:tcPr>
+          <w:p>
+            <w:pPr>
+              <w:rPr>
+                <w:sz w:val="20"/>
+                <w:szCs w:val="20"/>
+                <w:lang w:val="en-US"/>
+              </w:rPr>
+            </w:pPr>
+          </w:p>
+        </w:tc>
+        <w:tc>
+          <w:tcPr>
+            <w:tcW w:w="1223" w:type="dxa"/>
+          </w:tcPr>
+          <w:p>
+            <w:pPr>
+              <w:rPr>
+                <w:sz w:val="20"/>
+                <w:szCs w:val="20"/>
+                <w:lang w:val="en-US"/>
+              </w:rPr>
+            </w:pPr>
+            <w:sdt>
+              <w:sdtPr>
+                <w:rPr>
+                  <w:sz w:val="20"/>
+                  <w:szCs w:val="20"/>
+                </w:rPr>
+                <w:alias w:val="MedCom vurdering"/>
+                <w:tag w:val="MedCom vurdering"/>
+                <w:id w:val="-901898538"/>
+                <w:placeholder>
+                  <w:docPart w:val="292480F98CB24E75961EF69BAB33D828"/>
+                </w:placeholder>
+                <w:dropDownList>
+                  <w:listItem w:value="Vælg"/>
+                  <w:listItem w:displayText="F1" w:value="F1"/>
+                  <w:listItem w:displayText="F2" w:value="F2"/>
+                  <w:listItem w:displayText="F3" w:value="F3"/>
+                  <w:listItem w:displayText="F4" w:value="F4"/>
+                  <w:listItem w:displayText="OK" w:value="OK"/>
+                  <w:listItem w:displayText="Ej relevant" w:value="Ej relevant"/>
+                </w:dropDownList>
+              </w:sdtPr>
+              <w:sdtEndPr/>
+              <w:sdtContent>
+                <w:r>
+                  <w:rPr>
+                    <w:rStyle w:val="Pladsholdertekst"/>
+                    <w:sz w:val="20"/>
+                    <w:szCs w:val="20"/>
+                  </w:rPr>
+                  <w:t>Choose</w:t>
+                </w:r>
+              </w:sdtContent>
+            </w:sdt>
+          </w:p>
+        </w:tc>
+      </w:tr>
     </w:tbl>
-    <w:p/>
-    <w:p>
-      <w:r>
-        <w:br w:type="page"/>
-      </w:r>
-    </w:p>
     <w:p>
       <w:pPr>
         <w:pStyle w:val="Overskrift3"/>
@@ -18284,7 +19327,6 @@
         </w:numPr>
       </w:pPr>
       <w:r>
-        <w:lastRenderedPageBreak/>
         <w:t xml:space="preserve">Parallel sent </w:t>
       </w:r>
       <w:r>
@@ -19701,16 +20743,7 @@
                 <w:szCs w:val="20"/>
                 <w:lang w:val="en-US"/>
               </w:rPr>
-              <w:t xml:space="preserve"> if the time stamps are identical, </w:t>
-            </w:r>
-            <w:r>
-              <w:rPr>
-                <w:sz w:val="20"/>
-                <w:szCs w:val="20"/>
-                <w:lang w:val="en-US"/>
-              </w:rPr>
-              <w:lastRenderedPageBreak/>
-              <w:t xml:space="preserve">the initiator of the communication must appear as the first, followed by the message </w:t>
+              <w:t xml:space="preserve"> if the time stamps are identical, the initiator of the communication must appear as the first, followed by the message </w:t>
             </w:r>
             <w:r>
               <w:rPr>
@@ -20537,6 +21570,7 @@
                 <w:b/>
                 <w:sz w:val="20"/>
                 <w:szCs w:val="20"/>
+                <w:lang w:val="en-US"/>
               </w:rPr>
             </w:pPr>
             <w:r>
@@ -20544,6 +21578,7 @@
                 <w:b/>
                 <w:sz w:val="20"/>
                 <w:szCs w:val="20"/>
+                <w:lang w:val="en-US"/>
               </w:rPr>
               <w:t xml:space="preserve">Acknowledgement </w:t>
             </w:r>
@@ -20706,6 +21741,7 @@
         <w:rPr>
           <w:lang w:val="en-US"/>
         </w:rPr>
+        <w:lastRenderedPageBreak/>
         <w:t xml:space="preserve">Loading of </w:t>
       </w:r>
       <w:r>
@@ -21089,16 +22125,7 @@
                 <w:szCs w:val="20"/>
                 <w:lang w:val="en-US"/>
               </w:rPr>
-              <w:t xml:space="preserve">Load test data, which is a </w:t>
-            </w:r>
-            <w:r>
-              <w:rPr>
-                <w:sz w:val="20"/>
-                <w:szCs w:val="20"/>
-                <w:lang w:val="en-US"/>
-              </w:rPr>
-              <w:lastRenderedPageBreak/>
-              <w:t>reply to a new CareCommunication, and demonstrate that the message appears as replied in the SUT.</w:t>
+              <w:t>Load test data, which is a reply to a new CareCommunication, and demonstrate that the message appears as replied in the SUT.</w:t>
             </w:r>
             <w:r>
               <w:rPr>
@@ -21184,7 +22211,6 @@
                 <w:szCs w:val="20"/>
                 <w:lang w:val="en-US"/>
               </w:rPr>
-              <w:lastRenderedPageBreak/>
               <w:t>R-Tek-H-3e047a9d-c86a-4828-b686-6a80403df5eb</w:t>
             </w:r>
           </w:p>
@@ -21218,7 +22244,6 @@
                 <w:szCs w:val="20"/>
                 <w:lang w:val="en-US"/>
               </w:rPr>
-              <w:lastRenderedPageBreak/>
               <w:t xml:space="preserve">The new and replied message appears as replied in the user interface ordered by time stamp </w:t>
             </w:r>
             <w:r>
@@ -21227,7 +22252,6 @@
                 <w:szCs w:val="20"/>
                 <w:lang w:val="en-US"/>
               </w:rPr>
-              <w:lastRenderedPageBreak/>
               <w:t>from</w:t>
             </w:r>
             <w:r>
@@ -21692,6 +22716,7 @@
         </w:numPr>
       </w:pPr>
       <w:r>
+        <w:lastRenderedPageBreak/>
         <w:t>H</w:t>
       </w:r>
       <w:r>
@@ -23678,7 +24703,23 @@
                 <w:szCs w:val="20"/>
                 <w:lang w:val="en-US"/>
               </w:rPr>
-              <w:t>Demonstrate that the SUT has sent a negative FHIR Acknowledgement (Kvittering).</w:t>
+              <w:t>Demonstrate that the SUT has sent a negative FHIR Acknowledgement (Kvittering)</w:t>
+            </w:r>
+            <w:r>
+              <w:rPr>
+                <w:sz w:val="20"/>
+                <w:szCs w:val="20"/>
+                <w:lang w:val="en-US"/>
+              </w:rPr>
+              <w:t xml:space="preserve"> as communication.category is missing</w:t>
+            </w:r>
+            <w:r>
+              <w:rPr>
+                <w:sz w:val="20"/>
+                <w:szCs w:val="20"/>
+                <w:lang w:val="en-US"/>
+              </w:rPr>
+              <w:t>.</w:t>
             </w:r>
           </w:p>
         </w:tc>
@@ -23732,7 +24773,7 @@
                 <w:szCs w:val="20"/>
                 <w:lang w:val="en-US"/>
               </w:rPr>
-              <w:t>to the correct receiver.</w:t>
+              <w:t>to the correct receiver</w:t>
             </w:r>
           </w:p>
         </w:tc>
@@ -24028,7 +25069,23 @@
                 <w:szCs w:val="20"/>
                 <w:lang w:val="en-US"/>
               </w:rPr>
-              <w:t>Demonstrate that the SUT has sent a negative FHIR Acknowledgement (Kvittering) for the duplet.</w:t>
+              <w:t>Demonstrate that the SUT has sent a negative FHIR Acknowledgement (Kvittering) for the duplet</w:t>
+            </w:r>
+            <w:r>
+              <w:rPr>
+                <w:sz w:val="20"/>
+                <w:szCs w:val="20"/>
+                <w:lang w:val="en-US"/>
+              </w:rPr>
+              <w:t xml:space="preserve"> as communication.category is missing</w:t>
+            </w:r>
+            <w:r>
+              <w:rPr>
+                <w:sz w:val="20"/>
+                <w:szCs w:val="20"/>
+                <w:lang w:val="en-US"/>
+              </w:rPr>
+              <w:t>.</w:t>
             </w:r>
           </w:p>
           <w:p>
@@ -24164,696 +25221,10 @@
       </w:tr>
     </w:tbl>
     <w:p/>
-    <w:p>
-      <w:pPr>
-        <w:pStyle w:val="Overskrift3"/>
-        <w:numPr>
-          <w:ilvl w:val="2"/>
-          <w:numId w:val="5"/>
-        </w:numPr>
-      </w:pPr>
-      <w:r>
-        <w:t>H</w:t>
-      </w:r>
-      <w:r>
-        <w:t xml:space="preserve">andling of </w:t>
-      </w:r>
-      <w:r>
-        <w:t xml:space="preserve">invalid </w:t>
-      </w:r>
-      <w:r>
-        <w:t>messages</w:t>
-      </w:r>
-    </w:p>
-    <w:tbl>
-      <w:tblPr>
-        <w:tblStyle w:val="Tabel-Gitter"/>
-        <w:tblW w:w="0" w:type="auto"/>
-        <w:tblLook w:val="04A0" w:firstRow="1" w:lastRow="0" w:firstColumn="1" w:lastColumn="0" w:noHBand="0" w:noVBand="1"/>
-      </w:tblPr>
-      <w:tblGrid>
-        <w:gridCol w:w="1260"/>
-        <w:gridCol w:w="2551"/>
-        <w:gridCol w:w="2059"/>
-        <w:gridCol w:w="3056"/>
-        <w:gridCol w:w="3120"/>
-        <w:gridCol w:w="1380"/>
-      </w:tblGrid>
-      <w:tr>
-        <w:trPr>
-          <w:tblHeader/>
-        </w:trPr>
-        <w:tc>
-          <w:tcPr>
-            <w:tcW w:w="1260" w:type="dxa"/>
-            <w:shd w:val="clear" w:color="auto" w:fill="152F4A"/>
-          </w:tcPr>
-          <w:p>
-            <w:pPr>
-              <w:widowControl w:val="0"/>
-              <w:rPr>
-                <w:b/>
-                <w:sz w:val="20"/>
-                <w:szCs w:val="20"/>
-              </w:rPr>
-            </w:pPr>
-            <w:r>
-              <w:rPr>
-                <w:b/>
-                <w:sz w:val="20"/>
-                <w:szCs w:val="20"/>
-              </w:rPr>
-              <w:t>Test</w:t>
-            </w:r>
-            <w:r>
-              <w:rPr>
-                <w:b/>
-                <w:sz w:val="20"/>
-                <w:szCs w:val="20"/>
-              </w:rPr>
-              <w:t xml:space="preserve"> </w:t>
-            </w:r>
-            <w:r>
-              <w:rPr>
-                <w:b/>
-                <w:sz w:val="20"/>
-                <w:szCs w:val="20"/>
-              </w:rPr>
-              <w:t>step #</w:t>
-            </w:r>
-          </w:p>
-        </w:tc>
-        <w:tc>
-          <w:tcPr>
-            <w:tcW w:w="2551" w:type="dxa"/>
-            <w:shd w:val="clear" w:color="auto" w:fill="152F4A"/>
-          </w:tcPr>
-          <w:p>
-            <w:pPr>
-              <w:widowControl w:val="0"/>
-              <w:rPr>
-                <w:b/>
-                <w:sz w:val="20"/>
-                <w:szCs w:val="20"/>
-              </w:rPr>
-            </w:pPr>
-            <w:r>
-              <w:rPr>
-                <w:b/>
-                <w:sz w:val="20"/>
-                <w:szCs w:val="20"/>
-              </w:rPr>
-              <w:t>Action</w:t>
-            </w:r>
-          </w:p>
-        </w:tc>
-        <w:tc>
-          <w:tcPr>
-            <w:tcW w:w="2059" w:type="dxa"/>
-            <w:shd w:val="clear" w:color="auto" w:fill="152F4A"/>
-          </w:tcPr>
-          <w:p>
-            <w:pPr>
-              <w:widowControl w:val="0"/>
-              <w:rPr>
-                <w:b/>
-                <w:sz w:val="20"/>
-                <w:szCs w:val="20"/>
-              </w:rPr>
-            </w:pPr>
-            <w:r>
-              <w:rPr>
-                <w:b/>
-                <w:sz w:val="20"/>
-                <w:szCs w:val="20"/>
-              </w:rPr>
-              <w:t>Test data</w:t>
-            </w:r>
-            <w:r>
-              <w:rPr>
-                <w:b/>
-                <w:sz w:val="20"/>
-                <w:szCs w:val="20"/>
-              </w:rPr>
-              <w:t>/</w:t>
-            </w:r>
-            <w:r>
-              <w:rPr>
-                <w:b/>
-                <w:sz w:val="20"/>
-                <w:szCs w:val="20"/>
-              </w:rPr>
-              <w:t>test person</w:t>
-            </w:r>
-          </w:p>
-        </w:tc>
-        <w:tc>
-          <w:tcPr>
-            <w:tcW w:w="3056" w:type="dxa"/>
-            <w:shd w:val="clear" w:color="auto" w:fill="152F4A"/>
-          </w:tcPr>
-          <w:p>
-            <w:pPr>
-              <w:widowControl w:val="0"/>
-              <w:rPr>
-                <w:b/>
-                <w:sz w:val="20"/>
-                <w:szCs w:val="20"/>
-              </w:rPr>
-            </w:pPr>
-            <w:r>
-              <w:rPr>
-                <w:b/>
-                <w:sz w:val="20"/>
-                <w:szCs w:val="20"/>
-              </w:rPr>
-              <w:t xml:space="preserve">Expected </w:t>
-            </w:r>
-            <w:r>
-              <w:rPr>
-                <w:b/>
-                <w:sz w:val="20"/>
-                <w:szCs w:val="20"/>
-              </w:rPr>
-              <w:t>r</w:t>
-            </w:r>
-            <w:r>
-              <w:rPr>
-                <w:b/>
-                <w:sz w:val="20"/>
-                <w:szCs w:val="20"/>
-              </w:rPr>
-              <w:t>esult</w:t>
-            </w:r>
-          </w:p>
-        </w:tc>
-        <w:tc>
-          <w:tcPr>
-            <w:tcW w:w="3120" w:type="dxa"/>
-            <w:shd w:val="clear" w:color="auto" w:fill="152F4A"/>
-          </w:tcPr>
-          <w:p>
-            <w:pPr>
-              <w:widowControl w:val="0"/>
-              <w:rPr>
-                <w:b/>
-                <w:sz w:val="20"/>
-                <w:szCs w:val="20"/>
-              </w:rPr>
-            </w:pPr>
-            <w:r>
-              <w:rPr>
-                <w:b/>
-                <w:sz w:val="20"/>
-                <w:szCs w:val="20"/>
-              </w:rPr>
-              <w:t>Actual</w:t>
-            </w:r>
-            <w:r>
-              <w:rPr>
-                <w:b/>
-                <w:sz w:val="20"/>
-                <w:szCs w:val="20"/>
-              </w:rPr>
-              <w:t xml:space="preserve"> </w:t>
-            </w:r>
-            <w:r>
-              <w:rPr>
-                <w:b/>
-                <w:sz w:val="20"/>
-                <w:szCs w:val="20"/>
-              </w:rPr>
-              <w:t>r</w:t>
-            </w:r>
-            <w:r>
-              <w:rPr>
-                <w:b/>
-                <w:sz w:val="20"/>
-                <w:szCs w:val="20"/>
-              </w:rPr>
-              <w:t>esult</w:t>
-            </w:r>
-          </w:p>
-        </w:tc>
-        <w:tc>
-          <w:tcPr>
-            <w:tcW w:w="1380" w:type="dxa"/>
-            <w:shd w:val="clear" w:color="auto" w:fill="152F4A"/>
-          </w:tcPr>
-          <w:p>
-            <w:pPr>
-              <w:widowControl w:val="0"/>
-              <w:rPr>
-                <w:b/>
-                <w:sz w:val="20"/>
-                <w:szCs w:val="20"/>
-              </w:rPr>
-            </w:pPr>
-            <w:r>
-              <w:rPr>
-                <w:b/>
-                <w:sz w:val="20"/>
-                <w:szCs w:val="20"/>
-              </w:rPr>
-              <w:t>MedCom</w:t>
-            </w:r>
-            <w:r>
-              <w:rPr>
-                <w:b/>
-                <w:sz w:val="20"/>
-                <w:szCs w:val="20"/>
-              </w:rPr>
-              <w:t xml:space="preserve"> </w:t>
-            </w:r>
-            <w:r>
-              <w:rPr>
-                <w:b/>
-                <w:sz w:val="20"/>
-                <w:szCs w:val="20"/>
-              </w:rPr>
-              <w:t>assessment</w:t>
-            </w:r>
-          </w:p>
-        </w:tc>
-      </w:tr>
-      <w:tr>
-        <w:tc>
-          <w:tcPr>
-            <w:tcW w:w="1260" w:type="dxa"/>
-          </w:tcPr>
-          <w:p>
-            <w:pPr>
-              <w:pStyle w:val="Listeafsnit"/>
-              <w:numPr>
-                <w:ilvl w:val="3"/>
-                <w:numId w:val="5"/>
-              </w:numPr>
-              <w:spacing w:line="240" w:lineRule="auto"/>
-              <w:rPr>
-                <w:sz w:val="20"/>
-                <w:szCs w:val="20"/>
-              </w:rPr>
-            </w:pPr>
-          </w:p>
-        </w:tc>
-        <w:tc>
-          <w:tcPr>
-            <w:tcW w:w="2551" w:type="dxa"/>
-          </w:tcPr>
-          <w:p>
-            <w:pPr>
-              <w:widowControl w:val="0"/>
-              <w:rPr>
-                <w:sz w:val="20"/>
-                <w:szCs w:val="20"/>
-                <w:lang w:val="en-US"/>
-              </w:rPr>
-            </w:pPr>
-            <w:r>
-              <w:rPr>
-                <w:sz w:val="20"/>
-                <w:szCs w:val="20"/>
-                <w:lang w:val="en-US"/>
-              </w:rPr>
-              <w:t>Load test data and demonstrate how the SUT handles invalid messages, e.g. missing valid “Commun</w:t>
-            </w:r>
-            <w:r>
-              <w:rPr>
-                <w:sz w:val="20"/>
-                <w:szCs w:val="20"/>
-                <w:lang w:val="en-US"/>
-              </w:rPr>
-              <w:t>i</w:t>
-            </w:r>
-            <w:r>
-              <w:rPr>
-                <w:sz w:val="20"/>
-                <w:szCs w:val="20"/>
-                <w:lang w:val="en-US"/>
-              </w:rPr>
-              <w:t>cation.category”</w:t>
-            </w:r>
-            <w:r>
-              <w:rPr>
-                <w:sz w:val="20"/>
-                <w:szCs w:val="20"/>
-                <w:lang w:val="en-US"/>
-              </w:rPr>
-              <w:t>.</w:t>
-            </w:r>
-          </w:p>
-        </w:tc>
-        <w:tc>
-          <w:tcPr>
-            <w:tcW w:w="2059" w:type="dxa"/>
-          </w:tcPr>
-          <w:p>
-            <w:pPr>
-              <w:widowControl w:val="0"/>
-              <w:rPr>
-                <w:sz w:val="20"/>
-                <w:szCs w:val="20"/>
-                <w:lang w:val="en-US"/>
-              </w:rPr>
-            </w:pPr>
-            <w:r>
-              <w:rPr>
-                <w:sz w:val="20"/>
-                <w:szCs w:val="20"/>
-                <w:lang w:val="en-US"/>
-              </w:rPr>
-              <w:t>R-Tek-O-invalid-3d1149cd-d3e3-421a-ae31-4860decb4272</w:t>
-            </w:r>
-          </w:p>
-          <w:p>
-            <w:pPr>
-              <w:widowControl w:val="0"/>
-              <w:rPr>
-                <w:sz w:val="20"/>
-                <w:szCs w:val="20"/>
-                <w:lang w:val="en-US"/>
-              </w:rPr>
-            </w:pPr>
-          </w:p>
-        </w:tc>
-        <w:tc>
-          <w:tcPr>
-            <w:tcW w:w="3056" w:type="dxa"/>
-          </w:tcPr>
-          <w:p>
-            <w:pPr>
-              <w:widowControl w:val="0"/>
-              <w:rPr>
-                <w:sz w:val="20"/>
-                <w:szCs w:val="20"/>
-                <w:lang w:val="en-US"/>
-              </w:rPr>
-            </w:pPr>
-            <w:r>
-              <w:rPr>
-                <w:sz w:val="20"/>
-                <w:szCs w:val="20"/>
-                <w:lang w:val="en-US"/>
-              </w:rPr>
-              <w:t xml:space="preserve">The SUT returns a FHIR Acknowledgement (Kvittering) </w:t>
-            </w:r>
-            <w:r>
-              <w:rPr>
-                <w:sz w:val="20"/>
-                <w:szCs w:val="20"/>
-                <w:lang w:val="en-US"/>
-              </w:rPr>
-              <w:t xml:space="preserve">of type </w:t>
-            </w:r>
-            <w:r>
-              <w:rPr>
-                <w:sz w:val="20"/>
-                <w:szCs w:val="20"/>
-                <w:lang w:val="en-US"/>
-              </w:rPr>
-              <w:t>fatal error (</w:t>
-            </w:r>
-            <w:r>
-              <w:rPr>
-                <w:sz w:val="20"/>
-                <w:szCs w:val="20"/>
-                <w:lang w:val="en-US"/>
-              </w:rPr>
-              <w:t>AE</w:t>
-            </w:r>
-            <w:r>
-              <w:rPr>
-                <w:sz w:val="20"/>
-                <w:szCs w:val="20"/>
-                <w:lang w:val="en-US"/>
-              </w:rPr>
-              <w:t>)</w:t>
-            </w:r>
-            <w:r>
-              <w:rPr>
-                <w:sz w:val="20"/>
-                <w:szCs w:val="20"/>
-                <w:lang w:val="en-US"/>
-              </w:rPr>
-              <w:t xml:space="preserve">, </w:t>
-            </w:r>
-            <w:r>
-              <w:rPr>
-                <w:sz w:val="20"/>
-                <w:szCs w:val="20"/>
-                <w:lang w:val="en-US"/>
-              </w:rPr>
-              <w:t xml:space="preserve">where the error is described. </w:t>
-            </w:r>
-          </w:p>
-        </w:tc>
-        <w:tc>
-          <w:tcPr>
-            <w:tcW w:w="3120" w:type="dxa"/>
-          </w:tcPr>
-          <w:p>
-            <w:pPr>
-              <w:widowControl w:val="0"/>
-              <w:jc w:val="center"/>
-              <w:rPr>
-                <w:sz w:val="20"/>
-                <w:szCs w:val="20"/>
-                <w:lang w:val="en-US"/>
-              </w:rPr>
-            </w:pPr>
-          </w:p>
-        </w:tc>
-        <w:tc>
-          <w:tcPr>
-            <w:tcW w:w="1380" w:type="dxa"/>
-          </w:tcPr>
-          <w:p>
-            <w:pPr>
-              <w:widowControl w:val="0"/>
-              <w:jc w:val="center"/>
-              <w:rPr>
-                <w:sz w:val="20"/>
-                <w:szCs w:val="20"/>
-              </w:rPr>
-            </w:pPr>
-            <w:sdt>
-              <w:sdtPr>
-                <w:rPr>
-                  <w:sz w:val="20"/>
-                  <w:szCs w:val="20"/>
-                </w:rPr>
-                <w:alias w:val="MedCom vurdering"/>
-                <w:tag w:val="MedCom vurdering"/>
-                <w:id w:val="559060751"/>
-                <w:placeholder>
-                  <w:docPart w:val="A267C0411C1E45CC931E8B852332776D"/>
-                </w:placeholder>
-                <w:dropDownList>
-                  <w:listItem w:value="Vælg"/>
-                  <w:listItem w:displayText="F1" w:value="F1"/>
-                  <w:listItem w:displayText="F2" w:value="F2"/>
-                  <w:listItem w:displayText="F3" w:value="F3"/>
-                  <w:listItem w:displayText="F4" w:value="F4"/>
-                  <w:listItem w:displayText="OK" w:value="OK"/>
-                  <w:listItem w:displayText="Ej relevant" w:value="Ej relevant"/>
-                </w:dropDownList>
-              </w:sdtPr>
-              <w:sdtEndPr/>
-              <w:sdtContent>
-                <w:r>
-                  <w:rPr>
-                    <w:rStyle w:val="Pladsholdertekst"/>
-                    <w:sz w:val="20"/>
-                    <w:szCs w:val="20"/>
-                  </w:rPr>
-                  <w:t>Choose</w:t>
-                </w:r>
-              </w:sdtContent>
-            </w:sdt>
-          </w:p>
-        </w:tc>
-      </w:tr>
-      <w:tr>
-        <w:tc>
-          <w:tcPr>
-            <w:tcW w:w="1260" w:type="dxa"/>
-          </w:tcPr>
-          <w:p>
-            <w:pPr>
-              <w:pStyle w:val="Listeafsnit"/>
-              <w:numPr>
-                <w:ilvl w:val="3"/>
-                <w:numId w:val="5"/>
-              </w:numPr>
-              <w:spacing w:line="240" w:lineRule="auto"/>
-              <w:rPr>
-                <w:sz w:val="20"/>
-                <w:szCs w:val="20"/>
-              </w:rPr>
-            </w:pPr>
-          </w:p>
-        </w:tc>
-        <w:tc>
-          <w:tcPr>
-            <w:tcW w:w="2551" w:type="dxa"/>
-          </w:tcPr>
-          <w:p>
-            <w:pPr>
-              <w:widowControl w:val="0"/>
-              <w:rPr>
-                <w:sz w:val="20"/>
-                <w:szCs w:val="20"/>
-                <w:lang w:val="en-US"/>
-              </w:rPr>
-            </w:pPr>
-            <w:r>
-              <w:rPr>
-                <w:sz w:val="20"/>
-                <w:szCs w:val="20"/>
-                <w:lang w:val="en-US"/>
-              </w:rPr>
-              <w:t>SUT does not display the invalid CareCommunication</w:t>
-            </w:r>
-            <w:r>
-              <w:rPr>
-                <w:sz w:val="20"/>
-                <w:szCs w:val="20"/>
-                <w:lang w:val="en-US"/>
-              </w:rPr>
-              <w:t xml:space="preserve">. </w:t>
-            </w:r>
-          </w:p>
-        </w:tc>
-        <w:tc>
-          <w:tcPr>
-            <w:tcW w:w="2059" w:type="dxa"/>
-          </w:tcPr>
-          <w:p>
-            <w:pPr>
-              <w:widowControl w:val="0"/>
-              <w:rPr>
-                <w:sz w:val="20"/>
-                <w:szCs w:val="20"/>
-                <w:lang w:val="en-US"/>
-              </w:rPr>
-            </w:pPr>
-          </w:p>
-        </w:tc>
-        <w:tc>
-          <w:tcPr>
-            <w:tcW w:w="3056" w:type="dxa"/>
-          </w:tcPr>
-          <w:p>
-            <w:pPr>
-              <w:widowControl w:val="0"/>
-              <w:rPr>
-                <w:sz w:val="20"/>
-                <w:szCs w:val="20"/>
-                <w:lang w:val="en-US"/>
-              </w:rPr>
-            </w:pPr>
-            <w:r>
-              <w:rPr>
-                <w:sz w:val="20"/>
-                <w:szCs w:val="20"/>
-                <w:lang w:val="en-US"/>
-              </w:rPr>
-              <w:t xml:space="preserve">The SUT does not show the </w:t>
-            </w:r>
-            <w:r>
-              <w:rPr>
-                <w:sz w:val="20"/>
-                <w:szCs w:val="20"/>
-                <w:lang w:val="en-US"/>
-              </w:rPr>
-              <w:t>invalid</w:t>
-            </w:r>
-            <w:r>
-              <w:rPr>
-                <w:sz w:val="20"/>
-                <w:szCs w:val="20"/>
-                <w:lang w:val="en-US"/>
-              </w:rPr>
-              <w:t xml:space="preserve"> message.</w:t>
-            </w:r>
-          </w:p>
-        </w:tc>
-        <w:tc>
-          <w:tcPr>
-            <w:tcW w:w="3120" w:type="dxa"/>
-          </w:tcPr>
-          <w:p>
-            <w:pPr>
-              <w:widowControl w:val="0"/>
-              <w:jc w:val="center"/>
-              <w:rPr>
-                <w:sz w:val="20"/>
-                <w:szCs w:val="20"/>
-                <w:lang w:val="en-US"/>
-              </w:rPr>
-            </w:pPr>
-          </w:p>
-        </w:tc>
-        <w:tc>
-          <w:tcPr>
-            <w:tcW w:w="1380" w:type="dxa"/>
-          </w:tcPr>
-          <w:p>
-            <w:pPr>
-              <w:widowControl w:val="0"/>
-              <w:jc w:val="center"/>
-              <w:rPr>
-                <w:sz w:val="20"/>
-                <w:szCs w:val="20"/>
-              </w:rPr>
-            </w:pPr>
-            <w:sdt>
-              <w:sdtPr>
-                <w:rPr>
-                  <w:sz w:val="20"/>
-                  <w:szCs w:val="20"/>
-                </w:rPr>
-                <w:alias w:val="MedCom vurdering"/>
-                <w:tag w:val="MedCom vurdering"/>
-                <w:id w:val="2107844931"/>
-                <w:placeholder>
-                  <w:docPart w:val="012DDCE9416C4D5EAFAC977E2BFA361C"/>
-                </w:placeholder>
-                <w:dropDownList>
-                  <w:listItem w:value="Vælg"/>
-                  <w:listItem w:displayText="F1" w:value="F1"/>
-                  <w:listItem w:displayText="F2" w:value="F2"/>
-                  <w:listItem w:displayText="F3" w:value="F3"/>
-                  <w:listItem w:displayText="F4" w:value="F4"/>
-                  <w:listItem w:displayText="OK" w:value="OK"/>
-                  <w:listItem w:displayText="Ej relevant" w:value="Ej relevant"/>
-                </w:dropDownList>
-              </w:sdtPr>
-              <w:sdtEndPr/>
-              <w:sdtContent>
-                <w:r>
-                  <w:rPr>
-                    <w:rStyle w:val="Pladsholdertekst"/>
-                    <w:sz w:val="20"/>
-                    <w:szCs w:val="20"/>
-                  </w:rPr>
-                  <w:t>Choose</w:t>
-                </w:r>
-              </w:sdtContent>
-            </w:sdt>
-          </w:p>
-        </w:tc>
-      </w:tr>
-    </w:tbl>
-    <w:p>
-      <w:pPr>
-        <w:pStyle w:val="Overskrift3"/>
-      </w:pPr>
-    </w:p>
     <w:p/>
     <w:sectPr>
-      <w:headerReference w:type="default" r:id="rId24"/>
-      <w:footerReference w:type="default" r:id="rId25"/>
+      <w:headerReference w:type="default" r:id="rId25"/>
+      <w:footerReference w:type="default" r:id="rId26"/>
       <w:pgSz w:w="16838" w:h="11906" w:orient="landscape"/>
       <w:pgMar w:top="1134" w:right="1701" w:bottom="1134" w:left="1701" w:header="708" w:footer="708" w:gutter="0"/>
       <w:cols w:space="708"/>
@@ -25092,6 +25463,9 @@
       <w:gridCol w:w="1654"/>
     </w:tblGrid>
     <w:tr>
+      <w:trPr>
+        <w:trHeight w:val="315"/>
+      </w:trPr>
       <w:tc>
         <w:tcPr>
           <w:tcW w:w="700" w:type="pct"/>
@@ -25558,6 +25932,14 @@
             </w:rPr>
             <w:t>5.0</w:t>
           </w:r>
+          <w:r>
+            <w:rPr>
+              <w:rFonts w:ascii="Calibri" w:hAnsi="Calibri" w:cs="Times New Roman"/>
+              <w:sz w:val="16"/>
+              <w:szCs w:val="16"/>
+            </w:rPr>
+            <w:t>.1</w:t>
+          </w:r>
         </w:p>
       </w:tc>
       <w:tc>
@@ -25582,14 +25964,6 @@
               <w:sz w:val="16"/>
               <w:szCs w:val="16"/>
             </w:rPr>
-            <w:t>October</w:t>
-          </w:r>
-          <w:r>
-            <w:rPr>
-              <w:rFonts w:ascii="Calibri" w:hAnsi="Calibri" w:cs="Times New Roman"/>
-              <w:sz w:val="16"/>
-              <w:szCs w:val="16"/>
-            </w:rPr>
             <w:t xml:space="preserve"> </w:t>
           </w:r>
           <w:r>
@@ -25598,7 +25972,15 @@
               <w:sz w:val="16"/>
               <w:szCs w:val="16"/>
             </w:rPr>
-            <w:t>2025</w:t>
+            <w:t>July</w:t>
+          </w:r>
+          <w:r>
+            <w:rPr>
+              <w:rFonts w:ascii="Calibri" w:hAnsi="Calibri" w:cs="Times New Roman"/>
+              <w:sz w:val="16"/>
+              <w:szCs w:val="16"/>
+            </w:rPr>
+            <w:t xml:space="preserve"> 2026</w:t>
           </w:r>
         </w:p>
       </w:tc>
@@ -27419,7 +27801,7 @@
       <w:lvlText w:val="2.%1"/>
       <w:lvlJc w:val="left"/>
       <w:pPr>
-        <w:ind w:left="720" w:hanging="360"/>
+        <w:ind w:left="360" w:hanging="360"/>
       </w:pPr>
       <w:rPr>
         <w:rFonts w:hint="default"/>
@@ -27431,7 +27813,7 @@
       <w:lvlText w:val="%2."/>
       <w:lvlJc w:val="left"/>
       <w:pPr>
-        <w:ind w:left="1440" w:hanging="360"/>
+        <w:ind w:left="1080" w:hanging="360"/>
       </w:pPr>
     </w:lvl>
     <w:lvl w:ilvl="2" w:tplc="0406001B" w:tentative="1">
@@ -27440,7 +27822,7 @@
       <w:lvlText w:val="%3."/>
       <w:lvlJc w:val="right"/>
       <w:pPr>
-        <w:ind w:left="2160" w:hanging="180"/>
+        <w:ind w:left="1800" w:hanging="180"/>
       </w:pPr>
     </w:lvl>
     <w:lvl w:ilvl="3" w:tplc="0406000F" w:tentative="1">
@@ -27449,7 +27831,7 @@
       <w:lvlText w:val="%4."/>
       <w:lvlJc w:val="left"/>
       <w:pPr>
-        <w:ind w:left="2880" w:hanging="360"/>
+        <w:ind w:left="2520" w:hanging="360"/>
       </w:pPr>
     </w:lvl>
     <w:lvl w:ilvl="4" w:tplc="04060019" w:tentative="1">
@@ -27458,7 +27840,7 @@
       <w:lvlText w:val="%5."/>
       <w:lvlJc w:val="left"/>
       <w:pPr>
-        <w:ind w:left="3600" w:hanging="360"/>
+        <w:ind w:left="3240" w:hanging="360"/>
       </w:pPr>
     </w:lvl>
     <w:lvl w:ilvl="5" w:tplc="0406001B" w:tentative="1">
@@ -27467,7 +27849,7 @@
       <w:lvlText w:val="%6."/>
       <w:lvlJc w:val="right"/>
       <w:pPr>
-        <w:ind w:left="4320" w:hanging="180"/>
+        <w:ind w:left="3960" w:hanging="180"/>
       </w:pPr>
     </w:lvl>
     <w:lvl w:ilvl="6" w:tplc="0406000F" w:tentative="1">
@@ -27476,7 +27858,7 @@
       <w:lvlText w:val="%7."/>
       <w:lvlJc w:val="left"/>
       <w:pPr>
-        <w:ind w:left="5040" w:hanging="360"/>
+        <w:ind w:left="4680" w:hanging="360"/>
       </w:pPr>
     </w:lvl>
     <w:lvl w:ilvl="7" w:tplc="04060019" w:tentative="1">
@@ -27485,7 +27867,7 @@
       <w:lvlText w:val="%8."/>
       <w:lvlJc w:val="left"/>
       <w:pPr>
-        <w:ind w:left="5760" w:hanging="360"/>
+        <w:ind w:left="5400" w:hanging="360"/>
       </w:pPr>
     </w:lvl>
     <w:lvl w:ilvl="8" w:tplc="0406001B" w:tentative="1">
@@ -27494,7 +27876,7 @@
       <w:lvlText w:val="%9."/>
       <w:lvlJc w:val="right"/>
       <w:pPr>
-        <w:ind w:left="6480" w:hanging="180"/>
+        <w:ind w:left="6120" w:hanging="180"/>
       </w:pPr>
     </w:lvl>
   </w:abstractNum>
@@ -27621,7 +28003,7 @@
       <w:lvlText w:val="%1"/>
       <w:lvlJc w:val="left"/>
       <w:pPr>
-        <w:ind w:left="720" w:hanging="360"/>
+        <w:ind w:left="360" w:hanging="360"/>
       </w:pPr>
       <w:rPr>
         <w:rFonts w:hint="default"/>
@@ -27633,7 +28015,7 @@
       <w:lvlText w:val="%2."/>
       <w:lvlJc w:val="left"/>
       <w:pPr>
-        <w:ind w:left="1440" w:hanging="360"/>
+        <w:ind w:left="1080" w:hanging="360"/>
       </w:pPr>
     </w:lvl>
     <w:lvl w:ilvl="2" w:tplc="0406001B" w:tentative="1">
@@ -27642,7 +28024,7 @@
       <w:lvlText w:val="%3."/>
       <w:lvlJc w:val="right"/>
       <w:pPr>
-        <w:ind w:left="2160" w:hanging="180"/>
+        <w:ind w:left="1800" w:hanging="180"/>
       </w:pPr>
     </w:lvl>
     <w:lvl w:ilvl="3" w:tplc="0406000F" w:tentative="1">
@@ -27651,7 +28033,7 @@
       <w:lvlText w:val="%4."/>
       <w:lvlJc w:val="left"/>
       <w:pPr>
-        <w:ind w:left="2880" w:hanging="360"/>
+        <w:ind w:left="2520" w:hanging="360"/>
       </w:pPr>
     </w:lvl>
     <w:lvl w:ilvl="4" w:tplc="04060019" w:tentative="1">
@@ -27660,7 +28042,7 @@
       <w:lvlText w:val="%5."/>
       <w:lvlJc w:val="left"/>
       <w:pPr>
-        <w:ind w:left="3600" w:hanging="360"/>
+        <w:ind w:left="3240" w:hanging="360"/>
       </w:pPr>
     </w:lvl>
     <w:lvl w:ilvl="5" w:tplc="0406001B" w:tentative="1">
@@ -27669,7 +28051,7 @@
       <w:lvlText w:val="%6."/>
       <w:lvlJc w:val="right"/>
       <w:pPr>
-        <w:ind w:left="4320" w:hanging="180"/>
+        <w:ind w:left="3960" w:hanging="180"/>
       </w:pPr>
     </w:lvl>
     <w:lvl w:ilvl="6" w:tplc="0406000F" w:tentative="1">
@@ -27678,7 +28060,7 @@
       <w:lvlText w:val="%7."/>
       <w:lvlJc w:val="left"/>
       <w:pPr>
-        <w:ind w:left="5040" w:hanging="360"/>
+        <w:ind w:left="4680" w:hanging="360"/>
       </w:pPr>
     </w:lvl>
     <w:lvl w:ilvl="7" w:tplc="04060019" w:tentative="1">
@@ -27687,7 +28069,7 @@
       <w:lvlText w:val="%8."/>
       <w:lvlJc w:val="left"/>
       <w:pPr>
-        <w:ind w:left="5760" w:hanging="360"/>
+        <w:ind w:left="5400" w:hanging="360"/>
       </w:pPr>
     </w:lvl>
     <w:lvl w:ilvl="8" w:tplc="0406001B" w:tentative="1">
@@ -27696,7 +28078,7 @@
       <w:lvlText w:val="%9."/>
       <w:lvlJc w:val="right"/>
       <w:pPr>
-        <w:ind w:left="6480" w:hanging="180"/>
+        <w:ind w:left="6120" w:hanging="180"/>
       </w:pPr>
     </w:lvl>
   </w:abstractNum>
@@ -30108,7 +30490,7 @@
   <w:style w:type="paragraph" w:default="1" w:styleId="Normal">
     <w:name w:val="Normal"/>
     <w:qFormat/>
-    <w:rsid w:val="00B32C7A"/>
+    <w:rsid w:val="009F5BC1"/>
   </w:style>
   <w:style w:type="paragraph" w:styleId="Overskrift1">
     <w:name w:val="heading 1"/>
@@ -31830,36 +32212,6 @@
     </w:docPart>
     <w:docPart>
       <w:docPartPr>
-        <w:name w:val="012DDCE9416C4D5EAFAC977E2BFA361C"/>
-        <w:category>
-          <w:name w:val="Generelt"/>
-          <w:gallery w:val="placeholder"/>
-        </w:category>
-        <w:types>
-          <w:type w:val="bbPlcHdr"/>
-        </w:types>
-        <w:behaviors>
-          <w:behavior w:val="content"/>
-        </w:behaviors>
-        <w:guid w:val="{FC14A38D-4ACB-4072-BD55-73312D0AC128}"/>
-      </w:docPartPr>
-      <w:docPartBody>
-        <w:p>
-          <w:pPr>
-            <w:pStyle w:val="012DDCE9416C4D5EAFAC977E2BFA361C"/>
-          </w:pPr>
-          <w:r>
-            <w:rPr>
-              <w:rStyle w:val="Pladsholdertekst"/>
-              <w:rFonts w:eastAsia="Calibri"/>
-            </w:rPr>
-            <w:t>Vælg</w:t>
-          </w:r>
-        </w:p>
-      </w:docPartBody>
-    </w:docPart>
-    <w:docPart>
-      <w:docPartPr>
         <w:name w:val="984D7A0E53AB41B8860987009552F125"/>
         <w:category>
           <w:name w:val="Generelt"/>
@@ -32087,36 +32439,6 @@
         <w:p>
           <w:pPr>
             <w:pStyle w:val="C17981797AA94B9984E0FE4E20ABFC66"/>
-          </w:pPr>
-          <w:r>
-            <w:rPr>
-              <w:rStyle w:val="Pladsholdertekst"/>
-              <w:rFonts w:eastAsia="Calibri"/>
-            </w:rPr>
-            <w:t>Vælg</w:t>
-          </w:r>
-        </w:p>
-      </w:docPartBody>
-    </w:docPart>
-    <w:docPart>
-      <w:docPartPr>
-        <w:name w:val="A267C0411C1E45CC931E8B852332776D"/>
-        <w:category>
-          <w:name w:val="Generelt"/>
-          <w:gallery w:val="placeholder"/>
-        </w:category>
-        <w:types>
-          <w:type w:val="bbPlcHdr"/>
-        </w:types>
-        <w:behaviors>
-          <w:behavior w:val="content"/>
-        </w:behaviors>
-        <w:guid w:val="{EC12CC46-3567-4B65-AA8D-FD21DBF80797}"/>
-      </w:docPartPr>
-      <w:docPartBody>
-        <w:p>
-          <w:pPr>
-            <w:pStyle w:val="A267C0411C1E45CC931E8B852332776D"/>
           </w:pPr>
           <w:r>
             <w:rPr>
@@ -32490,36 +32812,6 @@
     </w:docPart>
     <w:docPart>
       <w:docPartPr>
-        <w:name w:val="77ECC03760164BECBDE97E2846ABB61D"/>
-        <w:category>
-          <w:name w:val="Generelt"/>
-          <w:gallery w:val="placeholder"/>
-        </w:category>
-        <w:types>
-          <w:type w:val="bbPlcHdr"/>
-        </w:types>
-        <w:behaviors>
-          <w:behavior w:val="content"/>
-        </w:behaviors>
-        <w:guid w:val="{69B4AB06-D9E4-4354-A78F-9A88AA1E706D}"/>
-      </w:docPartPr>
-      <w:docPartBody>
-        <w:p>
-          <w:pPr>
-            <w:pStyle w:val="77ECC03760164BECBDE97E2846ABB61D"/>
-          </w:pPr>
-          <w:r>
-            <w:rPr>
-              <w:rStyle w:val="Pladsholdertekst"/>
-              <w:rFonts w:eastAsia="Calibri"/>
-            </w:rPr>
-            <w:t>Vælg</w:t>
-          </w:r>
-        </w:p>
-      </w:docPartBody>
-    </w:docPart>
-    <w:docPart>
-      <w:docPartPr>
         <w:name w:val="F147564D24424CEF8E6CEFF4421BBF1E"/>
         <w:category>
           <w:name w:val="Generelt"/>
@@ -32878,6 +33170,96 @@
         </w:p>
       </w:docPartBody>
     </w:docPart>
+    <w:docPart>
+      <w:docPartPr>
+        <w:name w:val="04316D5D34F84F3CA200EFAAD972C321"/>
+        <w:category>
+          <w:name w:val="Generelt"/>
+          <w:gallery w:val="placeholder"/>
+        </w:category>
+        <w:types>
+          <w:type w:val="bbPlcHdr"/>
+        </w:types>
+        <w:behaviors>
+          <w:behavior w:val="content"/>
+        </w:behaviors>
+        <w:guid w:val="{75CEE035-8FB3-4DDC-B312-EA088B6918D4}"/>
+      </w:docPartPr>
+      <w:docPartBody>
+        <w:p>
+          <w:pPr>
+            <w:pStyle w:val="04316D5D34F84F3CA200EFAAD972C321"/>
+          </w:pPr>
+          <w:r>
+            <w:rPr>
+              <w:rStyle w:val="Pladsholdertekst"/>
+              <w:rFonts w:eastAsia="Calibri"/>
+            </w:rPr>
+            <w:t>Vælg</w:t>
+          </w:r>
+        </w:p>
+      </w:docPartBody>
+    </w:docPart>
+    <w:docPart>
+      <w:docPartPr>
+        <w:name w:val="292480F98CB24E75961EF69BAB33D828"/>
+        <w:category>
+          <w:name w:val="Generelt"/>
+          <w:gallery w:val="placeholder"/>
+        </w:category>
+        <w:types>
+          <w:type w:val="bbPlcHdr"/>
+        </w:types>
+        <w:behaviors>
+          <w:behavior w:val="content"/>
+        </w:behaviors>
+        <w:guid w:val="{62EB5C90-8BEB-48B0-A47F-88AC517885BE}"/>
+      </w:docPartPr>
+      <w:docPartBody>
+        <w:p>
+          <w:pPr>
+            <w:pStyle w:val="292480F98CB24E75961EF69BAB33D828"/>
+          </w:pPr>
+          <w:r>
+            <w:rPr>
+              <w:rStyle w:val="Pladsholdertekst"/>
+              <w:rFonts w:eastAsia="Calibri"/>
+            </w:rPr>
+            <w:t>Vælg</w:t>
+          </w:r>
+        </w:p>
+      </w:docPartBody>
+    </w:docPart>
+    <w:docPart>
+      <w:docPartPr>
+        <w:name w:val="22B6ABDDFAB0477480575E68CFC89193"/>
+        <w:category>
+          <w:name w:val="Generelt"/>
+          <w:gallery w:val="placeholder"/>
+        </w:category>
+        <w:types>
+          <w:type w:val="bbPlcHdr"/>
+        </w:types>
+        <w:behaviors>
+          <w:behavior w:val="content"/>
+        </w:behaviors>
+        <w:guid w:val="{521B6A63-3D13-447C-9C31-7807520E9404}"/>
+      </w:docPartPr>
+      <w:docPartBody>
+        <w:p>
+          <w:pPr>
+            <w:pStyle w:val="22B6ABDDFAB0477480575E68CFC89193"/>
+          </w:pPr>
+          <w:r>
+            <w:rPr>
+              <w:rStyle w:val="Pladsholdertekst"/>
+              <w:rFonts w:eastAsia="Calibri"/>
+            </w:rPr>
+            <w:t>Vælg</w:t>
+          </w:r>
+        </w:p>
+      </w:docPartBody>
+    </w:docPart>
   </w:docParts>
 </w:glossaryDocument>
 </file>
@@ -32942,7 +33324,6 @@
     <w:sig w:usb0="E4002EFF" w:usb1="C200247B" w:usb2="00000009" w:usb3="00000000" w:csb0="000001FF" w:csb1="00000000"/>
   </w:font>
   <w:font w:name="Yu Mincho">
-    <w:altName w:val="游明朝"/>
     <w:charset w:val="80"/>
     <w:family w:val="roman"/>
     <w:pitch w:val="variable"/>
@@ -33006,7 +33387,9 @@
     <w:rsid w:val="00041FB4"/>
     <w:rsid w:val="00074E69"/>
     <w:rsid w:val="000847EF"/>
+    <w:rsid w:val="0009073B"/>
     <w:rsid w:val="000B3BD9"/>
+    <w:rsid w:val="000B48E6"/>
     <w:rsid w:val="000C1180"/>
     <w:rsid w:val="000F2867"/>
     <w:rsid w:val="000F2D0C"/>
@@ -33017,6 +33400,7 @@
     <w:rsid w:val="00165538"/>
     <w:rsid w:val="00181D4B"/>
     <w:rsid w:val="00184A4B"/>
+    <w:rsid w:val="00194C75"/>
     <w:rsid w:val="00197B57"/>
     <w:rsid w:val="001A1580"/>
     <w:rsid w:val="001A1954"/>
@@ -33024,6 +33408,7 @@
     <w:rsid w:val="001B313E"/>
     <w:rsid w:val="001B6378"/>
     <w:rsid w:val="0020067A"/>
+    <w:rsid w:val="002058FD"/>
     <w:rsid w:val="002137E5"/>
     <w:rsid w:val="00240FED"/>
     <w:rsid w:val="002470F5"/>
@@ -33033,8 +33418,11 @@
     <w:rsid w:val="002963FA"/>
     <w:rsid w:val="002C15F9"/>
     <w:rsid w:val="002C20A9"/>
+    <w:rsid w:val="002F26B4"/>
     <w:rsid w:val="00303856"/>
     <w:rsid w:val="00331D75"/>
+    <w:rsid w:val="00333908"/>
+    <w:rsid w:val="003357B4"/>
     <w:rsid w:val="00344DE2"/>
     <w:rsid w:val="00346D48"/>
     <w:rsid w:val="00361390"/>
@@ -33048,12 +33436,14 @@
     <w:rsid w:val="003D3508"/>
     <w:rsid w:val="003F2423"/>
     <w:rsid w:val="003F2B24"/>
+    <w:rsid w:val="00410597"/>
     <w:rsid w:val="004112C3"/>
     <w:rsid w:val="004115BD"/>
     <w:rsid w:val="00450784"/>
     <w:rsid w:val="00450B46"/>
     <w:rsid w:val="00460FA1"/>
     <w:rsid w:val="004C0914"/>
+    <w:rsid w:val="004D7D14"/>
     <w:rsid w:val="0050139A"/>
     <w:rsid w:val="0052532C"/>
     <w:rsid w:val="0054545A"/>
@@ -33067,14 +33457,17 @@
     <w:rsid w:val="00606FF9"/>
     <w:rsid w:val="00651CAC"/>
     <w:rsid w:val="00663886"/>
+    <w:rsid w:val="00665C5D"/>
     <w:rsid w:val="006A663F"/>
     <w:rsid w:val="006E3F24"/>
     <w:rsid w:val="007030A9"/>
+    <w:rsid w:val="00705061"/>
     <w:rsid w:val="00782E63"/>
     <w:rsid w:val="00786105"/>
     <w:rsid w:val="0079596F"/>
     <w:rsid w:val="007A22F3"/>
     <w:rsid w:val="007C03E7"/>
+    <w:rsid w:val="007C2BE7"/>
     <w:rsid w:val="007D7B94"/>
     <w:rsid w:val="007E17B2"/>
     <w:rsid w:val="007F3538"/>
@@ -33082,6 +33475,7 @@
     <w:rsid w:val="007F4581"/>
     <w:rsid w:val="00813795"/>
     <w:rsid w:val="00824CCA"/>
+    <w:rsid w:val="00850FB3"/>
     <w:rsid w:val="0085113F"/>
     <w:rsid w:val="00853057"/>
     <w:rsid w:val="00860772"/>
@@ -33112,22 +33506,22 @@
     <w:rsid w:val="00B971A0"/>
     <w:rsid w:val="00BA2BCC"/>
     <w:rsid w:val="00BD3370"/>
-    <w:rsid w:val="00BD4547"/>
     <w:rsid w:val="00BD7E08"/>
     <w:rsid w:val="00BD7F21"/>
     <w:rsid w:val="00BF5A99"/>
     <w:rsid w:val="00C04483"/>
     <w:rsid w:val="00C121E5"/>
     <w:rsid w:val="00C36B9D"/>
+    <w:rsid w:val="00C57F81"/>
     <w:rsid w:val="00C673FF"/>
     <w:rsid w:val="00C9249C"/>
     <w:rsid w:val="00C95CBC"/>
     <w:rsid w:val="00CB4C08"/>
     <w:rsid w:val="00CC122A"/>
     <w:rsid w:val="00CD6D4C"/>
-    <w:rsid w:val="00D13355"/>
     <w:rsid w:val="00D62667"/>
     <w:rsid w:val="00D93DF2"/>
+    <w:rsid w:val="00DA249C"/>
     <w:rsid w:val="00E31757"/>
     <w:rsid w:val="00E35D24"/>
     <w:rsid w:val="00E703E2"/>
@@ -33139,6 +33533,7 @@
     <w:rsid w:val="00EF4B9F"/>
     <w:rsid w:val="00F20357"/>
     <w:rsid w:val="00FB53F5"/>
+    <w:rsid w:val="00FB5C54"/>
     <w:rsid w:val="00FC25D0"/>
     <w:rsid w:val="00FC72C7"/>
     <w:rsid w:val="00FF0845"/>
@@ -33595,6 +33990,7 @@
     <w:basedOn w:val="Standardskrifttypeiafsnit"/>
     <w:uiPriority w:val="99"/>
     <w:semiHidden/>
+    <w:rsid w:val="00194C75"/>
     <w:rPr>
       <w:color w:val="808080"/>
     </w:rPr>
@@ -33921,11 +34317,29 @@
       <w14:ligatures w14:val="standardContextual"/>
     </w:rPr>
   </w:style>
-  <w:style w:type="paragraph" w:customStyle="1" w:styleId="012DDCE9416C4D5EAFAC977E2BFA361C">
-    <w:name w:val="012DDCE9416C4D5EAFAC977E2BFA361C"/>
-    <w:rsid w:val="008C236E"/>
+  <w:style w:type="paragraph" w:customStyle="1" w:styleId="22B6ABDDFAB0477480575E68CFC89193">
+    <w:name w:val="22B6ABDDFAB0477480575E68CFC89193"/>
+    <w:rsid w:val="00194C75"/>
+    <w:pPr>
+      <w:spacing w:line="278" w:lineRule="auto"/>
+    </w:pPr>
     <w:rPr>
       <w:kern w:val="2"/>
+      <w:sz w:val="24"/>
+      <w:szCs w:val="24"/>
+      <w14:ligatures w14:val="standardContextual"/>
+    </w:rPr>
+  </w:style>
+  <w:style w:type="paragraph" w:customStyle="1" w:styleId="04316D5D34F84F3CA200EFAAD972C321">
+    <w:name w:val="04316D5D34F84F3CA200EFAAD972C321"/>
+    <w:rsid w:val="002F26B4"/>
+    <w:pPr>
+      <w:spacing w:line="278" w:lineRule="auto"/>
+    </w:pPr>
+    <w:rPr>
+      <w:kern w:val="2"/>
+      <w:sz w:val="24"/>
+      <w:szCs w:val="24"/>
       <w14:ligatures w14:val="standardContextual"/>
     </w:rPr>
   </w:style>
@@ -34009,19 +34423,6 @@
   </w:style>
   <w:style w:type="paragraph" w:customStyle="1" w:styleId="C17981797AA94B9984E0FE4E20ABFC66">
     <w:name w:val="C17981797AA94B9984E0FE4E20ABFC66"/>
-    <w:rsid w:val="002137E5"/>
-    <w:pPr>
-      <w:spacing w:line="278" w:lineRule="auto"/>
-    </w:pPr>
-    <w:rPr>
-      <w:kern w:val="2"/>
-      <w:sz w:val="24"/>
-      <w:szCs w:val="24"/>
-      <w14:ligatures w14:val="standardContextual"/>
-    </w:rPr>
-  </w:style>
-  <w:style w:type="paragraph" w:customStyle="1" w:styleId="A267C0411C1E45CC931E8B852332776D">
-    <w:name w:val="A267C0411C1E45CC931E8B852332776D"/>
     <w:rsid w:val="002137E5"/>
     <w:pPr>
       <w:spacing w:line="278" w:lineRule="auto"/>
@@ -34161,8 +34562,8 @@
       <w14:ligatures w14:val="standardContextual"/>
     </w:rPr>
   </w:style>
-  <w:style w:type="paragraph" w:customStyle="1" w:styleId="77ECC03760164BECBDE97E2846ABB61D">
-    <w:name w:val="77ECC03760164BECBDE97E2846ABB61D"/>
+  <w:style w:type="paragraph" w:customStyle="1" w:styleId="F147564D24424CEF8E6CEFF4421BBF1E">
+    <w:name w:val="F147564D24424CEF8E6CEFF4421BBF1E"/>
     <w:pPr>
       <w:spacing w:line="278" w:lineRule="auto"/>
     </w:pPr>
@@ -34173,8 +34574,9 @@
       <w14:ligatures w14:val="standardContextual"/>
     </w:rPr>
   </w:style>
-  <w:style w:type="paragraph" w:customStyle="1" w:styleId="F147564D24424CEF8E6CEFF4421BBF1E">
-    <w:name w:val="F147564D24424CEF8E6CEFF4421BBF1E"/>
+  <w:style w:type="paragraph" w:customStyle="1" w:styleId="292480F98CB24E75961EF69BAB33D828">
+    <w:name w:val="292480F98CB24E75961EF69BAB33D828"/>
+    <w:rsid w:val="002F26B4"/>
     <w:pPr>
       <w:spacing w:line="278" w:lineRule="auto"/>
     </w:pPr>
@@ -34611,17 +35013,8 @@
 </file>
 
 <file path=customXml/item1.xml><?xml version="1.0" encoding="utf-8"?>
-<?mso-contentType ?>
-<FormTemplates xmlns="http://schemas.microsoft.com/sharepoint/v3/contenttype/forms">
-  <Display>DocumentLibraryForm</Display>
-  <Edit>DocumentLibraryForm</Edit>
-  <New>DocumentLibraryForm</New>
-</FormTemplates>
-</file>
-
-<file path=customXml/item2.xml><?xml version="1.0" encoding="utf-8"?>
-<ct:contentTypeSchema xmlns:ct="http://schemas.microsoft.com/office/2006/metadata/contentType" xmlns:ma="http://schemas.microsoft.com/office/2006/metadata/properties/metaAttributes" ct:_="" ma:_="" ma:contentTypeName="Dokument" ma:contentTypeID="0x010100CE3A8153F207434E9AE9E016B63FAED4" ma:contentTypeVersion="14" ma:contentTypeDescription="Opret et nyt dokument." ma:contentTypeScope="" ma:versionID="52bf93efd82d4e5a4b2dd25d42b7cc87">
-  <xsd:schema xmlns:xsd="http://www.w3.org/2001/XMLSchema" xmlns:xs="http://www.w3.org/2001/XMLSchema" xmlns:p="http://schemas.microsoft.com/office/2006/metadata/properties" xmlns:ns2="ee8ef5dc-6422-4132-ba28-a9150fefde4c" xmlns:ns3="672a50b0-1df9-4341-9d54-48b9c706e195" targetNamespace="http://schemas.microsoft.com/office/2006/metadata/properties" ma:root="true" ma:fieldsID="02e2b7d272b82d896a959b2d413e6733" ns2:_="" ns3:_="">
+<ct:contentTypeSchema xmlns:ct="http://schemas.microsoft.com/office/2006/metadata/contentType" xmlns:ma="http://schemas.microsoft.com/office/2006/metadata/properties/metaAttributes" ct:_="" ma:_="" ma:contentTypeName="Dokument" ma:contentTypeID="0x010100CE3A8153F207434E9AE9E016B63FAED4" ma:contentTypeVersion="14" ma:contentTypeDescription="Opret et nyt dokument." ma:contentTypeScope="" ma:versionID="4db7d70616debe2b560b99cfd97c8c41">
+  <xsd:schema xmlns:xsd="http://www.w3.org/2001/XMLSchema" xmlns:xs="http://www.w3.org/2001/XMLSchema" xmlns:p="http://schemas.microsoft.com/office/2006/metadata/properties" xmlns:ns2="ee8ef5dc-6422-4132-ba28-a9150fefde4c" xmlns:ns3="672a50b0-1df9-4341-9d54-48b9c706e195" targetNamespace="http://schemas.microsoft.com/office/2006/metadata/properties" ma:root="true" ma:fieldsID="7d79f90df4c2ae1b98b3ae311fc82e69" ns2:_="" ns3:_="">
     <xsd:import namespace="ee8ef5dc-6422-4132-ba28-a9150fefde4c"/>
     <xsd:import namespace="672a50b0-1df9-4341-9d54-48b9c706e195"/>
     <xsd:element name="properties">
@@ -34848,7 +35241,7 @@
 </ct:contentTypeSchema>
 </file>
 
-<file path=customXml/item3.xml><?xml version="1.0" encoding="utf-8"?>
+<file path=customXml/item2.xml><?xml version="1.0" encoding="utf-8"?>
 <p:properties xmlns:p="http://schemas.microsoft.com/office/2006/metadata/properties" xmlns:xsi="http://www.w3.org/2001/XMLSchema-instance" xmlns:pc="http://schemas.microsoft.com/office/infopath/2007/PartnerControls">
   <documentManagement>
     <lcf76f155ced4ddcb4097134ff3c332f xmlns="ee8ef5dc-6422-4132-ba28-a9150fefde4c">
@@ -34859,20 +35252,21 @@
 </p:properties>
 </file>
 
-<file path=customXml/item4.xml><?xml version="1.0" encoding="utf-8"?>
+<file path=customXml/item3.xml><?xml version="1.0" encoding="utf-8"?>
 <b:Sources xmlns:b="http://schemas.openxmlformats.org/officeDocument/2006/bibliography" xmlns="http://schemas.openxmlformats.org/officeDocument/2006/bibliography" SelectedStyle="\APASixthEditionOfficeOnline.xsl" StyleName="APA" Version="6"/>
 </file>
 
-<file path=customXml/itemProps1.xml><?xml version="1.0" encoding="utf-8"?>
-<ds:datastoreItem xmlns:ds="http://schemas.openxmlformats.org/officeDocument/2006/customXml" ds:itemID="{4C1D6B20-F8BE-413B-AE2E-76A50948A943}">
-  <ds:schemaRefs>
-    <ds:schemaRef ds:uri="http://schemas.microsoft.com/sharepoint/v3/contenttype/forms"/>
-  </ds:schemaRefs>
-</ds:datastoreItem>
+<file path=customXml/item4.xml><?xml version="1.0" encoding="utf-8"?>
+<?mso-contentType ?>
+<FormTemplates xmlns="http://schemas.microsoft.com/sharepoint/v3/contenttype/forms">
+  <Display>DocumentLibraryForm</Display>
+  <Edit>DocumentLibraryForm</Edit>
+  <New>DocumentLibraryForm</New>
+</FormTemplates>
 </file>
 
-<file path=customXml/itemProps2.xml><?xml version="1.0" encoding="utf-8"?>
-<ds:datastoreItem xmlns:ds="http://schemas.openxmlformats.org/officeDocument/2006/customXml" ds:itemID="{42F455F7-98EA-4863-8660-93F3A48933F3}">
+<file path=customXml/itemProps1.xml><?xml version="1.0" encoding="utf-8"?>
+<ds:datastoreItem xmlns:ds="http://schemas.openxmlformats.org/officeDocument/2006/customXml" ds:itemID="{E0C10802-6F9D-4B17-BE6F-443DFE2C8AE1}">
   <ds:schemaRefs>
     <ds:schemaRef ds:uri="http://schemas.microsoft.com/office/2006/metadata/contentType"/>
     <ds:schemaRef ds:uri="http://schemas.microsoft.com/office/2006/metadata/properties/metaAttributes"/>
@@ -34890,7 +35284,7 @@
 </ds:datastoreItem>
 </file>
 
-<file path=customXml/itemProps3.xml><?xml version="1.0" encoding="utf-8"?>
+<file path=customXml/itemProps2.xml><?xml version="1.0" encoding="utf-8"?>
 <ds:datastoreItem xmlns:ds="http://schemas.openxmlformats.org/officeDocument/2006/customXml" ds:itemID="{D00219BE-D6D3-49D3-A6E0-533534996ACF}">
   <ds:schemaRefs>
     <ds:schemaRef ds:uri="http://schemas.microsoft.com/office/2006/metadata/properties"/>
@@ -34901,10 +35295,18 @@
 </ds:datastoreItem>
 </file>
 
-<file path=customXml/itemProps4.xml><?xml version="1.0" encoding="utf-8"?>
+<file path=customXml/itemProps3.xml><?xml version="1.0" encoding="utf-8"?>
 <ds:datastoreItem xmlns:ds="http://schemas.openxmlformats.org/officeDocument/2006/customXml" ds:itemID="{18CEAC93-67DE-4A44-82DF-9DCF67599B3D}">
   <ds:schemaRefs>
     <ds:schemaRef ds:uri="http://schemas.openxmlformats.org/officeDocument/2006/bibliography"/>
   </ds:schemaRefs>
 </ds:datastoreItem>
+</file>
+
+<file path=customXml/itemProps4.xml><?xml version="1.0" encoding="utf-8"?>
+<ds:datastoreItem xmlns:ds="http://schemas.openxmlformats.org/officeDocument/2006/customXml" ds:itemID="{4C1D6B20-F8BE-413B-AE2E-76A50948A943}">
+  <ds:schemaRefs>
+    <ds:schemaRef ds:uri="http://schemas.microsoft.com/sharepoint/v3/contenttype/forms"/>
+  </ds:schemaRefs>
+</ds:datastoreItem>
 </file>
</xml_diff>

<commit_message>
Githubpagesmaster testmaterialeupdate sks (#177)
* opdateret testfiler og protokoller

* Update _config.yml
</commit_message>
<xml_diff>
--- a/docs/assets/CareCommunication_Testprotocol_Receive.docx
+++ b/docs/assets/CareCommunication_Testprotocol_Receive.docx
@@ -171,7 +171,7 @@
           <w:szCs w:val="56"/>
           <w:lang w:val="en-US"/>
         </w:rPr>
-        <w:t xml:space="preserve">October </w:t>
+        <w:t>July</w:t>
       </w:r>
       <w:r>
         <w:rPr>
@@ -182,29 +182,7 @@
           <w:szCs w:val="56"/>
           <w:lang w:val="en-US"/>
         </w:rPr>
-        <w:t>20</w:t>
-      </w:r>
-      <w:r>
-        <w:rPr>
-          <w:rFonts w:ascii="Calibri Light" w:eastAsia="Times New Roman" w:hAnsi="Calibri Light" w:cs="Times New Roman"/>
-          <w:spacing w:val="-10"/>
-          <w:kern w:val="28"/>
-          <w:sz w:val="56"/>
-          <w:szCs w:val="56"/>
-          <w:lang w:val="en-US"/>
-        </w:rPr>
-        <w:t>2</w:t>
-      </w:r>
-      <w:r>
-        <w:rPr>
-          <w:rFonts w:ascii="Calibri Light" w:eastAsia="Times New Roman" w:hAnsi="Calibri Light" w:cs="Times New Roman"/>
-          <w:spacing w:val="-10"/>
-          <w:kern w:val="28"/>
-          <w:sz w:val="56"/>
-          <w:szCs w:val="56"/>
-          <w:lang w:val="en-US"/>
-        </w:rPr>
-        <w:t>5</w:t>
+        <w:t xml:space="preserve"> 2026</w:t>
       </w:r>
     </w:p>
     <w:p>
@@ -2483,6 +2461,245 @@
           </w:p>
         </w:tc>
       </w:tr>
+      <w:tr>
+        <w:trPr>
+          <w:trHeight w:val="300"/>
+        </w:trPr>
+        <w:tc>
+          <w:tcPr>
+            <w:tcW w:w="468" w:type="pct"/>
+            <w:vAlign w:val="center"/>
+          </w:tcPr>
+          <w:p>
+            <w:pPr>
+              <w:jc w:val="center"/>
+              <w:rPr>
+                <w:sz w:val="20"/>
+                <w:szCs w:val="20"/>
+              </w:rPr>
+            </w:pPr>
+            <w:r>
+              <w:rPr>
+                <w:sz w:val="20"/>
+                <w:szCs w:val="20"/>
+              </w:rPr>
+              <w:lastRenderedPageBreak/>
+              <w:t>5.0.1</w:t>
+            </w:r>
+          </w:p>
+        </w:tc>
+        <w:tc>
+          <w:tcPr>
+            <w:tcW w:w="887" w:type="pct"/>
+            <w:vAlign w:val="center"/>
+          </w:tcPr>
+          <w:p>
+            <w:pPr>
+              <w:rPr>
+                <w:sz w:val="20"/>
+                <w:szCs w:val="20"/>
+              </w:rPr>
+            </w:pPr>
+            <w:r>
+              <w:rPr>
+                <w:sz w:val="20"/>
+                <w:szCs w:val="20"/>
+              </w:rPr>
+              <w:t>RCH</w:t>
+            </w:r>
+            <w:r>
+              <w:rPr>
+                <w:sz w:val="20"/>
+                <w:szCs w:val="20"/>
+              </w:rPr>
+              <w:t>/SKS</w:t>
+            </w:r>
+          </w:p>
+        </w:tc>
+        <w:tc>
+          <w:tcPr>
+            <w:tcW w:w="455" w:type="pct"/>
+            <w:vAlign w:val="center"/>
+          </w:tcPr>
+          <w:p>
+            <w:pPr>
+              <w:rPr>
+                <w:sz w:val="20"/>
+                <w:szCs w:val="20"/>
+              </w:rPr>
+            </w:pPr>
+            <w:r>
+              <w:rPr>
+                <w:sz w:val="20"/>
+                <w:szCs w:val="20"/>
+              </w:rPr>
+              <w:t>07-07</w:t>
+            </w:r>
+            <w:r>
+              <w:rPr>
+                <w:sz w:val="20"/>
+                <w:szCs w:val="20"/>
+              </w:rPr>
+              <w:t>-2026</w:t>
+            </w:r>
+          </w:p>
+        </w:tc>
+        <w:tc>
+          <w:tcPr>
+            <w:tcW w:w="3190" w:type="pct"/>
+            <w:vAlign w:val="center"/>
+          </w:tcPr>
+          <w:p>
+            <w:pPr>
+              <w:rPr>
+                <w:sz w:val="20"/>
+                <w:szCs w:val="20"/>
+                <w:lang w:val="en-US"/>
+              </w:rPr>
+            </w:pPr>
+            <w:r>
+              <w:rPr>
+                <w:sz w:val="20"/>
+                <w:szCs w:val="20"/>
+                <w:lang w:val="en-US"/>
+              </w:rPr>
+              <w:t xml:space="preserve">Updated wrong test file reference in test steps </w:t>
+            </w:r>
+            <w:r>
+              <w:rPr>
+                <w:sz w:val="20"/>
+                <w:szCs w:val="20"/>
+                <w:lang w:val="en-US"/>
+              </w:rPr>
+              <w:t>3.2.1.7 + 3.2.1.8</w:t>
+            </w:r>
+            <w:r>
+              <w:rPr>
+                <w:sz w:val="20"/>
+                <w:szCs w:val="20"/>
+                <w:lang w:val="en-US"/>
+              </w:rPr>
+              <w:t>.</w:t>
+            </w:r>
+          </w:p>
+          <w:p>
+            <w:pPr>
+              <w:rPr>
+                <w:sz w:val="20"/>
+                <w:szCs w:val="20"/>
+                <w:lang w:val="en-US"/>
+              </w:rPr>
+            </w:pPr>
+            <w:r>
+              <w:rPr>
+                <w:sz w:val="20"/>
+                <w:szCs w:val="20"/>
+                <w:lang w:val="en-US"/>
+              </w:rPr>
+              <w:t>Clarified</w:t>
+            </w:r>
+            <w:r>
+              <w:rPr>
+                <w:sz w:val="20"/>
+                <w:szCs w:val="20"/>
+                <w:lang w:val="en-US"/>
+              </w:rPr>
+              <w:t xml:space="preserve"> sender/signature and sender organization in test step 3.1.3.4</w:t>
+            </w:r>
+          </w:p>
+          <w:p>
+            <w:pPr>
+              <w:rPr>
+                <w:sz w:val="20"/>
+                <w:szCs w:val="20"/>
+                <w:lang w:val="en-US"/>
+              </w:rPr>
+            </w:pPr>
+            <w:r>
+              <w:rPr>
+                <w:sz w:val="20"/>
+                <w:szCs w:val="20"/>
+                <w:lang w:val="en-US"/>
+              </w:rPr>
+              <w:t xml:space="preserve">Added test step 3.1.3.5 to clarify </w:t>
+            </w:r>
+            <w:r>
+              <w:rPr>
+                <w:sz w:val="20"/>
+                <w:szCs w:val="20"/>
+                <w:lang w:val="en-US"/>
+              </w:rPr>
+              <w:t>handling of receiving organization in a forwarded message.</w:t>
+            </w:r>
+          </w:p>
+          <w:p>
+            <w:pPr>
+              <w:rPr>
+                <w:sz w:val="20"/>
+                <w:szCs w:val="20"/>
+                <w:lang w:val="en-US"/>
+              </w:rPr>
+            </w:pPr>
+            <w:r>
+              <w:rPr>
+                <w:sz w:val="20"/>
+                <w:szCs w:val="20"/>
+                <w:lang w:val="en-US"/>
+              </w:rPr>
+              <w:t>Added test step 3.2.3.4 re</w:t>
+            </w:r>
+            <w:r>
+              <w:rPr>
+                <w:sz w:val="20"/>
+                <w:szCs w:val="20"/>
+                <w:lang w:val="en-US"/>
+              </w:rPr>
+              <w:t>g</w:t>
+            </w:r>
+            <w:r>
+              <w:rPr>
+                <w:sz w:val="20"/>
+                <w:szCs w:val="20"/>
+                <w:lang w:val="en-US"/>
+              </w:rPr>
+              <w:t xml:space="preserve">arding receiving </w:t>
+            </w:r>
+            <w:r>
+              <w:rPr>
+                <w:sz w:val="20"/>
+                <w:szCs w:val="20"/>
+                <w:lang w:val="en-US"/>
+              </w:rPr>
+              <w:t>combinations of CPR and replacement CPR numbers.</w:t>
+            </w:r>
+          </w:p>
+          <w:p>
+            <w:pPr>
+              <w:rPr>
+                <w:sz w:val="20"/>
+                <w:szCs w:val="20"/>
+                <w:lang w:val="en-US"/>
+              </w:rPr>
+            </w:pPr>
+            <w:r>
+              <w:rPr>
+                <w:sz w:val="20"/>
+                <w:szCs w:val="20"/>
+                <w:lang w:val="en-US"/>
+              </w:rPr>
+              <w:t xml:space="preserve">Removed test regarding </w:t>
+            </w:r>
+            <w:r>
+              <w:rPr>
+                <w:sz w:val="20"/>
+                <w:szCs w:val="20"/>
+                <w:lang w:val="en-US"/>
+              </w:rPr>
+              <w:t>Handling of invalid messages is this is merged with handling of invalid doublets</w:t>
+            </w:r>
+          </w:p>
+        </w:tc>
+      </w:tr>
     </w:tbl>
     <w:p>
       <w:pPr>
@@ -2516,8 +2733,34 @@
         <w:p>
           <w:pPr>
             <w:pStyle w:val="Overskrift"/>
+            <w:rPr>
+              <w:rFonts w:asciiTheme="minorHAnsi" w:eastAsiaTheme="minorEastAsia" w:hAnsiTheme="minorHAnsi" w:cstheme="minorBidi"/>
+              <w:color w:val="auto"/>
+              <w:sz w:val="22"/>
+              <w:szCs w:val="22"/>
+              <w:lang w:eastAsia="en-US"/>
+            </w:rPr>
+          </w:pPr>
+        </w:p>
+        <w:p>
+          <w:pPr>
+            <w:rPr>
+              <w:rFonts w:eastAsiaTheme="minorEastAsia"/>
+            </w:rPr>
           </w:pPr>
           <w:r>
+            <w:rPr>
+              <w:rFonts w:eastAsiaTheme="minorEastAsia"/>
+            </w:rPr>
+            <w:br w:type="page"/>
+          </w:r>
+        </w:p>
+        <w:p>
+          <w:pPr>
+            <w:pStyle w:val="Overskrift"/>
+          </w:pPr>
+          <w:r>
+            <w:lastRenderedPageBreak/>
             <w:t>Content</w:t>
           </w:r>
         </w:p>
@@ -2543,7 +2786,7 @@
           <w:r>
             <w:fldChar w:fldCharType="separate"/>
           </w:r>
-          <w:hyperlink w:anchor="_Toc211862589" w:history="1">
+          <w:hyperlink w:anchor="_Toc234233363" w:history="1">
             <w:r>
               <w:rPr>
                 <w:rStyle w:val="Hyperlink"/>
@@ -2589,7 +2832,7 @@
                 <w:noProof/>
                 <w:webHidden/>
               </w:rPr>
-              <w:instrText xml:space="preserve"> PAGEREF _Toc211862589 \h </w:instrText>
+              <w:instrText xml:space="preserve"> PAGEREF _Toc234233363 \h </w:instrText>
             </w:r>
             <w:r>
               <w:rPr>
@@ -2609,7 +2852,7 @@
                 <w:noProof/>
                 <w:webHidden/>
               </w:rPr>
-              <w:t>4</w:t>
+              <w:t>5</w:t>
             </w:r>
             <w:r>
               <w:rPr>
@@ -2633,7 +2876,7 @@
               <w14:ligatures w14:val="standardContextual"/>
             </w:rPr>
           </w:pPr>
-          <w:hyperlink w:anchor="_Toc211862590" w:history="1">
+          <w:hyperlink w:anchor="_Toc234233364" w:history="1">
             <w:r>
               <w:rPr>
                 <w:rStyle w:val="Hyperlink"/>
@@ -2679,7 +2922,7 @@
                 <w:noProof/>
                 <w:webHidden/>
               </w:rPr>
-              <w:instrText xml:space="preserve"> PAGEREF _Toc211862590 \h </w:instrText>
+              <w:instrText xml:space="preserve"> PAGEREF _Toc234233364 \h </w:instrText>
             </w:r>
             <w:r>
               <w:rPr>
@@ -2699,7 +2942,7 @@
                 <w:noProof/>
                 <w:webHidden/>
               </w:rPr>
-              <w:t>4</w:t>
+              <w:t>5</w:t>
             </w:r>
             <w:r>
               <w:rPr>
@@ -2723,7 +2966,7 @@
               <w14:ligatures w14:val="standardContextual"/>
             </w:rPr>
           </w:pPr>
-          <w:hyperlink w:anchor="_Toc211862591" w:history="1">
+          <w:hyperlink w:anchor="_Toc234233365" w:history="1">
             <w:r>
               <w:rPr>
                 <w:rStyle w:val="Hyperlink"/>
@@ -2769,7 +3012,7 @@
                 <w:noProof/>
                 <w:webHidden/>
               </w:rPr>
-              <w:instrText xml:space="preserve"> PAGEREF _Toc211862591 \h </w:instrText>
+              <w:instrText xml:space="preserve"> PAGEREF _Toc234233365 \h </w:instrText>
             </w:r>
             <w:r>
               <w:rPr>
@@ -2789,7 +3032,7 @@
                 <w:noProof/>
                 <w:webHidden/>
               </w:rPr>
-              <w:t>4</w:t>
+              <w:t>5</w:t>
             </w:r>
             <w:r>
               <w:rPr>
@@ -2813,7 +3056,7 @@
               <w14:ligatures w14:val="standardContextual"/>
             </w:rPr>
           </w:pPr>
-          <w:hyperlink w:anchor="_Toc211862592" w:history="1">
+          <w:hyperlink w:anchor="_Toc234233366" w:history="1">
             <w:r>
               <w:rPr>
                 <w:rStyle w:val="Hyperlink"/>
@@ -2859,7 +3102,7 @@
                 <w:noProof/>
                 <w:webHidden/>
               </w:rPr>
-              <w:instrText xml:space="preserve"> PAGEREF _Toc211862592 \h </w:instrText>
+              <w:instrText xml:space="preserve"> PAGEREF _Toc234233366 \h </w:instrText>
             </w:r>
             <w:r>
               <w:rPr>
@@ -2879,7 +3122,7 @@
                 <w:noProof/>
                 <w:webHidden/>
               </w:rPr>
-              <w:t>5</w:t>
+              <w:t>6</w:t>
             </w:r>
             <w:r>
               <w:rPr>
@@ -2903,7 +3146,7 @@
               <w14:ligatures w14:val="standardContextual"/>
             </w:rPr>
           </w:pPr>
-          <w:hyperlink w:anchor="_Toc211862593" w:history="1">
+          <w:hyperlink w:anchor="_Toc234233367" w:history="1">
             <w:r>
               <w:rPr>
                 <w:rStyle w:val="Hyperlink"/>
@@ -2949,7 +3192,7 @@
                 <w:noProof/>
                 <w:webHidden/>
               </w:rPr>
-              <w:instrText xml:space="preserve"> PAGEREF _Toc211862593 \h </w:instrText>
+              <w:instrText xml:space="preserve"> PAGEREF _Toc234233367 \h </w:instrText>
             </w:r>
             <w:r>
               <w:rPr>
@@ -2969,7 +3212,7 @@
                 <w:noProof/>
                 <w:webHidden/>
               </w:rPr>
-              <w:t>6</w:t>
+              <w:t>7</w:t>
             </w:r>
             <w:r>
               <w:rPr>
@@ -2993,7 +3236,7 @@
               <w14:ligatures w14:val="standardContextual"/>
             </w:rPr>
           </w:pPr>
-          <w:hyperlink w:anchor="_Toc211862594" w:history="1">
+          <w:hyperlink w:anchor="_Toc234233368" w:history="1">
             <w:r>
               <w:rPr>
                 <w:rStyle w:val="Hyperlink"/>
@@ -3039,7 +3282,7 @@
                 <w:noProof/>
                 <w:webHidden/>
               </w:rPr>
-              <w:instrText xml:space="preserve"> PAGEREF _Toc211862594 \h </w:instrText>
+              <w:instrText xml:space="preserve"> PAGEREF _Toc234233368 \h </w:instrText>
             </w:r>
             <w:r>
               <w:rPr>
@@ -3059,7 +3302,7 @@
                 <w:noProof/>
                 <w:webHidden/>
               </w:rPr>
-              <w:t>7</w:t>
+              <w:t>8</w:t>
             </w:r>
             <w:r>
               <w:rPr>
@@ -3083,7 +3326,7 @@
               <w14:ligatures w14:val="standardContextual"/>
             </w:rPr>
           </w:pPr>
-          <w:hyperlink w:anchor="_Toc211862595" w:history="1">
+          <w:hyperlink w:anchor="_Toc234233369" w:history="1">
             <w:r>
               <w:rPr>
                 <w:rStyle w:val="Hyperlink"/>
@@ -3129,7 +3372,7 @@
                 <w:noProof/>
                 <w:webHidden/>
               </w:rPr>
-              <w:instrText xml:space="preserve"> PAGEREF _Toc211862595 \h </w:instrText>
+              <w:instrText xml:space="preserve"> PAGEREF _Toc234233369 \h </w:instrText>
             </w:r>
             <w:r>
               <w:rPr>
@@ -3149,7 +3392,7 @@
                 <w:noProof/>
                 <w:webHidden/>
               </w:rPr>
-              <w:t>7</w:t>
+              <w:t>8</w:t>
             </w:r>
             <w:r>
               <w:rPr>
@@ -3173,7 +3416,7 @@
               <w14:ligatures w14:val="standardContextual"/>
             </w:rPr>
           </w:pPr>
-          <w:hyperlink w:anchor="_Toc211862596" w:history="1">
+          <w:hyperlink w:anchor="_Toc234233370" w:history="1">
             <w:r>
               <w:rPr>
                 <w:rStyle w:val="Hyperlink"/>
@@ -3219,7 +3462,7 @@
                 <w:noProof/>
                 <w:webHidden/>
               </w:rPr>
-              <w:instrText xml:space="preserve"> PAGEREF _Toc211862596 \h </w:instrText>
+              <w:instrText xml:space="preserve"> PAGEREF _Toc234233370 \h </w:instrText>
             </w:r>
             <w:r>
               <w:rPr>
@@ -3239,7 +3482,7 @@
                 <w:noProof/>
                 <w:webHidden/>
               </w:rPr>
-              <w:t>8</w:t>
+              <w:t>9</w:t>
             </w:r>
             <w:r>
               <w:rPr>
@@ -3263,7 +3506,7 @@
               <w14:ligatures w14:val="standardContextual"/>
             </w:rPr>
           </w:pPr>
-          <w:hyperlink w:anchor="_Toc211862597" w:history="1">
+          <w:hyperlink w:anchor="_Toc234233371" w:history="1">
             <w:r>
               <w:rPr>
                 <w:rStyle w:val="Hyperlink"/>
@@ -3311,7 +3554,7 @@
                 <w:noProof/>
                 <w:webHidden/>
               </w:rPr>
-              <w:instrText xml:space="preserve"> PAGEREF _Toc211862597 \h </w:instrText>
+              <w:instrText xml:space="preserve"> PAGEREF _Toc234233371 \h </w:instrText>
             </w:r>
             <w:r>
               <w:rPr>
@@ -3331,7 +3574,7 @@
                 <w:noProof/>
                 <w:webHidden/>
               </w:rPr>
-              <w:t>9</w:t>
+              <w:t>10</w:t>
             </w:r>
             <w:r>
               <w:rPr>
@@ -3355,7 +3598,7 @@
               <w14:ligatures w14:val="standardContextual"/>
             </w:rPr>
           </w:pPr>
-          <w:hyperlink w:anchor="_Toc211862598" w:history="1">
+          <w:hyperlink w:anchor="_Toc234233372" w:history="1">
             <w:r>
               <w:rPr>
                 <w:rStyle w:val="Hyperlink"/>
@@ -3401,7 +3644,7 @@
                 <w:noProof/>
                 <w:webHidden/>
               </w:rPr>
-              <w:instrText xml:space="preserve"> PAGEREF _Toc211862598 \h </w:instrText>
+              <w:instrText xml:space="preserve"> PAGEREF _Toc234233372 \h </w:instrText>
             </w:r>
             <w:r>
               <w:rPr>
@@ -3421,7 +3664,7 @@
                 <w:noProof/>
                 <w:webHidden/>
               </w:rPr>
-              <w:t>9</w:t>
+              <w:t>10</w:t>
             </w:r>
             <w:r>
               <w:rPr>
@@ -3445,7 +3688,7 @@
               <w14:ligatures w14:val="standardContextual"/>
             </w:rPr>
           </w:pPr>
-          <w:hyperlink w:anchor="_Toc211862599" w:history="1">
+          <w:hyperlink w:anchor="_Toc234233373" w:history="1">
             <w:r>
               <w:rPr>
                 <w:rStyle w:val="Hyperlink"/>
@@ -3493,7 +3736,7 @@
                 <w:noProof/>
                 <w:webHidden/>
               </w:rPr>
-              <w:instrText xml:space="preserve"> PAGEREF _Toc211862599 \h </w:instrText>
+              <w:instrText xml:space="preserve"> PAGEREF _Toc234233373 \h </w:instrText>
             </w:r>
             <w:r>
               <w:rPr>
@@ -3513,7 +3756,7 @@
                 <w:noProof/>
                 <w:webHidden/>
               </w:rPr>
-              <w:t>9</w:t>
+              <w:t>10</w:t>
             </w:r>
             <w:r>
               <w:rPr>
@@ -3537,7 +3780,7 @@
               <w14:ligatures w14:val="standardContextual"/>
             </w:rPr>
           </w:pPr>
-          <w:hyperlink w:anchor="_Toc211862600" w:history="1">
+          <w:hyperlink w:anchor="_Toc234233374" w:history="1">
             <w:r>
               <w:rPr>
                 <w:rStyle w:val="Hyperlink"/>
@@ -3583,7 +3826,7 @@
                 <w:noProof/>
                 <w:webHidden/>
               </w:rPr>
-              <w:instrText xml:space="preserve"> PAGEREF _Toc211862600 \h </w:instrText>
+              <w:instrText xml:space="preserve"> PAGEREF _Toc234233374 \h </w:instrText>
             </w:r>
             <w:r>
               <w:rPr>
@@ -3603,7 +3846,7 @@
                 <w:noProof/>
                 <w:webHidden/>
               </w:rPr>
-              <w:t>9</w:t>
+              <w:t>10</w:t>
             </w:r>
             <w:r>
               <w:rPr>
@@ -3627,7 +3870,7 @@
               <w14:ligatures w14:val="standardContextual"/>
             </w:rPr>
           </w:pPr>
-          <w:hyperlink w:anchor="_Toc211862601" w:history="1">
+          <w:hyperlink w:anchor="_Toc234233375" w:history="1">
             <w:r>
               <w:rPr>
                 <w:rStyle w:val="Hyperlink"/>
@@ -3673,7 +3916,7 @@
                 <w:noProof/>
                 <w:webHidden/>
               </w:rPr>
-              <w:instrText xml:space="preserve"> PAGEREF _Toc211862601 \h </w:instrText>
+              <w:instrText xml:space="preserve"> PAGEREF _Toc234233375 \h </w:instrText>
             </w:r>
             <w:r>
               <w:rPr>
@@ -3693,7 +3936,7 @@
                 <w:noProof/>
                 <w:webHidden/>
               </w:rPr>
-              <w:t>10</w:t>
+              <w:t>11</w:t>
             </w:r>
             <w:r>
               <w:rPr>
@@ -3717,7 +3960,7 @@
               <w14:ligatures w14:val="standardContextual"/>
             </w:rPr>
           </w:pPr>
-          <w:hyperlink w:anchor="_Toc211862602" w:history="1">
+          <w:hyperlink w:anchor="_Toc234233376" w:history="1">
             <w:r>
               <w:rPr>
                 <w:rStyle w:val="Hyperlink"/>
@@ -3765,7 +4008,7 @@
                 <w:noProof/>
                 <w:webHidden/>
               </w:rPr>
-              <w:instrText xml:space="preserve"> PAGEREF _Toc211862602 \h </w:instrText>
+              <w:instrText xml:space="preserve"> PAGEREF _Toc234233376 \h </w:instrText>
             </w:r>
             <w:r>
               <w:rPr>
@@ -3785,7 +4028,7 @@
                 <w:noProof/>
                 <w:webHidden/>
               </w:rPr>
-              <w:t>10</w:t>
+              <w:t>11</w:t>
             </w:r>
             <w:r>
               <w:rPr>
@@ -3809,11 +4052,12 @@
               <w14:ligatures w14:val="standardContextual"/>
             </w:rPr>
           </w:pPr>
-          <w:hyperlink w:anchor="_Toc211862603" w:history="1">
+          <w:hyperlink w:anchor="_Toc234233377" w:history="1">
             <w:r>
               <w:rPr>
                 <w:rStyle w:val="Hyperlink"/>
                 <w:noProof/>
+                <w:lang w:val="en-US"/>
               </w:rPr>
               <w:t>3.2.</w:t>
             </w:r>
@@ -3833,6 +4077,7 @@
               <w:rPr>
                 <w:rStyle w:val="Hyperlink"/>
                 <w:noProof/>
+                <w:lang w:val="en-US"/>
               </w:rPr>
               <w:t>Test of general technical requirements</w:t>
             </w:r>
@@ -3855,7 +4100,7 @@
                 <w:noProof/>
                 <w:webHidden/>
               </w:rPr>
-              <w:instrText xml:space="preserve"> PAGEREF _Toc211862603 \h </w:instrText>
+              <w:instrText xml:space="preserve"> PAGEREF _Toc234233377 \h </w:instrText>
             </w:r>
             <w:r>
               <w:rPr>
@@ -3875,7 +4120,7 @@
                 <w:noProof/>
                 <w:webHidden/>
               </w:rPr>
-              <w:t>17</w:t>
+              <w:t>18</w:t>
             </w:r>
             <w:r>
               <w:rPr>
@@ -3891,13 +4136,13 @@
             <w:fldChar w:fldCharType="end"/>
           </w:r>
         </w:p>
+        <w:p>
+          <w:r>
+            <w:br w:type="page"/>
+          </w:r>
+        </w:p>
       </w:sdtContent>
     </w:sdt>
-    <w:p>
-      <w:r>
-        <w:br w:type="page"/>
-      </w:r>
-    </w:p>
     <w:p>
       <w:pPr>
         <w:pStyle w:val="Overskrift1"/>
@@ -3906,7 +4151,8 @@
           <w:numId w:val="27"/>
         </w:numPr>
       </w:pPr>
-      <w:bookmarkStart w:id="0" w:name="_Toc211862589"/>
+      <w:bookmarkStart w:id="0" w:name="_Ref231976861"/>
+      <w:bookmarkStart w:id="1" w:name="_Toc234233363"/>
       <w:r>
         <w:lastRenderedPageBreak/>
         <w:t>In</w:t>
@@ -3915,6 +4161,7 @@
         <w:t>troduction</w:t>
       </w:r>
       <w:bookmarkEnd w:id="0"/>
+      <w:bookmarkEnd w:id="1"/>
     </w:p>
     <w:p>
       <w:pPr>
@@ -4064,11 +4311,11 @@
           <w:numId w:val="28"/>
         </w:numPr>
       </w:pPr>
-      <w:bookmarkStart w:id="1" w:name="_Toc211862590"/>
+      <w:bookmarkStart w:id="2" w:name="_Toc234233364"/>
       <w:r>
         <w:t>Purpose</w:t>
       </w:r>
-      <w:bookmarkEnd w:id="1"/>
+      <w:bookmarkEnd w:id="2"/>
     </w:p>
     <w:p>
       <w:pPr>
@@ -4091,11 +4338,11 @@
           <w:numId w:val="28"/>
         </w:numPr>
       </w:pPr>
-      <w:bookmarkStart w:id="2" w:name="_Toc211862591"/>
+      <w:bookmarkStart w:id="3" w:name="_Toc234233365"/>
       <w:r>
         <w:t>Prerequisites for live test</w:t>
       </w:r>
-      <w:bookmarkEnd w:id="2"/>
+      <w:bookmarkEnd w:id="3"/>
     </w:p>
     <w:p>
       <w:pPr>
@@ -4399,7 +4646,7 @@
           <w:numId w:val="28"/>
         </w:numPr>
       </w:pPr>
-      <w:bookmarkStart w:id="3" w:name="_Toc211862592"/>
+      <w:bookmarkStart w:id="4" w:name="_Toc234233366"/>
       <w:r>
         <w:lastRenderedPageBreak/>
         <w:t>Do</w:t>
@@ -4422,7 +4669,7 @@
       <w:r>
         <w:t>test</w:t>
       </w:r>
-      <w:bookmarkEnd w:id="3"/>
+      <w:bookmarkEnd w:id="4"/>
     </w:p>
     <w:p>
       <w:r>
@@ -4492,7 +4739,7 @@
                                 <w:lang w:val="en-US"/>
                               </w:rPr>
                             </w:pPr>
-                            <w:bookmarkStart w:id="4" w:name="Egentest"/>
+                            <w:bookmarkStart w:id="5" w:name="Egentest"/>
                             <w:r>
                               <w:rPr>
                                 <w:b/>
@@ -4824,7 +5071,7 @@
                               </w:rPr>
                               <w:t>.xml</w:t>
                             </w:r>
-                            <w:bookmarkEnd w:id="4"/>
+                            <w:bookmarkEnd w:id="5"/>
                           </w:p>
                         </w:txbxContent>
                       </wps:txbx>
@@ -4855,7 +5102,7 @@
                           <w:lang w:val="en-US"/>
                         </w:rPr>
                       </w:pPr>
-                      <w:bookmarkStart w:id="5" w:name="Egentest"/>
+                      <w:bookmarkStart w:id="6" w:name="Egentest"/>
                       <w:r>
                         <w:rPr>
                           <w:b/>
@@ -5187,7 +5434,7 @@
                         </w:rPr>
                         <w:t>.xml</w:t>
                       </w:r>
-                      <w:bookmarkEnd w:id="5"/>
+                      <w:bookmarkEnd w:id="6"/>
                     </w:p>
                   </w:txbxContent>
                 </v:textbox>
@@ -5214,7 +5461,7 @@
       <w:bookmarkStart w:id="6" w:name="_Testeksempler_og_testpersoner"/>
       <w:bookmarkStart w:id="7" w:name="_Background_material"/>
       <w:bookmarkStart w:id="8" w:name="_Ref156468514"/>
-      <w:bookmarkStart w:id="9" w:name="_Toc211862593"/>
+      <w:bookmarkStart w:id="9" w:name="_Toc234233367"/>
       <w:bookmarkEnd w:id="6"/>
       <w:bookmarkEnd w:id="7"/>
       <w:r>
@@ -5824,7 +6071,7 @@
         </w:numPr>
       </w:pPr>
       <w:bookmarkStart w:id="10" w:name="_Testeksempler_og_testpersoner_1"/>
-      <w:bookmarkStart w:id="11" w:name="_Toc211862594"/>
+      <w:bookmarkStart w:id="11" w:name="_Toc234233368"/>
       <w:bookmarkEnd w:id="10"/>
       <w:r>
         <w:t>Test</w:t>
@@ -5980,16 +6227,16 @@
             <w:pPr>
               <w:keepNext/>
             </w:pPr>
-            <w:hyperlink r:id="rId19">
+            <w:hyperlink r:id="rId19" w:anchor="2-test-and-certification">
               <w:r>
                 <w:rPr>
                   <w:rStyle w:val="Hyperlink"/>
                 </w:rPr>
-                <w:t>https://medcomfhir.dk/ig/carecommunicationtestscripts/testexamples.html</w:t>
+                <w:t>https://medcomdk.github.io/dk-medcom-carecommunication/#2-test-and-certification</w:t>
               </w:r>
             </w:hyperlink>
             <w:r>
-              <w:t xml:space="preserve">   </w:t>
+              <w:t xml:space="preserve"> </w:t>
             </w:r>
           </w:p>
         </w:tc>
@@ -6150,7 +6397,7 @@
           <w:numId w:val="28"/>
         </w:numPr>
       </w:pPr>
-      <w:bookmarkStart w:id="12" w:name="_Toc211862595"/>
+      <w:bookmarkStart w:id="12" w:name="_Toc234233369"/>
       <w:r>
         <w:t>Test</w:t>
       </w:r>
@@ -6249,6 +6496,7 @@
           <w:p>
             <w:pPr>
               <w:rPr>
+                <w:rFonts w:ascii="Calibri" w:eastAsia="Calibri" w:hAnsi="Calibri" w:cs="Calibri"/>
                 <w:sz w:val="21"/>
                 <w:szCs w:val="21"/>
                 <w:lang w:val="en-US"/>
@@ -6256,28 +6504,23 @@
             </w:pPr>
             <w:r>
               <w:rPr>
+                <w:rFonts w:ascii="Calibri" w:eastAsia="Calibri" w:hAnsi="Calibri" w:cs="Calibri"/>
+                <w:color w:val="000000" w:themeColor="text1"/>
                 <w:sz w:val="21"/>
                 <w:szCs w:val="21"/>
-                <w:lang w:val="en-US"/>
-              </w:rPr>
-              <w:t>FHIR</w:t>
-            </w:r>
-            <w:r>
+                <w:lang w:val="en-GB"/>
+              </w:rPr>
+              <w:t>Interoperability Test Bed (ITB)</w:t>
+            </w:r>
+          </w:p>
+          <w:p>
+            <w:pPr>
               <w:rPr>
                 <w:sz w:val="21"/>
                 <w:szCs w:val="21"/>
                 <w:lang w:val="en-US"/>
               </w:rPr>
-              <w:t xml:space="preserve"> </w:t>
-            </w:r>
-            <w:r>
-              <w:rPr>
-                <w:sz w:val="21"/>
-                <w:szCs w:val="21"/>
-                <w:lang w:val="en-US"/>
-              </w:rPr>
-              <w:t>server with MedCom profiles</w:t>
-            </w:r>
+            </w:pPr>
           </w:p>
         </w:tc>
         <w:tc>
@@ -6287,8 +6530,6 @@
           <w:p>
             <w:pPr>
               <w:rPr>
-                <w:sz w:val="21"/>
-                <w:szCs w:val="21"/>
                 <w:lang w:val="en-US"/>
               </w:rPr>
             </w:pPr>
@@ -6296,24 +6537,34 @@
               <w:r>
                 <w:rPr>
                   <w:rStyle w:val="Hyperlink"/>
-                  <w:lang w:val="en-US"/>
+                  <w:lang w:val="en-GB"/>
                 </w:rPr>
-                <w:t>https://fhir.medcom.dk/fhir/swagger-ui/</w:t>
+                <w:t>https://test.itb.medcom.dk/</w:t>
               </w:r>
             </w:hyperlink>
             <w:r>
               <w:rPr>
-                <w:lang w:val="en-US"/>
+                <w:rFonts w:ascii="Calibri" w:eastAsia="Calibri" w:hAnsi="Calibri" w:cs="Calibri"/>
+                <w:color w:val="000000" w:themeColor="text1"/>
+                <w:lang w:val="en-GB"/>
               </w:rPr>
               <w:t xml:space="preserve"> </w:t>
             </w:r>
             <w:r>
               <w:rPr>
+                <w:rFonts w:ascii="Calibri" w:eastAsia="Calibri" w:hAnsi="Calibri" w:cs="Calibri"/>
                 <w:lang w:val="en-US"/>
               </w:rPr>
               <w:t xml:space="preserve"> </w:t>
             </w:r>
           </w:p>
+          <w:p>
+            <w:pPr>
+              <w:rPr>
+                <w:lang w:val="en-US"/>
+              </w:rPr>
+            </w:pPr>
+          </w:p>
         </w:tc>
         <w:tc>
           <w:tcPr>
@@ -6322,6 +6573,76 @@
           <w:p>
             <w:pPr>
               <w:rPr>
+                <w:rFonts w:ascii="Calibri" w:eastAsia="Calibri" w:hAnsi="Calibri" w:cs="Calibri"/>
+                <w:color w:val="000000" w:themeColor="text1"/>
+                <w:lang w:val="en-US"/>
+              </w:rPr>
+            </w:pPr>
+            <w:r>
+              <w:rPr>
+                <w:rFonts w:ascii="Calibri" w:eastAsia="Calibri" w:hAnsi="Calibri" w:cs="Calibri"/>
+                <w:color w:val="000000" w:themeColor="text1"/>
+                <w:lang w:val="en-US"/>
+              </w:rPr>
+              <w:t xml:space="preserve">Test tool for testing the FHIR standard. </w:t>
+            </w:r>
+          </w:p>
+          <w:p>
+            <w:pPr>
+              <w:rPr>
+                <w:rFonts w:ascii="Calibri" w:eastAsia="Calibri" w:hAnsi="Calibri" w:cs="Calibri"/>
+                <w:color w:val="000000" w:themeColor="text1"/>
+                <w:lang w:val="en-US"/>
+              </w:rPr>
+            </w:pPr>
+          </w:p>
+          <w:p>
+            <w:pPr>
+              <w:rPr>
+                <w:rFonts w:ascii="Calibri" w:eastAsia="Calibri" w:hAnsi="Calibri" w:cs="Calibri"/>
+                <w:color w:val="000000" w:themeColor="text1"/>
+                <w:lang w:val="en-US"/>
+              </w:rPr>
+            </w:pPr>
+            <w:r>
+              <w:rPr>
+                <w:rFonts w:ascii="Calibri" w:eastAsia="Calibri" w:hAnsi="Calibri" w:cs="Calibri"/>
+                <w:color w:val="000000" w:themeColor="text1"/>
+                <w:lang w:val="en-US"/>
+              </w:rPr>
+              <w:t xml:space="preserve">The vendor can get access to ITB as an </w:t>
+            </w:r>
+            <w:r>
+              <w:rPr>
+                <w:rFonts w:ascii="Calibri" w:eastAsia="Calibri" w:hAnsi="Calibri" w:cs="Calibri"/>
+                <w:color w:val="000000" w:themeColor="text1"/>
+                <w:lang w:val="en-GB"/>
+              </w:rPr>
+              <w:t>organisation and assign test suites to themselves</w:t>
+            </w:r>
+            <w:r>
+              <w:rPr>
+                <w:rFonts w:ascii="Calibri" w:eastAsia="Calibri" w:hAnsi="Calibri" w:cs="Calibri"/>
+                <w:color w:val="000000" w:themeColor="text1"/>
+                <w:lang w:val="en-US"/>
+              </w:rPr>
+              <w:t>.</w:t>
+            </w:r>
+          </w:p>
+          <w:p>
+            <w:pPr>
+              <w:rPr>
+                <w:rFonts w:ascii="Calibri" w:eastAsia="Calibri" w:hAnsi="Calibri" w:cs="Calibri"/>
+                <w:color w:val="000000" w:themeColor="text1"/>
+                <w:lang w:val="en-US"/>
+              </w:rPr>
+            </w:pPr>
+          </w:p>
+          <w:p>
+            <w:pPr>
+              <w:rPr>
+                <w:rFonts w:ascii="Calibri" w:eastAsia="Calibri" w:hAnsi="Calibri" w:cs="Calibri"/>
+                <w:color w:val="000000" w:themeColor="text1"/>
                 <w:sz w:val="21"/>
                 <w:szCs w:val="21"/>
                 <w:lang w:val="en-US"/>
@@ -6329,72 +6650,21 @@
             </w:pPr>
             <w:r>
               <w:rPr>
-                <w:sz w:val="21"/>
-                <w:szCs w:val="21"/>
-                <w:lang w:val="en-US"/>
-              </w:rPr>
-              <w:t>Public server that validates against MedCom's FHIR profiles. It is permitted to use the server for testing the upload/download of FHIR resources.</w:t>
-            </w:r>
-          </w:p>
-          <w:p>
-            <w:pPr>
-              <w:rPr>
-                <w:sz w:val="21"/>
-                <w:szCs w:val="21"/>
-                <w:lang w:val="en-US"/>
-              </w:rPr>
-            </w:pPr>
-          </w:p>
-          <w:p>
-            <w:pPr>
-              <w:rPr>
-                <w:sz w:val="21"/>
-                <w:szCs w:val="21"/>
-                <w:lang w:val="en-US"/>
-              </w:rPr>
-            </w:pPr>
-            <w:r>
-              <w:rPr>
-                <w:sz w:val="21"/>
-                <w:szCs w:val="21"/>
-                <w:lang w:val="en-US"/>
-              </w:rPr>
-              <w:t xml:space="preserve">Vendors can get access by </w:t>
-            </w:r>
-            <w:r>
-              <w:rPr>
-                <w:sz w:val="21"/>
-                <w:szCs w:val="21"/>
-                <w:lang w:val="en-US"/>
-              </w:rPr>
-              <w:t>inqu</w:t>
-            </w:r>
-            <w:r>
-              <w:rPr>
-                <w:sz w:val="21"/>
-                <w:szCs w:val="21"/>
-                <w:lang w:val="en-US"/>
-              </w:rPr>
-              <w:t xml:space="preserve">iry this at </w:t>
+                <w:rFonts w:ascii="Calibri" w:eastAsia="Calibri" w:hAnsi="Calibri" w:cs="Calibri"/>
+                <w:color w:val="000000" w:themeColor="text1"/>
+                <w:lang w:val="en-GB"/>
+              </w:rPr>
+              <w:t xml:space="preserve">Find </w:t>
             </w:r>
             <w:hyperlink r:id="rId22">
               <w:r>
                 <w:rPr>
                   <w:rStyle w:val="Hyperlink"/>
-                  <w:rFonts w:ascii="Calibri" w:hAnsi="Calibri"/>
-                  <w:lang w:val="en-US"/>
+                  <w:lang w:val="en-GB"/>
                 </w:rPr>
-                <w:t>fhir@medcom.dk</w:t>
+                <w:t>instructions for ITB here.</w:t>
               </w:r>
             </w:hyperlink>
-            <w:r>
-              <w:rPr>
-                <w:rStyle w:val="Hyperlink"/>
-                <w:rFonts w:ascii="Calibri" w:hAnsi="Calibri"/>
-                <w:lang w:val="en-US"/>
-              </w:rPr>
-              <w:t>.</w:t>
-            </w:r>
           </w:p>
         </w:tc>
       </w:tr>
@@ -6431,7 +6701,7 @@
           <w:numId w:val="28"/>
         </w:numPr>
       </w:pPr>
-      <w:bookmarkStart w:id="13" w:name="_Toc211862596"/>
+      <w:bookmarkStart w:id="13" w:name="_Toc234233370"/>
       <w:r>
         <w:lastRenderedPageBreak/>
         <w:t>T</w:t>
@@ -6929,7 +7199,7 @@
           <w:lang w:val="en-US"/>
         </w:rPr>
       </w:pPr>
-      <w:bookmarkStart w:id="14" w:name="_Toc211862597"/>
+      <w:bookmarkStart w:id="14" w:name="_Toc234233371"/>
       <w:bookmarkStart w:id="15" w:name="_Toc130815583"/>
       <w:r>
         <w:rPr>
@@ -6960,7 +7230,7 @@
           <w:numId w:val="32"/>
         </w:numPr>
       </w:pPr>
-      <w:bookmarkStart w:id="16" w:name="_Toc211862598"/>
+      <w:bookmarkStart w:id="16" w:name="_Toc234233372"/>
       <w:bookmarkEnd w:id="15"/>
       <w:r>
         <w:t>Information about the vendor</w:t>
@@ -7266,7 +7536,7 @@
       </w:pPr>
       <w:bookmarkStart w:id="17" w:name="_Toc110845739"/>
       <w:bookmarkStart w:id="18" w:name="_Toc130815585"/>
-      <w:bookmarkStart w:id="19" w:name="_Toc211862599"/>
+      <w:bookmarkStart w:id="19" w:name="_Toc234233373"/>
       <w:r>
         <w:rPr>
           <w:lang w:val="en-US"/>
@@ -7570,7 +7840,7 @@
       </w:pPr>
       <w:bookmarkStart w:id="20" w:name="_Toc110845740"/>
       <w:bookmarkStart w:id="21" w:name="_Toc130815586"/>
-      <w:bookmarkStart w:id="22" w:name="_Toc211862600"/>
+      <w:bookmarkStart w:id="22" w:name="_Toc234233374"/>
       <w:r>
         <w:t xml:space="preserve">Information about test </w:t>
       </w:r>
@@ -7918,7 +8188,7 @@
         </w:rPr>
       </w:pPr>
       <w:bookmarkStart w:id="23" w:name="_Toc130815587"/>
-      <w:bookmarkStart w:id="24" w:name="_Toc211862601"/>
+      <w:bookmarkStart w:id="24" w:name="_Toc234233375"/>
       <w:r>
         <w:rPr>
           <w:color w:val="152F4A"/>
@@ -8037,7 +8307,7 @@
         </w:rPr>
       </w:pPr>
       <w:bookmarkStart w:id="25" w:name="_Toc130815590"/>
-      <w:bookmarkStart w:id="26" w:name="_Toc211862602"/>
+      <w:bookmarkStart w:id="26" w:name="_Toc234233376"/>
       <w:r>
         <w:rPr>
           <w:color w:val="152F4A"/>
@@ -13015,39 +13285,7 @@
                 <w:szCs w:val="20"/>
                 <w:lang w:val="en-US"/>
               </w:rPr>
-              <w:t xml:space="preserve">sender </w:t>
-            </w:r>
-            <w:r>
-              <w:rPr>
-                <w:sz w:val="20"/>
-                <w:szCs w:val="20"/>
-                <w:lang w:val="en-US"/>
-              </w:rPr>
-              <w:t xml:space="preserve">(signature) </w:t>
-            </w:r>
-            <w:r>
-              <w:rPr>
-                <w:sz w:val="20"/>
-                <w:szCs w:val="20"/>
-                <w:lang w:val="en-US"/>
-              </w:rPr>
-              <w:t xml:space="preserve">and sender organization </w:t>
-            </w:r>
-            <w:r>
-              <w:rPr>
-                <w:sz w:val="20"/>
-                <w:szCs w:val="20"/>
-                <w:lang w:val="en-US"/>
-              </w:rPr>
-              <w:t xml:space="preserve">that matches </w:t>
-            </w:r>
-            <w:r>
-              <w:rPr>
-                <w:sz w:val="20"/>
-                <w:szCs w:val="20"/>
-                <w:lang w:val="en-US"/>
-              </w:rPr>
-              <w:t>each</w:t>
+              <w:t>sender</w:t>
             </w:r>
             <w:r>
               <w:rPr>
@@ -13063,51 +13301,199 @@
                 <w:szCs w:val="20"/>
                 <w:lang w:val="en-US"/>
               </w:rPr>
+              <w:t xml:space="preserve">signature </w:t>
+            </w:r>
+            <w:r>
+              <w:rPr>
+                <w:sz w:val="20"/>
+                <w:szCs w:val="20"/>
+                <w:lang w:val="en-US"/>
+              </w:rPr>
+              <w:t xml:space="preserve">and sender organization that </w:t>
+            </w:r>
+            <w:r>
+              <w:rPr>
+                <w:sz w:val="20"/>
+                <w:szCs w:val="20"/>
+                <w:lang w:val="en-US"/>
+              </w:rPr>
               <w:lastRenderedPageBreak/>
-              <w:t>individual message segment</w:t>
-            </w:r>
-            <w:r>
-              <w:rPr>
-                <w:sz w:val="20"/>
-                <w:szCs w:val="20"/>
-                <w:lang w:val="en-US"/>
-              </w:rPr>
-              <w:t xml:space="preserve"> in the message thread</w:t>
-            </w:r>
-            <w:r>
-              <w:rPr>
-                <w:sz w:val="20"/>
-                <w:szCs w:val="20"/>
-                <w:lang w:val="en-US"/>
-              </w:rPr>
-              <w:t xml:space="preserve">. </w:t>
-            </w:r>
-          </w:p>
-        </w:tc>
-        <w:tc>
-          <w:tcPr>
-            <w:tcW w:w="2126" w:type="dxa"/>
-          </w:tcPr>
-          <w:p>
-            <w:pPr>
-              <w:rPr>
-                <w:color w:val="3B3838" w:themeColor="background2" w:themeShade="40"/>
-                <w:sz w:val="20"/>
-                <w:szCs w:val="20"/>
-                <w:lang w:val="en-US"/>
-              </w:rPr>
-            </w:pPr>
-          </w:p>
-        </w:tc>
-        <w:tc>
-          <w:tcPr>
-            <w:tcW w:w="2977" w:type="dxa"/>
-          </w:tcPr>
+              <w:t>matches each individual message segment in the message thread.</w:t>
+            </w:r>
+          </w:p>
           <w:p>
             <w:pPr>
               <w:keepNext/>
               <w:spacing w:before="60" w:after="120"/>
               <w:rPr>
+                <w:lang w:val="en-US"/>
+              </w:rPr>
+            </w:pPr>
+            <w:r>
+              <w:rPr>
+                <w:sz w:val="20"/>
+                <w:szCs w:val="20"/>
+                <w:lang w:val="en-US"/>
+              </w:rPr>
+              <w:t xml:space="preserve">The </w:t>
+            </w:r>
+            <w:r>
+              <w:rPr>
+                <w:sz w:val="20"/>
+                <w:szCs w:val="20"/>
+                <w:lang w:val="en-US"/>
+              </w:rPr>
+              <w:t>sender</w:t>
+            </w:r>
+            <w:r>
+              <w:rPr>
+                <w:sz w:val="20"/>
+                <w:szCs w:val="20"/>
+                <w:lang w:val="en-US"/>
+              </w:rPr>
+              <w:t xml:space="preserve"> </w:t>
+            </w:r>
+            <w:r>
+              <w:rPr>
+                <w:sz w:val="20"/>
+                <w:szCs w:val="20"/>
+                <w:lang w:val="en-US"/>
+              </w:rPr>
+              <w:t xml:space="preserve">signature </w:t>
+            </w:r>
+            <w:r>
+              <w:rPr>
+                <w:sz w:val="20"/>
+                <w:szCs w:val="20"/>
+                <w:lang w:val="en-US"/>
+              </w:rPr>
+              <w:t xml:space="preserve">MUST be </w:t>
+            </w:r>
+            <w:r>
+              <w:rPr>
+                <w:sz w:val="20"/>
+                <w:szCs w:val="20"/>
+                <w:lang w:val="en-US"/>
+              </w:rPr>
+              <w:t>derived</w:t>
+            </w:r>
+            <w:r>
+              <w:rPr>
+                <w:sz w:val="20"/>
+                <w:szCs w:val="20"/>
+                <w:lang w:val="en-US"/>
+              </w:rPr>
+              <w:t xml:space="preserve"> from the </w:t>
+            </w:r>
+            <w:r>
+              <w:rPr>
+                <w:sz w:val="20"/>
+                <w:szCs w:val="20"/>
+                <w:lang w:val="en-US"/>
+              </w:rPr>
+              <w:t xml:space="preserve">individual </w:t>
+            </w:r>
+            <w:r>
+              <w:rPr>
+                <w:sz w:val="20"/>
+                <w:szCs w:val="20"/>
+                <w:lang w:val="en-US"/>
+              </w:rPr>
+              <w:t>payload’s PractitionerRole reference in the medcom-core-practitioner-extension.</w:t>
+            </w:r>
+          </w:p>
+          <w:p>
+            <w:pPr>
+              <w:keepNext/>
+              <w:spacing w:before="60" w:after="120"/>
+              <w:rPr>
+                <w:sz w:val="20"/>
+                <w:szCs w:val="20"/>
+                <w:lang w:val="en-US"/>
+              </w:rPr>
+            </w:pPr>
+            <w:r>
+              <w:rPr>
+                <w:sz w:val="20"/>
+                <w:szCs w:val="20"/>
+                <w:lang w:val="en-US"/>
+              </w:rPr>
+              <w:t xml:space="preserve">The sender organization MUST be </w:t>
+            </w:r>
+            <w:r>
+              <w:rPr>
+                <w:sz w:val="20"/>
+                <w:szCs w:val="20"/>
+                <w:lang w:val="en-US"/>
+              </w:rPr>
+              <w:t>derived</w:t>
+            </w:r>
+            <w:r>
+              <w:rPr>
+                <w:sz w:val="20"/>
+                <w:szCs w:val="20"/>
+                <w:lang w:val="en-US"/>
+              </w:rPr>
+              <w:t xml:space="preserve"> from the </w:t>
+            </w:r>
+            <w:r>
+              <w:rPr>
+                <w:sz w:val="20"/>
+                <w:szCs w:val="20"/>
+                <w:lang w:val="en-US"/>
+              </w:rPr>
+              <w:t xml:space="preserve">individual payload’s </w:t>
+            </w:r>
+            <w:r>
+              <w:rPr>
+                <w:sz w:val="20"/>
+                <w:szCs w:val="20"/>
+                <w:lang w:val="en-US"/>
+              </w:rPr>
+              <w:t xml:space="preserve">matching Provenance.agent.who reference to an </w:t>
+            </w:r>
+            <w:r>
+              <w:rPr>
+                <w:sz w:val="20"/>
+                <w:szCs w:val="20"/>
+                <w:lang w:val="en-US"/>
+              </w:rPr>
+              <w:t>organization</w:t>
+            </w:r>
+            <w:r>
+              <w:rPr>
+                <w:sz w:val="20"/>
+                <w:szCs w:val="20"/>
+                <w:lang w:val="en-US"/>
+              </w:rPr>
+              <w:t>.</w:t>
+            </w:r>
+          </w:p>
+        </w:tc>
+        <w:tc>
+          <w:tcPr>
+            <w:tcW w:w="2126" w:type="dxa"/>
+          </w:tcPr>
+          <w:p>
+            <w:pPr>
+              <w:rPr>
+                <w:color w:val="3B3838" w:themeColor="background2" w:themeShade="40"/>
+                <w:sz w:val="20"/>
+                <w:szCs w:val="20"/>
+                <w:lang w:val="en-US"/>
+              </w:rPr>
+            </w:pPr>
+          </w:p>
+        </w:tc>
+        <w:tc>
+          <w:tcPr>
+            <w:tcW w:w="2977" w:type="dxa"/>
+          </w:tcPr>
+          <w:p>
+            <w:pPr>
+              <w:keepNext/>
+              <w:spacing w:before="60" w:after="120"/>
+              <w:rPr>
                 <w:sz w:val="20"/>
                 <w:szCs w:val="20"/>
                 <w:lang w:val="en-US"/>
@@ -13128,7 +13514,31 @@
                 <w:lang w:val="en-US"/>
               </w:rPr>
               <w:lastRenderedPageBreak/>
-              <w:t xml:space="preserve">corresponding sender and sender organization. </w:t>
+              <w:t>corresponding sender</w:t>
+            </w:r>
+            <w:r>
+              <w:rPr>
+                <w:sz w:val="20"/>
+                <w:szCs w:val="20"/>
+                <w:lang w:val="en-US"/>
+              </w:rPr>
+              <w:t xml:space="preserve"> </w:t>
+            </w:r>
+            <w:r>
+              <w:rPr>
+                <w:sz w:val="20"/>
+                <w:szCs w:val="20"/>
+                <w:lang w:val="en-US"/>
+              </w:rPr>
+              <w:t>signature</w:t>
+            </w:r>
+            <w:r>
+              <w:rPr>
+                <w:sz w:val="20"/>
+                <w:szCs w:val="20"/>
+                <w:lang w:val="en-US"/>
+              </w:rPr>
+              <w:t xml:space="preserve"> and sender organization.</w:t>
             </w:r>
           </w:p>
         </w:tc>
@@ -13194,9 +13604,267 @@
           </w:p>
         </w:tc>
       </w:tr>
+      <w:tr>
+        <w:tc>
+          <w:tcPr>
+            <w:tcW w:w="901" w:type="dxa"/>
+          </w:tcPr>
+          <w:p>
+            <w:pPr>
+              <w:pStyle w:val="Listeafsnit"/>
+              <w:numPr>
+                <w:ilvl w:val="3"/>
+                <w:numId w:val="5"/>
+              </w:numPr>
+              <w:spacing w:line="240" w:lineRule="auto"/>
+              <w:rPr>
+                <w:sz w:val="20"/>
+                <w:szCs w:val="20"/>
+              </w:rPr>
+            </w:pPr>
+          </w:p>
+        </w:tc>
+        <w:tc>
+          <w:tcPr>
+            <w:tcW w:w="2922" w:type="dxa"/>
+          </w:tcPr>
+          <w:p>
+            <w:pPr>
+              <w:keepNext/>
+              <w:spacing w:before="60" w:after="120"/>
+              <w:rPr>
+                <w:sz w:val="20"/>
+                <w:szCs w:val="20"/>
+                <w:lang w:val="en-US"/>
+              </w:rPr>
+            </w:pPr>
+            <w:r>
+              <w:rPr>
+                <w:sz w:val="20"/>
+                <w:szCs w:val="20"/>
+                <w:lang w:val="en-US"/>
+              </w:rPr>
+              <w:t xml:space="preserve">Demonstrate that the </w:t>
+            </w:r>
+            <w:r>
+              <w:rPr>
+                <w:sz w:val="20"/>
+                <w:szCs w:val="20"/>
+                <w:lang w:val="en-US"/>
+              </w:rPr>
+              <w:t xml:space="preserve">receiving </w:t>
+            </w:r>
+            <w:r>
+              <w:rPr>
+                <w:sz w:val="20"/>
+                <w:szCs w:val="20"/>
+                <w:lang w:val="en-US"/>
+              </w:rPr>
+              <w:t xml:space="preserve">organization in the current correspondence between the current sender and </w:t>
+            </w:r>
+            <w:r>
+              <w:rPr>
+                <w:sz w:val="20"/>
+                <w:szCs w:val="20"/>
+                <w:lang w:val="en-US"/>
+              </w:rPr>
+              <w:t>receiver</w:t>
+            </w:r>
+            <w:r>
+              <w:rPr>
+                <w:sz w:val="20"/>
+                <w:szCs w:val="20"/>
+                <w:lang w:val="en-US"/>
+              </w:rPr>
+              <w:t xml:space="preserve"> </w:t>
+            </w:r>
+            <w:r>
+              <w:rPr>
+                <w:sz w:val="20"/>
+                <w:szCs w:val="20"/>
+                <w:lang w:val="en-US"/>
+              </w:rPr>
+              <w:t>is</w:t>
+            </w:r>
+            <w:r>
+              <w:rPr>
+                <w:sz w:val="20"/>
+                <w:szCs w:val="20"/>
+                <w:lang w:val="en-US"/>
+              </w:rPr>
+              <w:t xml:space="preserve"> clear to the user.</w:t>
+            </w:r>
+          </w:p>
+        </w:tc>
+        <w:tc>
+          <w:tcPr>
+            <w:tcW w:w="2126" w:type="dxa"/>
+          </w:tcPr>
+          <w:p>
+            <w:pPr>
+              <w:rPr>
+                <w:color w:val="3B3838" w:themeColor="background2" w:themeShade="40"/>
+                <w:sz w:val="20"/>
+                <w:szCs w:val="20"/>
+                <w:lang w:val="en-US"/>
+              </w:rPr>
+            </w:pPr>
+          </w:p>
+        </w:tc>
+        <w:tc>
+          <w:tcPr>
+            <w:tcW w:w="2977" w:type="dxa"/>
+          </w:tcPr>
+          <w:p>
+            <w:pPr>
+              <w:keepNext/>
+              <w:spacing w:before="60" w:after="120"/>
+              <w:rPr>
+                <w:sz w:val="20"/>
+                <w:szCs w:val="20"/>
+                <w:lang w:val="en-US"/>
+              </w:rPr>
+            </w:pPr>
+            <w:r>
+              <w:rPr>
+                <w:sz w:val="20"/>
+                <w:szCs w:val="20"/>
+                <w:lang w:val="en-US"/>
+              </w:rPr>
+              <w:t>T</w:t>
+            </w:r>
+            <w:r>
+              <w:rPr>
+                <w:sz w:val="20"/>
+                <w:szCs w:val="20"/>
+                <w:lang w:val="en-US"/>
+              </w:rPr>
+              <w:t xml:space="preserve">he </w:t>
+            </w:r>
+            <w:r>
+              <w:rPr>
+                <w:sz w:val="20"/>
+                <w:szCs w:val="20"/>
+                <w:lang w:val="en-US"/>
+              </w:rPr>
+              <w:t xml:space="preserve">receiving </w:t>
+            </w:r>
+            <w:r>
+              <w:rPr>
+                <w:sz w:val="20"/>
+                <w:szCs w:val="20"/>
+                <w:lang w:val="en-US"/>
+              </w:rPr>
+              <w:t xml:space="preserve">organization in the current correspondence between the current sender and </w:t>
+            </w:r>
+            <w:r>
+              <w:rPr>
+                <w:sz w:val="20"/>
+                <w:szCs w:val="20"/>
+                <w:lang w:val="en-US"/>
+              </w:rPr>
+              <w:t>receiver</w:t>
+            </w:r>
+            <w:r>
+              <w:rPr>
+                <w:sz w:val="20"/>
+                <w:szCs w:val="20"/>
+                <w:lang w:val="en-US"/>
+              </w:rPr>
+              <w:t xml:space="preserve"> </w:t>
+            </w:r>
+            <w:r>
+              <w:rPr>
+                <w:sz w:val="20"/>
+                <w:szCs w:val="20"/>
+                <w:lang w:val="en-US"/>
+              </w:rPr>
+              <w:t>is</w:t>
+            </w:r>
+            <w:r>
+              <w:rPr>
+                <w:sz w:val="20"/>
+                <w:szCs w:val="20"/>
+                <w:lang w:val="en-US"/>
+              </w:rPr>
+              <w:t xml:space="preserve"> clear to the user.</w:t>
+            </w:r>
+          </w:p>
+        </w:tc>
+        <w:tc>
+          <w:tcPr>
+            <w:tcW w:w="3513" w:type="dxa"/>
+          </w:tcPr>
+          <w:p>
+            <w:pPr>
+              <w:rPr>
+                <w:sz w:val="20"/>
+                <w:szCs w:val="20"/>
+                <w:lang w:val="en-US"/>
+              </w:rPr>
+            </w:pPr>
+          </w:p>
+        </w:tc>
+        <w:tc>
+          <w:tcPr>
+            <w:tcW w:w="1223" w:type="dxa"/>
+          </w:tcPr>
+          <w:p>
+            <w:pPr>
+              <w:rPr>
+                <w:sz w:val="20"/>
+                <w:szCs w:val="20"/>
+                <w:lang w:val="en-US"/>
+              </w:rPr>
+            </w:pPr>
+            <w:sdt>
+              <w:sdtPr>
+                <w:rPr>
+                  <w:sz w:val="20"/>
+                  <w:szCs w:val="20"/>
+                </w:rPr>
+                <w:alias w:val="MedCom vurdering"/>
+                <w:tag w:val="MedCom vurdering"/>
+                <w:id w:val="326166811"/>
+                <w:placeholder>
+                  <w:docPart w:val="04316D5D34F84F3CA200EFAAD972C321"/>
+                </w:placeholder>
+                <w:dropDownList>
+                  <w:listItem w:value="Vælg"/>
+                  <w:listItem w:displayText="F1" w:value="F1"/>
+                  <w:listItem w:displayText="F2" w:value="F2"/>
+                  <w:listItem w:displayText="F3" w:value="F3"/>
+                  <w:listItem w:displayText="F4" w:value="F4"/>
+                  <w:listItem w:displayText="OK" w:value="OK"/>
+                  <w:listItem w:displayText="Ej relevant" w:value="Ej relevant"/>
+                </w:dropDownList>
+              </w:sdtPr>
+              <w:sdtEndPr/>
+              <w:sdtContent>
+                <w:r>
+                  <w:rPr>
+                    <w:rStyle w:val="Pladsholdertekst"/>
+                    <w:sz w:val="20"/>
+                    <w:szCs w:val="20"/>
+                  </w:rPr>
+                  <w:t>Choose</w:t>
+                </w:r>
+              </w:sdtContent>
+            </w:sdt>
+          </w:p>
+        </w:tc>
+      </w:tr>
     </w:tbl>
     <w:p>
+      <w:pPr>
+        <w:rPr>
+          <w:lang w:val="en-US"/>
+        </w:rPr>
+      </w:pPr>
       <w:r>
+        <w:rPr>
+          <w:lang w:val="en-US"/>
+        </w:rPr>
         <w:br w:type="page"/>
       </w:r>
     </w:p>
@@ -13213,7 +13881,7 @@
         </w:rPr>
       </w:pPr>
       <w:bookmarkStart w:id="32" w:name="_Toc140051305"/>
-      <w:bookmarkStart w:id="33" w:name="_Toc211862603"/>
+      <w:bookmarkStart w:id="33" w:name="_Toc234233377"/>
       <w:r>
         <w:rPr>
           <w:color w:val="152F4A"/>
@@ -14395,6 +15063,316 @@
                 <w:sz w:val="20"/>
                 <w:szCs w:val="20"/>
               </w:rPr>
+              <w:t>EpisodeofCare-identifier</w:t>
+            </w:r>
+          </w:p>
+        </w:tc>
+      </w:tr>
+      <w:tr>
+        <w:tc>
+          <w:tcPr>
+            <w:tcW w:w="999" w:type="dxa"/>
+          </w:tcPr>
+          <w:p>
+            <w:pPr>
+              <w:pStyle w:val="Listeafsnit"/>
+              <w:numPr>
+                <w:ilvl w:val="3"/>
+                <w:numId w:val="5"/>
+              </w:numPr>
+              <w:spacing w:line="240" w:lineRule="auto"/>
+              <w:rPr>
+                <w:sz w:val="20"/>
+                <w:szCs w:val="20"/>
+              </w:rPr>
+            </w:pPr>
+          </w:p>
+        </w:tc>
+        <w:tc>
+          <w:tcPr>
+            <w:tcW w:w="3404" w:type="dxa"/>
+          </w:tcPr>
+          <w:p>
+            <w:pPr>
+              <w:widowControl w:val="0"/>
+              <w:rPr>
+                <w:sz w:val="20"/>
+                <w:szCs w:val="20"/>
+                <w:lang w:val="en-US"/>
+              </w:rPr>
+            </w:pPr>
+            <w:r>
+              <w:rPr>
+                <w:i/>
+                <w:sz w:val="20"/>
+                <w:szCs w:val="20"/>
+                <w:lang w:val="en-US"/>
+              </w:rPr>
+              <w:t>If relevant for the user, display the included episodeOfCare-identifier</w:t>
+            </w:r>
+            <w:r>
+              <w:rPr>
+                <w:sz w:val="20"/>
+                <w:szCs w:val="20"/>
+                <w:lang w:val="en-US"/>
+              </w:rPr>
+              <w:t>.</w:t>
+            </w:r>
+          </w:p>
+          <w:p>
+            <w:pPr>
+              <w:widowControl w:val="0"/>
+              <w:rPr>
+                <w:sz w:val="20"/>
+                <w:szCs w:val="20"/>
+                <w:lang w:val="en-US"/>
+              </w:rPr>
+            </w:pPr>
+          </w:p>
+          <w:p>
+            <w:pPr>
+              <w:widowControl w:val="0"/>
+              <w:rPr>
+                <w:sz w:val="20"/>
+                <w:szCs w:val="20"/>
+                <w:lang w:val="en-US"/>
+              </w:rPr>
+            </w:pPr>
+            <w:r>
+              <w:rPr>
+                <w:sz w:val="20"/>
+                <w:szCs w:val="20"/>
+                <w:lang w:val="en-US"/>
+              </w:rPr>
+              <w:t>Load the test data and demonstrate that episodeOfCare-identifier is displayed correctly.</w:t>
+            </w:r>
+          </w:p>
+          <w:p>
+            <w:pPr>
+              <w:widowControl w:val="0"/>
+              <w:rPr>
+                <w:b/>
+                <w:sz w:val="20"/>
+                <w:szCs w:val="20"/>
+                <w:lang w:val="en-US"/>
+              </w:rPr>
+            </w:pPr>
+          </w:p>
+        </w:tc>
+        <w:tc>
+          <w:tcPr>
+            <w:tcW w:w="2889" w:type="dxa"/>
+          </w:tcPr>
+          <w:p>
+            <w:pPr>
+              <w:widowControl w:val="0"/>
+              <w:rPr>
+                <w:color w:val="3B3838" w:themeColor="background2" w:themeShade="40"/>
+                <w:sz w:val="20"/>
+                <w:szCs w:val="20"/>
+                <w:lang w:val="en-US"/>
+              </w:rPr>
+            </w:pPr>
+            <w:r>
+              <w:rPr>
+                <w:color w:val="3B3838" w:themeColor="background2" w:themeShade="40"/>
+                <w:sz w:val="20"/>
+                <w:szCs w:val="20"/>
+              </w:rPr>
+              <w:t xml:space="preserve">Use test </w:t>
+            </w:r>
+            <w:r>
+              <w:rPr>
+                <w:sz w:val="20"/>
+                <w:szCs w:val="20"/>
+              </w:rPr>
+              <w:t xml:space="preserve">example </w:t>
+            </w:r>
+            <w:r>
+              <w:rPr>
+                <w:color w:val="3B3838" w:themeColor="background2" w:themeShade="40"/>
+                <w:sz w:val="20"/>
+                <w:szCs w:val="20"/>
+              </w:rPr>
+              <w:t xml:space="preserve">from </w:t>
+            </w:r>
+            <w:r>
+              <w:rPr>
+                <w:color w:val="3B3838" w:themeColor="background2" w:themeShade="40"/>
+                <w:sz w:val="20"/>
+                <w:szCs w:val="20"/>
+              </w:rPr>
+              <w:fldChar w:fldCharType="begin"/>
+            </w:r>
+            <w:r>
+              <w:rPr>
+                <w:color w:val="3B3838" w:themeColor="background2" w:themeShade="40"/>
+                <w:sz w:val="20"/>
+                <w:szCs w:val="20"/>
+              </w:rPr>
+              <w:instrText xml:space="preserve"> REF _Ref194929948 \r \h </w:instrText>
+            </w:r>
+            <w:r>
+              <w:rPr>
+                <w:color w:val="3B3838" w:themeColor="background2" w:themeShade="40"/>
+                <w:sz w:val="20"/>
+                <w:szCs w:val="20"/>
+              </w:rPr>
+            </w:r>
+            <w:r>
+              <w:rPr>
+                <w:color w:val="3B3838" w:themeColor="background2" w:themeShade="40"/>
+                <w:sz w:val="20"/>
+                <w:szCs w:val="20"/>
+              </w:rPr>
+              <w:fldChar w:fldCharType="separate"/>
+            </w:r>
+            <w:r>
+              <w:rPr>
+                <w:color w:val="3B3838" w:themeColor="background2" w:themeShade="40"/>
+                <w:sz w:val="20"/>
+                <w:szCs w:val="20"/>
+              </w:rPr>
+              <w:t>3.2.1.1</w:t>
+            </w:r>
+            <w:r>
+              <w:rPr>
+                <w:color w:val="3B3838" w:themeColor="background2" w:themeShade="40"/>
+                <w:sz w:val="20"/>
+                <w:szCs w:val="20"/>
+              </w:rPr>
+              <w:fldChar w:fldCharType="end"/>
+            </w:r>
+          </w:p>
+        </w:tc>
+        <w:tc>
+          <w:tcPr>
+            <w:tcW w:w="2576" w:type="dxa"/>
+          </w:tcPr>
+          <w:p>
+            <w:pPr>
+              <w:widowControl w:val="0"/>
+              <w:rPr>
+                <w:sz w:val="20"/>
+                <w:szCs w:val="20"/>
+                <w:lang w:val="en-US"/>
+              </w:rPr>
+            </w:pPr>
+            <w:r>
+              <w:rPr>
+                <w:sz w:val="20"/>
+                <w:szCs w:val="20"/>
+                <w:lang w:val="en-US"/>
+              </w:rPr>
+              <w:t xml:space="preserve">The episodeOfCare-identifier is displayed </w:t>
+            </w:r>
+            <w:r>
+              <w:rPr>
+                <w:sz w:val="20"/>
+                <w:szCs w:val="20"/>
+                <w:lang w:val="en-US"/>
+              </w:rPr>
+              <w:t>to the user</w:t>
+            </w:r>
+            <w:r>
+              <w:rPr>
+                <w:sz w:val="20"/>
+                <w:szCs w:val="20"/>
+                <w:lang w:val="en-US"/>
+              </w:rPr>
+              <w:t>.</w:t>
+            </w:r>
+          </w:p>
+        </w:tc>
+        <w:tc>
+          <w:tcPr>
+            <w:tcW w:w="2254" w:type="dxa"/>
+          </w:tcPr>
+          <w:p>
+            <w:pPr>
+              <w:widowControl w:val="0"/>
+              <w:jc w:val="center"/>
+              <w:rPr>
+                <w:sz w:val="20"/>
+                <w:szCs w:val="20"/>
+                <w:lang w:val="en-US"/>
+              </w:rPr>
+            </w:pPr>
+          </w:p>
+        </w:tc>
+        <w:tc>
+          <w:tcPr>
+            <w:tcW w:w="1304" w:type="dxa"/>
+          </w:tcPr>
+          <w:p>
+            <w:pPr>
+              <w:widowControl w:val="0"/>
+              <w:jc w:val="center"/>
+              <w:rPr>
+                <w:sz w:val="20"/>
+                <w:szCs w:val="20"/>
+                <w:lang w:val="en-US"/>
+              </w:rPr>
+            </w:pPr>
+            <w:sdt>
+              <w:sdtPr>
+                <w:rPr>
+                  <w:sz w:val="20"/>
+                  <w:szCs w:val="20"/>
+                </w:rPr>
+                <w:alias w:val="MedCom vurdering"/>
+                <w:tag w:val="MedCom vurdering"/>
+                <w:id w:val="-1517611108"/>
+                <w:placeholder>
+                  <w:docPart w:val="22B6ABDDFAB0477480575E68CFC89193"/>
+                </w:placeholder>
+                <w:dropDownList>
+                  <w:listItem w:value="Vælg"/>
+                  <w:listItem w:displayText="F1" w:value="F1"/>
+                  <w:listItem w:displayText="F2" w:value="F2"/>
+                  <w:listItem w:displayText="F3" w:value="F3"/>
+                  <w:listItem w:displayText="F4" w:value="F4"/>
+                  <w:listItem w:displayText="OK" w:value="OK"/>
+                  <w:listItem w:displayText="Ej relevant" w:value="Ej relevant"/>
+                </w:dropDownList>
+              </w:sdtPr>
+              <w:sdtEndPr/>
+              <w:sdtContent>
+                <w:r>
+                  <w:rPr>
+                    <w:rStyle w:val="Pladsholdertekst"/>
+                    <w:sz w:val="20"/>
+                    <w:szCs w:val="20"/>
+                  </w:rPr>
+                  <w:t>Choose</w:t>
+                </w:r>
+              </w:sdtContent>
+            </w:sdt>
+          </w:p>
+        </w:tc>
+      </w:tr>
+      <w:tr>
+        <w:tc>
+          <w:tcPr>
+            <w:tcW w:w="13426" w:type="dxa"/>
+            <w:gridSpan w:val="6"/>
+            <w:shd w:val="clear" w:color="auto" w:fill="DEEAF6" w:themeFill="accent5" w:themeFillTint="33"/>
+          </w:tcPr>
+          <w:p>
+            <w:pPr>
+              <w:widowControl w:val="0"/>
+              <w:jc w:val="center"/>
+              <w:rPr>
+                <w:sz w:val="20"/>
+                <w:szCs w:val="20"/>
+              </w:rPr>
+            </w:pPr>
+            <w:r>
+              <w:rPr>
+                <w:sz w:val="20"/>
+                <w:szCs w:val="20"/>
+              </w:rPr>
+              <w:lastRenderedPageBreak/>
               <w:t>Timezone</w:t>
             </w:r>
           </w:p>
@@ -14658,8 +15636,10 @@
                 <w:szCs w:val="20"/>
               </w:rPr>
             </w:pPr>
-          </w:p>
-        </w:tc>
+            <w:bookmarkStart w:id="35" w:name="_Ref231976898"/>
+          </w:p>
+        </w:tc>
+        <w:bookmarkEnd w:id="35"/>
         <w:tc>
           <w:tcPr>
             <w:tcW w:w="3404" w:type="dxa"/>
@@ -14832,307 +15812,6 @@
                 <w:sz w:val="20"/>
                 <w:szCs w:val="20"/>
               </w:rPr>
-              <w:lastRenderedPageBreak/>
-              <w:t>EpisodeofCare-identifier</w:t>
-            </w:r>
-          </w:p>
-        </w:tc>
-      </w:tr>
-      <w:tr>
-        <w:tc>
-          <w:tcPr>
-            <w:tcW w:w="999" w:type="dxa"/>
-          </w:tcPr>
-          <w:p>
-            <w:pPr>
-              <w:pStyle w:val="Listeafsnit"/>
-              <w:numPr>
-                <w:ilvl w:val="3"/>
-                <w:numId w:val="5"/>
-              </w:numPr>
-              <w:spacing w:line="240" w:lineRule="auto"/>
-              <w:rPr>
-                <w:sz w:val="20"/>
-                <w:szCs w:val="20"/>
-              </w:rPr>
-            </w:pPr>
-            <w:bookmarkStart w:id="35" w:name="_Ref212035212"/>
-          </w:p>
-        </w:tc>
-        <w:bookmarkEnd w:id="35"/>
-        <w:tc>
-          <w:tcPr>
-            <w:tcW w:w="3404" w:type="dxa"/>
-          </w:tcPr>
-          <w:p>
-            <w:pPr>
-              <w:widowControl w:val="0"/>
-              <w:rPr>
-                <w:sz w:val="20"/>
-                <w:szCs w:val="20"/>
-                <w:lang w:val="en-US"/>
-              </w:rPr>
-            </w:pPr>
-            <w:r>
-              <w:rPr>
-                <w:i/>
-                <w:sz w:val="20"/>
-                <w:szCs w:val="20"/>
-                <w:lang w:val="en-US"/>
-              </w:rPr>
-              <w:t>If relevant for the user, display the included episodeOfCare-identifier</w:t>
-            </w:r>
-            <w:r>
-              <w:rPr>
-                <w:sz w:val="20"/>
-                <w:szCs w:val="20"/>
-                <w:lang w:val="en-US"/>
-              </w:rPr>
-              <w:t>.</w:t>
-            </w:r>
-          </w:p>
-          <w:p>
-            <w:pPr>
-              <w:widowControl w:val="0"/>
-              <w:rPr>
-                <w:sz w:val="20"/>
-                <w:szCs w:val="20"/>
-                <w:lang w:val="en-US"/>
-              </w:rPr>
-            </w:pPr>
-          </w:p>
-          <w:p>
-            <w:pPr>
-              <w:widowControl w:val="0"/>
-              <w:rPr>
-                <w:sz w:val="20"/>
-                <w:szCs w:val="20"/>
-                <w:lang w:val="en-US"/>
-              </w:rPr>
-            </w:pPr>
-            <w:r>
-              <w:rPr>
-                <w:sz w:val="20"/>
-                <w:szCs w:val="20"/>
-                <w:lang w:val="en-US"/>
-              </w:rPr>
-              <w:t>Load the test data and demonstrate that episodeOfCare-identifier is displayed correctly.</w:t>
-            </w:r>
-          </w:p>
-          <w:p>
-            <w:pPr>
-              <w:widowControl w:val="0"/>
-              <w:rPr>
-                <w:b/>
-                <w:sz w:val="20"/>
-                <w:szCs w:val="20"/>
-                <w:lang w:val="en-US"/>
-              </w:rPr>
-            </w:pPr>
-          </w:p>
-        </w:tc>
-        <w:tc>
-          <w:tcPr>
-            <w:tcW w:w="2889" w:type="dxa"/>
-          </w:tcPr>
-          <w:p>
-            <w:pPr>
-              <w:widowControl w:val="0"/>
-              <w:rPr>
-                <w:color w:val="3B3838" w:themeColor="background2" w:themeShade="40"/>
-                <w:sz w:val="20"/>
-                <w:szCs w:val="20"/>
-              </w:rPr>
-            </w:pPr>
-            <w:r>
-              <w:rPr>
-                <w:color w:val="3B3838" w:themeColor="background2" w:themeShade="40"/>
-                <w:sz w:val="20"/>
-                <w:szCs w:val="20"/>
-              </w:rPr>
-              <w:t xml:space="preserve">Use test </w:t>
-            </w:r>
-            <w:r>
-              <w:rPr>
-                <w:sz w:val="20"/>
-                <w:szCs w:val="20"/>
-              </w:rPr>
-              <w:t>example</w:t>
-            </w:r>
-            <w:r>
-              <w:rPr>
-                <w:sz w:val="20"/>
-                <w:szCs w:val="20"/>
-              </w:rPr>
-              <w:t xml:space="preserve"> </w:t>
-            </w:r>
-            <w:r>
-              <w:rPr>
-                <w:color w:val="3B3838" w:themeColor="background2" w:themeShade="40"/>
-                <w:sz w:val="20"/>
-                <w:szCs w:val="20"/>
-              </w:rPr>
-              <w:t xml:space="preserve">from </w:t>
-            </w:r>
-            <w:r>
-              <w:rPr>
-                <w:color w:val="3B3838" w:themeColor="background2" w:themeShade="40"/>
-                <w:sz w:val="20"/>
-                <w:szCs w:val="20"/>
-              </w:rPr>
-              <w:fldChar w:fldCharType="begin"/>
-            </w:r>
-            <w:r>
-              <w:rPr>
-                <w:color w:val="3B3838" w:themeColor="background2" w:themeShade="40"/>
-                <w:sz w:val="20"/>
-                <w:szCs w:val="20"/>
-              </w:rPr>
-              <w:instrText xml:space="preserve"> REF _Ref194929948 \r \h </w:instrText>
-            </w:r>
-            <w:r>
-              <w:rPr>
-                <w:color w:val="3B3838" w:themeColor="background2" w:themeShade="40"/>
-                <w:sz w:val="20"/>
-                <w:szCs w:val="20"/>
-              </w:rPr>
-            </w:r>
-            <w:r>
-              <w:rPr>
-                <w:color w:val="3B3838" w:themeColor="background2" w:themeShade="40"/>
-                <w:sz w:val="20"/>
-                <w:szCs w:val="20"/>
-              </w:rPr>
-              <w:fldChar w:fldCharType="separate"/>
-            </w:r>
-            <w:r>
-              <w:rPr>
-                <w:color w:val="3B3838" w:themeColor="background2" w:themeShade="40"/>
-                <w:sz w:val="20"/>
-                <w:szCs w:val="20"/>
-              </w:rPr>
-              <w:t>3.2.1.1</w:t>
-            </w:r>
-            <w:r>
-              <w:rPr>
-                <w:color w:val="3B3838" w:themeColor="background2" w:themeShade="40"/>
-                <w:sz w:val="20"/>
-                <w:szCs w:val="20"/>
-              </w:rPr>
-              <w:fldChar w:fldCharType="end"/>
-            </w:r>
-          </w:p>
-        </w:tc>
-        <w:tc>
-          <w:tcPr>
-            <w:tcW w:w="2576" w:type="dxa"/>
-          </w:tcPr>
-          <w:p>
-            <w:pPr>
-              <w:widowControl w:val="0"/>
-              <w:rPr>
-                <w:sz w:val="20"/>
-                <w:szCs w:val="20"/>
-                <w:lang w:val="en-US"/>
-              </w:rPr>
-            </w:pPr>
-            <w:r>
-              <w:rPr>
-                <w:sz w:val="20"/>
-                <w:szCs w:val="20"/>
-                <w:lang w:val="en-US"/>
-              </w:rPr>
-              <w:t>The episodeOfCare-identifier is displayed correctly.</w:t>
-            </w:r>
-          </w:p>
-        </w:tc>
-        <w:tc>
-          <w:tcPr>
-            <w:tcW w:w="2254" w:type="dxa"/>
-          </w:tcPr>
-          <w:p>
-            <w:pPr>
-              <w:widowControl w:val="0"/>
-              <w:jc w:val="center"/>
-              <w:rPr>
-                <w:sz w:val="20"/>
-                <w:szCs w:val="20"/>
-                <w:lang w:val="en-US"/>
-              </w:rPr>
-            </w:pPr>
-          </w:p>
-        </w:tc>
-        <w:tc>
-          <w:tcPr>
-            <w:tcW w:w="1304" w:type="dxa"/>
-          </w:tcPr>
-          <w:p>
-            <w:pPr>
-              <w:widowControl w:val="0"/>
-              <w:jc w:val="center"/>
-              <w:rPr>
-                <w:sz w:val="20"/>
-                <w:szCs w:val="20"/>
-              </w:rPr>
-            </w:pPr>
-            <w:sdt>
-              <w:sdtPr>
-                <w:rPr>
-                  <w:sz w:val="20"/>
-                  <w:szCs w:val="20"/>
-                </w:rPr>
-                <w:alias w:val="MedCom vurdering"/>
-                <w:tag w:val="MedCom vurdering"/>
-                <w:id w:val="-240648529"/>
-                <w:placeholder>
-                  <w:docPart w:val="77ECC03760164BECBDE97E2846ABB61D"/>
-                </w:placeholder>
-                <w:dropDownList>
-                  <w:listItem w:value="Vælg"/>
-                  <w:listItem w:displayText="F1" w:value="F1"/>
-                  <w:listItem w:displayText="F2" w:value="F2"/>
-                  <w:listItem w:displayText="F3" w:value="F3"/>
-                  <w:listItem w:displayText="F4" w:value="F4"/>
-                  <w:listItem w:displayText="OK" w:value="OK"/>
-                  <w:listItem w:displayText="Ej relevant" w:value="Ej relevant"/>
-                </w:dropDownList>
-              </w:sdtPr>
-              <w:sdtEndPr/>
-              <w:sdtContent>
-                <w:r>
-                  <w:rPr>
-                    <w:rStyle w:val="Pladsholdertekst"/>
-                    <w:sz w:val="20"/>
-                    <w:szCs w:val="20"/>
-                  </w:rPr>
-                  <w:t>Choose</w:t>
-                </w:r>
-              </w:sdtContent>
-            </w:sdt>
-          </w:p>
-        </w:tc>
-      </w:tr>
-      <w:tr>
-        <w:tc>
-          <w:tcPr>
-            <w:tcW w:w="13426" w:type="dxa"/>
-            <w:gridSpan w:val="6"/>
-            <w:shd w:val="clear" w:color="auto" w:fill="DEEAF6" w:themeFill="accent5" w:themeFillTint="33"/>
-          </w:tcPr>
-          <w:p>
-            <w:pPr>
-              <w:widowControl w:val="0"/>
-              <w:jc w:val="center"/>
-              <w:rPr>
-                <w:sz w:val="20"/>
-                <w:szCs w:val="20"/>
-              </w:rPr>
-            </w:pPr>
-            <w:r>
-              <w:rPr>
-                <w:sz w:val="20"/>
-                <w:szCs w:val="20"/>
-              </w:rPr>
               <w:t>Replacement-CPR</w:t>
             </w:r>
           </w:p>
@@ -15282,15 +15961,7 @@
                 <w:szCs w:val="20"/>
                 <w:lang w:val="en-US"/>
               </w:rPr>
-              <w:instrText xml:space="preserve"> REF _Ref212035212 \r \h </w:instrText>
-            </w:r>
-            <w:r>
-              <w:rPr>
-                <w:color w:val="3B3838" w:themeColor="background2" w:themeShade="40"/>
-                <w:sz w:val="20"/>
-                <w:szCs w:val="20"/>
-                <w:lang w:val="en-US"/>
-              </w:rPr>
+              <w:instrText xml:space="preserve"> REF _Ref231976898 \r </w:instrText>
             </w:r>
             <w:r>
               <w:rPr>
@@ -15576,15 +16247,7 @@
                 <w:szCs w:val="20"/>
                 <w:lang w:val="en-US"/>
               </w:rPr>
-              <w:instrText xml:space="preserve"> REF _Ref212035212 \r \h </w:instrText>
-            </w:r>
-            <w:r>
-              <w:rPr>
-                <w:color w:val="3B3838" w:themeColor="background2" w:themeShade="40"/>
-                <w:sz w:val="20"/>
-                <w:szCs w:val="20"/>
-                <w:lang w:val="en-US"/>
-              </w:rPr>
+              <w:instrText xml:space="preserve"> REF _Ref231976898 \r </w:instrText>
             </w:r>
             <w:r>
               <w:rPr>
@@ -16027,7 +16690,17 @@
                 <w:szCs w:val="20"/>
                 <w:lang w:val="en-US"/>
               </w:rPr>
-              <w:t>A CareCommunication can be answered by multiple practitionerRoles/practitioners from the same organization.</w:t>
+              <w:t xml:space="preserve">A CareCommunication can be answered by multiple </w:t>
+            </w:r>
+            <w:r>
+              <w:rPr>
+                <w:i/>
+                <w:sz w:val="20"/>
+                <w:szCs w:val="20"/>
+                <w:lang w:val="en-US"/>
+              </w:rPr>
+              <w:lastRenderedPageBreak/>
+              <w:t>practitionerRoles/practitioners from the same organization.</w:t>
             </w:r>
           </w:p>
           <w:p>
@@ -16171,7 +16844,17 @@
                 <w:szCs w:val="20"/>
                 <w:lang w:val="en-US"/>
               </w:rPr>
-              <w:t>Both are shown in correlation to the correct message segment.</w:t>
+              <w:lastRenderedPageBreak/>
+              <w:t xml:space="preserve">Both are shown in correlation to the correct </w:t>
+            </w:r>
+            <w:r>
+              <w:rPr>
+                <w:sz w:val="20"/>
+                <w:szCs w:val="20"/>
+                <w:lang w:val="en-US"/>
+              </w:rPr>
+              <w:lastRenderedPageBreak/>
+              <w:t>message segment.</w:t>
             </w:r>
           </w:p>
         </w:tc>
@@ -17306,7 +17989,23 @@
                 <w:szCs w:val="20"/>
                 <w:lang w:val="en-US"/>
               </w:rPr>
-              <w:t>The SUT must perform FHIR validation of the CareCommunication message against the updated Implementation Guides, before the message is shown to the user, to ensure conformance with the defined FHIR profiles and constraints.</w:t>
+              <w:t xml:space="preserve">The SUT </w:t>
+            </w:r>
+            <w:r>
+              <w:rPr>
+                <w:sz w:val="20"/>
+                <w:szCs w:val="20"/>
+                <w:lang w:val="en-US"/>
+              </w:rPr>
+              <w:t>MUST</w:t>
+            </w:r>
+            <w:r>
+              <w:rPr>
+                <w:sz w:val="20"/>
+                <w:szCs w:val="20"/>
+                <w:lang w:val="en-US"/>
+              </w:rPr>
+              <w:t xml:space="preserve"> perform FHIR validation of the CareCommunication message against the updated Implementation Guides, before the message is shown to the user, to ensure conformance with the defined FHIR profiles and constraints.</w:t>
             </w:r>
           </w:p>
           <w:p>
@@ -17334,8 +18033,63 @@
                 <w:szCs w:val="20"/>
                 <w:lang w:val="en-US"/>
               </w:rPr>
-              <w:t>Explain how the SUT validates incoming CareCommunication messages.</w:t>
-            </w:r>
+              <w:t>Explain how the SUT validates incoming CareCommunication messages</w:t>
+            </w:r>
+            <w:r>
+              <w:rPr>
+                <w:sz w:val="20"/>
+                <w:szCs w:val="20"/>
+                <w:lang w:val="en-US"/>
+              </w:rPr>
+              <w:t xml:space="preserve"> using FHIR validation</w:t>
+            </w:r>
+            <w:r>
+              <w:rPr>
+                <w:sz w:val="20"/>
+                <w:szCs w:val="20"/>
+                <w:lang w:val="en-US"/>
+              </w:rPr>
+              <w:t>.</w:t>
+            </w:r>
+          </w:p>
+          <w:p>
+            <w:pPr>
+              <w:widowControl w:val="0"/>
+              <w:rPr>
+                <w:sz w:val="20"/>
+                <w:szCs w:val="20"/>
+                <w:lang w:val="en-US"/>
+              </w:rPr>
+            </w:pPr>
+          </w:p>
+          <w:p>
+            <w:pPr>
+              <w:widowControl w:val="0"/>
+              <w:rPr>
+                <w:sz w:val="20"/>
+                <w:szCs w:val="20"/>
+                <w:lang w:val="en-US"/>
+              </w:rPr>
+            </w:pPr>
+            <w:r>
+              <w:rPr>
+                <w:sz w:val="20"/>
+                <w:szCs w:val="20"/>
+                <w:lang w:val="en-US"/>
+              </w:rPr>
+              <w:t xml:space="preserve">For more information, see the </w:t>
+            </w:r>
+            <w:hyperlink r:id="rId24" w:history="1">
+              <w:r>
+                <w:rPr>
+                  <w:rStyle w:val="Hyperlink"/>
+                  <w:sz w:val="20"/>
+                  <w:szCs w:val="20"/>
+                  <w:lang w:val="en-US"/>
+                </w:rPr>
+                <w:t>MedCom FHIR Validation Governance.</w:t>
+              </w:r>
+            </w:hyperlink>
           </w:p>
         </w:tc>
         <w:tc>
@@ -17663,20 +18417,29 @@
           <w:p>
             <w:pPr>
               <w:rPr>
+                <w:sz w:val="20"/>
+                <w:szCs w:val="20"/>
+                <w:lang w:val="en-US"/>
+              </w:rPr>
+            </w:pPr>
+            <w:r>
+              <w:rPr>
+                <w:sz w:val="20"/>
+                <w:szCs w:val="20"/>
+                <w:lang w:val="en-US"/>
+              </w:rPr>
+              <w:t xml:space="preserve">Load the test example. </w:t>
+            </w:r>
+          </w:p>
+          <w:p>
+            <w:pPr>
+              <w:rPr>
                 <w:rFonts w:cs="Calibri"/>
                 <w:sz w:val="20"/>
                 <w:szCs w:val="20"/>
                 <w:lang w:val="en-US"/>
               </w:rPr>
             </w:pPr>
-            <w:r>
-              <w:rPr>
-                <w:sz w:val="20"/>
-                <w:szCs w:val="20"/>
-                <w:lang w:val="en-US"/>
-              </w:rPr>
-              <w:t xml:space="preserve">Load the test example. </w:t>
-            </w:r>
             <w:r>
               <w:rPr>
                 <w:rFonts w:cs="Calibri"/>
@@ -17895,6 +18658,23 @@
           <w:p>
             <w:pPr>
               <w:rPr>
+                <w:sz w:val="20"/>
+                <w:szCs w:val="20"/>
+                <w:lang w:val="en-US"/>
+              </w:rPr>
+            </w:pPr>
+            <w:r>
+              <w:rPr>
+                <w:sz w:val="20"/>
+                <w:szCs w:val="20"/>
+                <w:lang w:val="en-US"/>
+              </w:rPr>
+              <w:t xml:space="preserve">Load the test example. </w:t>
+            </w:r>
+          </w:p>
+          <w:p>
+            <w:pPr>
+              <w:rPr>
                 <w:rFonts w:cs="Calibri"/>
                 <w:sz w:val="20"/>
                 <w:szCs w:val="20"/>
@@ -17903,20 +18683,48 @@
             </w:pPr>
             <w:r>
               <w:rPr>
-                <w:sz w:val="20"/>
-                <w:szCs w:val="20"/>
-                <w:lang w:val="en-US"/>
-              </w:rPr>
-              <w:t xml:space="preserve">Load the test example. </w:t>
-            </w:r>
-            <w:r>
-              <w:rPr>
                 <w:rFonts w:cs="Calibri"/>
                 <w:sz w:val="20"/>
                 <w:szCs w:val="20"/>
                 <w:lang w:val="en-US"/>
               </w:rPr>
-              <w:t xml:space="preserve">The provided CareCommunication has one regular CPR-number and two replacement CPR-numbers of different types included in the patient resource. </w:t>
+              <w:t>The provided CareCommunication has one regular CPR</w:t>
+            </w:r>
+            <w:r>
+              <w:rPr>
+                <w:rFonts w:cs="Calibri"/>
+                <w:sz w:val="20"/>
+                <w:szCs w:val="20"/>
+                <w:lang w:val="en-US"/>
+              </w:rPr>
+              <w:t xml:space="preserve"> </w:t>
+            </w:r>
+            <w:r>
+              <w:rPr>
+                <w:rFonts w:cs="Calibri"/>
+                <w:sz w:val="20"/>
+                <w:szCs w:val="20"/>
+                <w:lang w:val="en-US"/>
+              </w:rPr>
+              <w:t>number and two replacement CPR</w:t>
+            </w:r>
+            <w:r>
+              <w:rPr>
+                <w:rFonts w:cs="Calibri"/>
+                <w:sz w:val="20"/>
+                <w:szCs w:val="20"/>
+                <w:lang w:val="en-US"/>
+              </w:rPr>
+              <w:t xml:space="preserve"> </w:t>
+            </w:r>
+            <w:r>
+              <w:rPr>
+                <w:rFonts w:cs="Calibri"/>
+                <w:sz w:val="20"/>
+                <w:szCs w:val="20"/>
+                <w:lang w:val="en-US"/>
+              </w:rPr>
+              <w:t xml:space="preserve">numbers of different types included in the patient resource. </w:t>
             </w:r>
           </w:p>
           <w:p>
@@ -18099,12 +18907,14 @@
                 <w:rFonts w:cs="Calibri"/>
                 <w:sz w:val="20"/>
                 <w:szCs w:val="20"/>
-              </w:rPr>
-            </w:pPr>
-            <w:r>
-              <w:rPr>
-                <w:sz w:val="20"/>
-                <w:szCs w:val="20"/>
+                <w:lang w:val="en-US"/>
+              </w:rPr>
+            </w:pPr>
+            <w:r>
+              <w:rPr>
+                <w:sz w:val="20"/>
+                <w:szCs w:val="20"/>
+                <w:lang w:val="en-US"/>
               </w:rPr>
               <w:t>Load the test example.</w:t>
             </w:r>
@@ -18125,7 +18935,25 @@
                 <w:szCs w:val="20"/>
                 <w:lang w:val="en-US"/>
               </w:rPr>
-              <w:t xml:space="preserve">The provided CareCommunication has two replacement CPR-numbers included in the patient resource. </w:t>
+              <w:t>The provided CareCommunication has two replacement CPR</w:t>
+            </w:r>
+            <w:r>
+              <w:rPr>
+                <w:rFonts w:cs="Calibri"/>
+                <w:sz w:val="20"/>
+                <w:szCs w:val="20"/>
+                <w:lang w:val="en-US"/>
+              </w:rPr>
+              <w:t xml:space="preserve"> </w:t>
+            </w:r>
+            <w:r>
+              <w:rPr>
+                <w:rFonts w:cs="Calibri"/>
+                <w:sz w:val="20"/>
+                <w:szCs w:val="20"/>
+                <w:lang w:val="en-US"/>
+              </w:rPr>
+              <w:t xml:space="preserve">numbers included in the patient resource. </w:t>
             </w:r>
           </w:p>
           <w:p>
@@ -18268,13 +19096,228 @@
           </w:p>
         </w:tc>
       </w:tr>
+      <w:tr>
+        <w:tc>
+          <w:tcPr>
+            <w:tcW w:w="901" w:type="dxa"/>
+          </w:tcPr>
+          <w:p>
+            <w:pPr>
+              <w:pStyle w:val="Listeafsnit"/>
+              <w:numPr>
+                <w:ilvl w:val="3"/>
+                <w:numId w:val="5"/>
+              </w:numPr>
+              <w:spacing w:line="240" w:lineRule="auto"/>
+              <w:rPr>
+                <w:sz w:val="20"/>
+                <w:szCs w:val="20"/>
+              </w:rPr>
+            </w:pPr>
+          </w:p>
+        </w:tc>
+        <w:tc>
+          <w:tcPr>
+            <w:tcW w:w="2922" w:type="dxa"/>
+          </w:tcPr>
+          <w:p>
+            <w:pPr>
+              <w:rPr>
+                <w:rFonts w:cs="Calibri"/>
+                <w:sz w:val="20"/>
+                <w:szCs w:val="20"/>
+                <w:lang w:val="en-US"/>
+              </w:rPr>
+            </w:pPr>
+            <w:r>
+              <w:rPr>
+                <w:rFonts w:cs="Calibri"/>
+                <w:sz w:val="20"/>
+                <w:szCs w:val="20"/>
+                <w:lang w:val="en-US"/>
+              </w:rPr>
+              <w:t xml:space="preserve">It is </w:t>
+            </w:r>
+            <w:r>
+              <w:rPr>
+                <w:rFonts w:cs="Calibri"/>
+                <w:sz w:val="20"/>
+                <w:szCs w:val="20"/>
+                <w:lang w:val="en-US"/>
+              </w:rPr>
+              <w:t xml:space="preserve">possible </w:t>
+            </w:r>
+            <w:r>
+              <w:rPr>
+                <w:rFonts w:cs="Calibri"/>
+                <w:sz w:val="20"/>
+                <w:szCs w:val="20"/>
+                <w:lang w:val="en-US"/>
+              </w:rPr>
+              <w:t>to combine CPR and replacement CPR numbers for the same patient</w:t>
+            </w:r>
+            <w:r>
+              <w:rPr>
+                <w:rFonts w:cs="Calibri"/>
+                <w:sz w:val="20"/>
+                <w:szCs w:val="20"/>
+                <w:lang w:val="en-US"/>
+              </w:rPr>
+              <w:t xml:space="preserve">. </w:t>
+            </w:r>
+            <w:r>
+              <w:rPr>
+                <w:rFonts w:cs="Calibri"/>
+                <w:sz w:val="20"/>
+                <w:szCs w:val="20"/>
+                <w:lang w:val="en-US"/>
+              </w:rPr>
+              <w:t>However, the CPR, x-eCPR and d-eCPR identifier types are limited to one of each.</w:t>
+            </w:r>
+          </w:p>
+          <w:p>
+            <w:pPr>
+              <w:rPr>
+                <w:sz w:val="20"/>
+                <w:szCs w:val="20"/>
+                <w:lang w:val="en-US"/>
+              </w:rPr>
+            </w:pPr>
+            <w:r>
+              <w:rPr>
+                <w:rFonts w:cs="Calibri"/>
+                <w:sz w:val="20"/>
+                <w:szCs w:val="20"/>
+                <w:lang w:val="en-US"/>
+              </w:rPr>
+              <w:lastRenderedPageBreak/>
+              <w:t>E</w:t>
+            </w:r>
+            <w:r>
+              <w:rPr>
+                <w:rFonts w:cs="Calibri"/>
+                <w:sz w:val="20"/>
+                <w:szCs w:val="20"/>
+                <w:lang w:val="en-US"/>
+              </w:rPr>
+              <w:t>xplain which received CPR and replacement CPR numbers the SUT displays.</w:t>
+            </w:r>
+          </w:p>
+        </w:tc>
+        <w:tc>
+          <w:tcPr>
+            <w:tcW w:w="2126" w:type="dxa"/>
+          </w:tcPr>
+          <w:p>
+            <w:pPr>
+              <w:keepNext/>
+              <w:rPr>
+                <w:color w:val="3B3838" w:themeColor="background2" w:themeShade="40"/>
+                <w:sz w:val="20"/>
+                <w:szCs w:val="20"/>
+                <w:lang w:val="en-US"/>
+              </w:rPr>
+            </w:pPr>
+          </w:p>
+        </w:tc>
+        <w:tc>
+          <w:tcPr>
+            <w:tcW w:w="2977" w:type="dxa"/>
+          </w:tcPr>
+          <w:p>
+            <w:pPr>
+              <w:keepNext/>
+              <w:spacing w:before="60" w:after="120"/>
+              <w:rPr>
+                <w:sz w:val="20"/>
+                <w:szCs w:val="20"/>
+                <w:lang w:val="en-US"/>
+              </w:rPr>
+            </w:pPr>
+            <w:r>
+              <w:rPr>
+                <w:rFonts w:cs="Calibri"/>
+                <w:sz w:val="20"/>
+                <w:szCs w:val="20"/>
+                <w:lang w:val="en-US"/>
+              </w:rPr>
+              <w:t>Explain</w:t>
+            </w:r>
+            <w:r>
+              <w:rPr>
+                <w:rFonts w:cs="Calibri"/>
+                <w:sz w:val="20"/>
+                <w:szCs w:val="20"/>
+                <w:lang w:val="en-US"/>
+              </w:rPr>
+              <w:t xml:space="preserve"> which received CPR and replacement CPR numbers the SUT displays.</w:t>
+            </w:r>
+          </w:p>
+        </w:tc>
+        <w:tc>
+          <w:tcPr>
+            <w:tcW w:w="3513" w:type="dxa"/>
+          </w:tcPr>
+          <w:p>
+            <w:pPr>
+              <w:rPr>
+                <w:sz w:val="20"/>
+                <w:szCs w:val="20"/>
+                <w:lang w:val="en-US"/>
+              </w:rPr>
+            </w:pPr>
+          </w:p>
+        </w:tc>
+        <w:tc>
+          <w:tcPr>
+            <w:tcW w:w="1223" w:type="dxa"/>
+          </w:tcPr>
+          <w:p>
+            <w:pPr>
+              <w:rPr>
+                <w:sz w:val="20"/>
+                <w:szCs w:val="20"/>
+                <w:lang w:val="en-US"/>
+              </w:rPr>
+            </w:pPr>
+            <w:sdt>
+              <w:sdtPr>
+                <w:rPr>
+                  <w:sz w:val="20"/>
+                  <w:szCs w:val="20"/>
+                </w:rPr>
+                <w:alias w:val="MedCom vurdering"/>
+                <w:tag w:val="MedCom vurdering"/>
+                <w:id w:val="-901898538"/>
+                <w:placeholder>
+                  <w:docPart w:val="292480F98CB24E75961EF69BAB33D828"/>
+                </w:placeholder>
+                <w:dropDownList>
+                  <w:listItem w:value="Vælg"/>
+                  <w:listItem w:displayText="F1" w:value="F1"/>
+                  <w:listItem w:displayText="F2" w:value="F2"/>
+                  <w:listItem w:displayText="F3" w:value="F3"/>
+                  <w:listItem w:displayText="F4" w:value="F4"/>
+                  <w:listItem w:displayText="OK" w:value="OK"/>
+                  <w:listItem w:displayText="Ej relevant" w:value="Ej relevant"/>
+                </w:dropDownList>
+              </w:sdtPr>
+              <w:sdtEndPr/>
+              <w:sdtContent>
+                <w:r>
+                  <w:rPr>
+                    <w:rStyle w:val="Pladsholdertekst"/>
+                    <w:sz w:val="20"/>
+                    <w:szCs w:val="20"/>
+                  </w:rPr>
+                  <w:t>Choose</w:t>
+                </w:r>
+              </w:sdtContent>
+            </w:sdt>
+          </w:p>
+        </w:tc>
+      </w:tr>
     </w:tbl>
-    <w:p/>
-    <w:p>
-      <w:r>
-        <w:br w:type="page"/>
-      </w:r>
-    </w:p>
     <w:p>
       <w:pPr>
         <w:pStyle w:val="Overskrift3"/>
@@ -18284,7 +19327,6 @@
         </w:numPr>
       </w:pPr>
       <w:r>
-        <w:lastRenderedPageBreak/>
         <w:t xml:space="preserve">Parallel sent </w:t>
       </w:r>
       <w:r>
@@ -19701,16 +20743,7 @@
                 <w:szCs w:val="20"/>
                 <w:lang w:val="en-US"/>
               </w:rPr>
-              <w:t xml:space="preserve"> if the time stamps are identical, </w:t>
-            </w:r>
-            <w:r>
-              <w:rPr>
-                <w:sz w:val="20"/>
-                <w:szCs w:val="20"/>
-                <w:lang w:val="en-US"/>
-              </w:rPr>
-              <w:lastRenderedPageBreak/>
-              <w:t xml:space="preserve">the initiator of the communication must appear as the first, followed by the message </w:t>
+              <w:t xml:space="preserve"> if the time stamps are identical, the initiator of the communication must appear as the first, followed by the message </w:t>
             </w:r>
             <w:r>
               <w:rPr>
@@ -20537,6 +21570,7 @@
                 <w:b/>
                 <w:sz w:val="20"/>
                 <w:szCs w:val="20"/>
+                <w:lang w:val="en-US"/>
               </w:rPr>
             </w:pPr>
             <w:r>
@@ -20544,6 +21578,7 @@
                 <w:b/>
                 <w:sz w:val="20"/>
                 <w:szCs w:val="20"/>
+                <w:lang w:val="en-US"/>
               </w:rPr>
               <w:t xml:space="preserve">Acknowledgement </w:t>
             </w:r>
@@ -20706,6 +21741,7 @@
         <w:rPr>
           <w:lang w:val="en-US"/>
         </w:rPr>
+        <w:lastRenderedPageBreak/>
         <w:t xml:space="preserve">Loading of </w:t>
       </w:r>
       <w:r>
@@ -21089,16 +22125,7 @@
                 <w:szCs w:val="20"/>
                 <w:lang w:val="en-US"/>
               </w:rPr>
-              <w:t xml:space="preserve">Load test data, which is a </w:t>
-            </w:r>
-            <w:r>
-              <w:rPr>
-                <w:sz w:val="20"/>
-                <w:szCs w:val="20"/>
-                <w:lang w:val="en-US"/>
-              </w:rPr>
-              <w:lastRenderedPageBreak/>
-              <w:t>reply to a new CareCommunication, and demonstrate that the message appears as replied in the SUT.</w:t>
+              <w:t>Load test data, which is a reply to a new CareCommunication, and demonstrate that the message appears as replied in the SUT.</w:t>
             </w:r>
             <w:r>
               <w:rPr>
@@ -21184,7 +22211,6 @@
                 <w:szCs w:val="20"/>
                 <w:lang w:val="en-US"/>
               </w:rPr>
-              <w:lastRenderedPageBreak/>
               <w:t>R-Tek-H-3e047a9d-c86a-4828-b686-6a80403df5eb</w:t>
             </w:r>
           </w:p>
@@ -21218,7 +22244,6 @@
                 <w:szCs w:val="20"/>
                 <w:lang w:val="en-US"/>
               </w:rPr>
-              <w:lastRenderedPageBreak/>
               <w:t xml:space="preserve">The new and replied message appears as replied in the user interface ordered by time stamp </w:t>
             </w:r>
             <w:r>
@@ -21227,7 +22252,6 @@
                 <w:szCs w:val="20"/>
                 <w:lang w:val="en-US"/>
               </w:rPr>
-              <w:lastRenderedPageBreak/>
               <w:t>from</w:t>
             </w:r>
             <w:r>
@@ -21692,6 +22716,7 @@
         </w:numPr>
       </w:pPr>
       <w:r>
+        <w:lastRenderedPageBreak/>
         <w:t>H</w:t>
       </w:r>
       <w:r>
@@ -23678,7 +24703,23 @@
                 <w:szCs w:val="20"/>
                 <w:lang w:val="en-US"/>
               </w:rPr>
-              <w:t>Demonstrate that the SUT has sent a negative FHIR Acknowledgement (Kvittering).</w:t>
+              <w:t>Demonstrate that the SUT has sent a negative FHIR Acknowledgement (Kvittering)</w:t>
+            </w:r>
+            <w:r>
+              <w:rPr>
+                <w:sz w:val="20"/>
+                <w:szCs w:val="20"/>
+                <w:lang w:val="en-US"/>
+              </w:rPr>
+              <w:t xml:space="preserve"> as communication.category is missing</w:t>
+            </w:r>
+            <w:r>
+              <w:rPr>
+                <w:sz w:val="20"/>
+                <w:szCs w:val="20"/>
+                <w:lang w:val="en-US"/>
+              </w:rPr>
+              <w:t>.</w:t>
             </w:r>
           </w:p>
         </w:tc>
@@ -23732,7 +24773,7 @@
                 <w:szCs w:val="20"/>
                 <w:lang w:val="en-US"/>
               </w:rPr>
-              <w:t>to the correct receiver.</w:t>
+              <w:t>to the correct receiver</w:t>
             </w:r>
           </w:p>
         </w:tc>
@@ -24028,7 +25069,23 @@
                 <w:szCs w:val="20"/>
                 <w:lang w:val="en-US"/>
               </w:rPr>
-              <w:t>Demonstrate that the SUT has sent a negative FHIR Acknowledgement (Kvittering) for the duplet.</w:t>
+              <w:t>Demonstrate that the SUT has sent a negative FHIR Acknowledgement (Kvittering) for the duplet</w:t>
+            </w:r>
+            <w:r>
+              <w:rPr>
+                <w:sz w:val="20"/>
+                <w:szCs w:val="20"/>
+                <w:lang w:val="en-US"/>
+              </w:rPr>
+              <w:t xml:space="preserve"> as communication.category is missing</w:t>
+            </w:r>
+            <w:r>
+              <w:rPr>
+                <w:sz w:val="20"/>
+                <w:szCs w:val="20"/>
+                <w:lang w:val="en-US"/>
+              </w:rPr>
+              <w:t>.</w:t>
             </w:r>
           </w:p>
           <w:p>
@@ -24164,696 +25221,10 @@
       </w:tr>
     </w:tbl>
     <w:p/>
-    <w:p>
-      <w:pPr>
-        <w:pStyle w:val="Overskrift3"/>
-        <w:numPr>
-          <w:ilvl w:val="2"/>
-          <w:numId w:val="5"/>
-        </w:numPr>
-      </w:pPr>
-      <w:r>
-        <w:t>H</w:t>
-      </w:r>
-      <w:r>
-        <w:t xml:space="preserve">andling of </w:t>
-      </w:r>
-      <w:r>
-        <w:t xml:space="preserve">invalid </w:t>
-      </w:r>
-      <w:r>
-        <w:t>messages</w:t>
-      </w:r>
-    </w:p>
-    <w:tbl>
-      <w:tblPr>
-        <w:tblStyle w:val="Tabel-Gitter"/>
-        <w:tblW w:w="0" w:type="auto"/>
-        <w:tblLook w:val="04A0" w:firstRow="1" w:lastRow="0" w:firstColumn="1" w:lastColumn="0" w:noHBand="0" w:noVBand="1"/>
-      </w:tblPr>
-      <w:tblGrid>
-        <w:gridCol w:w="1260"/>
-        <w:gridCol w:w="2551"/>
-        <w:gridCol w:w="2059"/>
-        <w:gridCol w:w="3056"/>
-        <w:gridCol w:w="3120"/>
-        <w:gridCol w:w="1380"/>
-      </w:tblGrid>
-      <w:tr>
-        <w:trPr>
-          <w:tblHeader/>
-        </w:trPr>
-        <w:tc>
-          <w:tcPr>
-            <w:tcW w:w="1260" w:type="dxa"/>
-            <w:shd w:val="clear" w:color="auto" w:fill="152F4A"/>
-          </w:tcPr>
-          <w:p>
-            <w:pPr>
-              <w:widowControl w:val="0"/>
-              <w:rPr>
-                <w:b/>
-                <w:sz w:val="20"/>
-                <w:szCs w:val="20"/>
-              </w:rPr>
-            </w:pPr>
-            <w:r>
-              <w:rPr>
-                <w:b/>
-                <w:sz w:val="20"/>
-                <w:szCs w:val="20"/>
-              </w:rPr>
-              <w:t>Test</w:t>
-            </w:r>
-            <w:r>
-              <w:rPr>
-                <w:b/>
-                <w:sz w:val="20"/>
-                <w:szCs w:val="20"/>
-              </w:rPr>
-              <w:t xml:space="preserve"> </w:t>
-            </w:r>
-            <w:r>
-              <w:rPr>
-                <w:b/>
-                <w:sz w:val="20"/>
-                <w:szCs w:val="20"/>
-              </w:rPr>
-              <w:t>step #</w:t>
-            </w:r>
-          </w:p>
-        </w:tc>
-        <w:tc>
-          <w:tcPr>
-            <w:tcW w:w="2551" w:type="dxa"/>
-            <w:shd w:val="clear" w:color="auto" w:fill="152F4A"/>
-          </w:tcPr>
-          <w:p>
-            <w:pPr>
-              <w:widowControl w:val="0"/>
-              <w:rPr>
-                <w:b/>
-                <w:sz w:val="20"/>
-                <w:szCs w:val="20"/>
-              </w:rPr>
-            </w:pPr>
-            <w:r>
-              <w:rPr>
-                <w:b/>
-                <w:sz w:val="20"/>
-                <w:szCs w:val="20"/>
-              </w:rPr>
-              <w:t>Action</w:t>
-            </w:r>
-          </w:p>
-        </w:tc>
-        <w:tc>
-          <w:tcPr>
-            <w:tcW w:w="2059" w:type="dxa"/>
-            <w:shd w:val="clear" w:color="auto" w:fill="152F4A"/>
-          </w:tcPr>
-          <w:p>
-            <w:pPr>
-              <w:widowControl w:val="0"/>
-              <w:rPr>
-                <w:b/>
-                <w:sz w:val="20"/>
-                <w:szCs w:val="20"/>
-              </w:rPr>
-            </w:pPr>
-            <w:r>
-              <w:rPr>
-                <w:b/>
-                <w:sz w:val="20"/>
-                <w:szCs w:val="20"/>
-              </w:rPr>
-              <w:t>Test data</w:t>
-            </w:r>
-            <w:r>
-              <w:rPr>
-                <w:b/>
-                <w:sz w:val="20"/>
-                <w:szCs w:val="20"/>
-              </w:rPr>
-              <w:t>/</w:t>
-            </w:r>
-            <w:r>
-              <w:rPr>
-                <w:b/>
-                <w:sz w:val="20"/>
-                <w:szCs w:val="20"/>
-              </w:rPr>
-              <w:t>test person</w:t>
-            </w:r>
-          </w:p>
-        </w:tc>
-        <w:tc>
-          <w:tcPr>
-            <w:tcW w:w="3056" w:type="dxa"/>
-            <w:shd w:val="clear" w:color="auto" w:fill="152F4A"/>
-          </w:tcPr>
-          <w:p>
-            <w:pPr>
-              <w:widowControl w:val="0"/>
-              <w:rPr>
-                <w:b/>
-                <w:sz w:val="20"/>
-                <w:szCs w:val="20"/>
-              </w:rPr>
-            </w:pPr>
-            <w:r>
-              <w:rPr>
-                <w:b/>
-                <w:sz w:val="20"/>
-                <w:szCs w:val="20"/>
-              </w:rPr>
-              <w:t xml:space="preserve">Expected </w:t>
-            </w:r>
-            <w:r>
-              <w:rPr>
-                <w:b/>
-                <w:sz w:val="20"/>
-                <w:szCs w:val="20"/>
-              </w:rPr>
-              <w:t>r</w:t>
-            </w:r>
-            <w:r>
-              <w:rPr>
-                <w:b/>
-                <w:sz w:val="20"/>
-                <w:szCs w:val="20"/>
-              </w:rPr>
-              <w:t>esult</w:t>
-            </w:r>
-          </w:p>
-        </w:tc>
-        <w:tc>
-          <w:tcPr>
-            <w:tcW w:w="3120" w:type="dxa"/>
-            <w:shd w:val="clear" w:color="auto" w:fill="152F4A"/>
-          </w:tcPr>
-          <w:p>
-            <w:pPr>
-              <w:widowControl w:val="0"/>
-              <w:rPr>
-                <w:b/>
-                <w:sz w:val="20"/>
-                <w:szCs w:val="20"/>
-              </w:rPr>
-            </w:pPr>
-            <w:r>
-              <w:rPr>
-                <w:b/>
-                <w:sz w:val="20"/>
-                <w:szCs w:val="20"/>
-              </w:rPr>
-              <w:t>Actual</w:t>
-            </w:r>
-            <w:r>
-              <w:rPr>
-                <w:b/>
-                <w:sz w:val="20"/>
-                <w:szCs w:val="20"/>
-              </w:rPr>
-              <w:t xml:space="preserve"> </w:t>
-            </w:r>
-            <w:r>
-              <w:rPr>
-                <w:b/>
-                <w:sz w:val="20"/>
-                <w:szCs w:val="20"/>
-              </w:rPr>
-              <w:t>r</w:t>
-            </w:r>
-            <w:r>
-              <w:rPr>
-                <w:b/>
-                <w:sz w:val="20"/>
-                <w:szCs w:val="20"/>
-              </w:rPr>
-              <w:t>esult</w:t>
-            </w:r>
-          </w:p>
-        </w:tc>
-        <w:tc>
-          <w:tcPr>
-            <w:tcW w:w="1380" w:type="dxa"/>
-            <w:shd w:val="clear" w:color="auto" w:fill="152F4A"/>
-          </w:tcPr>
-          <w:p>
-            <w:pPr>
-              <w:widowControl w:val="0"/>
-              <w:rPr>
-                <w:b/>
-                <w:sz w:val="20"/>
-                <w:szCs w:val="20"/>
-              </w:rPr>
-            </w:pPr>
-            <w:r>
-              <w:rPr>
-                <w:b/>
-                <w:sz w:val="20"/>
-                <w:szCs w:val="20"/>
-              </w:rPr>
-              <w:t>MedCom</w:t>
-            </w:r>
-            <w:r>
-              <w:rPr>
-                <w:b/>
-                <w:sz w:val="20"/>
-                <w:szCs w:val="20"/>
-              </w:rPr>
-              <w:t xml:space="preserve"> </w:t>
-            </w:r>
-            <w:r>
-              <w:rPr>
-                <w:b/>
-                <w:sz w:val="20"/>
-                <w:szCs w:val="20"/>
-              </w:rPr>
-              <w:t>assessment</w:t>
-            </w:r>
-          </w:p>
-        </w:tc>
-      </w:tr>
-      <w:tr>
-        <w:tc>
-          <w:tcPr>
-            <w:tcW w:w="1260" w:type="dxa"/>
-          </w:tcPr>
-          <w:p>
-            <w:pPr>
-              <w:pStyle w:val="Listeafsnit"/>
-              <w:numPr>
-                <w:ilvl w:val="3"/>
-                <w:numId w:val="5"/>
-              </w:numPr>
-              <w:spacing w:line="240" w:lineRule="auto"/>
-              <w:rPr>
-                <w:sz w:val="20"/>
-                <w:szCs w:val="20"/>
-              </w:rPr>
-            </w:pPr>
-          </w:p>
-        </w:tc>
-        <w:tc>
-          <w:tcPr>
-            <w:tcW w:w="2551" w:type="dxa"/>
-          </w:tcPr>
-          <w:p>
-            <w:pPr>
-              <w:widowControl w:val="0"/>
-              <w:rPr>
-                <w:sz w:val="20"/>
-                <w:szCs w:val="20"/>
-                <w:lang w:val="en-US"/>
-              </w:rPr>
-            </w:pPr>
-            <w:r>
-              <w:rPr>
-                <w:sz w:val="20"/>
-                <w:szCs w:val="20"/>
-                <w:lang w:val="en-US"/>
-              </w:rPr>
-              <w:t>Load test data and demonstrate how the SUT handles invalid messages, e.g. missing valid “Commun</w:t>
-            </w:r>
-            <w:r>
-              <w:rPr>
-                <w:sz w:val="20"/>
-                <w:szCs w:val="20"/>
-                <w:lang w:val="en-US"/>
-              </w:rPr>
-              <w:t>i</w:t>
-            </w:r>
-            <w:r>
-              <w:rPr>
-                <w:sz w:val="20"/>
-                <w:szCs w:val="20"/>
-                <w:lang w:val="en-US"/>
-              </w:rPr>
-              <w:t>cation.category”</w:t>
-            </w:r>
-            <w:r>
-              <w:rPr>
-                <w:sz w:val="20"/>
-                <w:szCs w:val="20"/>
-                <w:lang w:val="en-US"/>
-              </w:rPr>
-              <w:t>.</w:t>
-            </w:r>
-          </w:p>
-        </w:tc>
-        <w:tc>
-          <w:tcPr>
-            <w:tcW w:w="2059" w:type="dxa"/>
-          </w:tcPr>
-          <w:p>
-            <w:pPr>
-              <w:widowControl w:val="0"/>
-              <w:rPr>
-                <w:sz w:val="20"/>
-                <w:szCs w:val="20"/>
-                <w:lang w:val="en-US"/>
-              </w:rPr>
-            </w:pPr>
-            <w:r>
-              <w:rPr>
-                <w:sz w:val="20"/>
-                <w:szCs w:val="20"/>
-                <w:lang w:val="en-US"/>
-              </w:rPr>
-              <w:t>R-Tek-O-invalid-3d1149cd-d3e3-421a-ae31-4860decb4272</w:t>
-            </w:r>
-          </w:p>
-          <w:p>
-            <w:pPr>
-              <w:widowControl w:val="0"/>
-              <w:rPr>
-                <w:sz w:val="20"/>
-                <w:szCs w:val="20"/>
-                <w:lang w:val="en-US"/>
-              </w:rPr>
-            </w:pPr>
-          </w:p>
-        </w:tc>
-        <w:tc>
-          <w:tcPr>
-            <w:tcW w:w="3056" w:type="dxa"/>
-          </w:tcPr>
-          <w:p>
-            <w:pPr>
-              <w:widowControl w:val="0"/>
-              <w:rPr>
-                <w:sz w:val="20"/>
-                <w:szCs w:val="20"/>
-                <w:lang w:val="en-US"/>
-              </w:rPr>
-            </w:pPr>
-            <w:r>
-              <w:rPr>
-                <w:sz w:val="20"/>
-                <w:szCs w:val="20"/>
-                <w:lang w:val="en-US"/>
-              </w:rPr>
-              <w:t xml:space="preserve">The SUT returns a FHIR Acknowledgement (Kvittering) </w:t>
-            </w:r>
-            <w:r>
-              <w:rPr>
-                <w:sz w:val="20"/>
-                <w:szCs w:val="20"/>
-                <w:lang w:val="en-US"/>
-              </w:rPr>
-              <w:t xml:space="preserve">of type </w:t>
-            </w:r>
-            <w:r>
-              <w:rPr>
-                <w:sz w:val="20"/>
-                <w:szCs w:val="20"/>
-                <w:lang w:val="en-US"/>
-              </w:rPr>
-              <w:t>fatal error (</w:t>
-            </w:r>
-            <w:r>
-              <w:rPr>
-                <w:sz w:val="20"/>
-                <w:szCs w:val="20"/>
-                <w:lang w:val="en-US"/>
-              </w:rPr>
-              <w:t>AE</w:t>
-            </w:r>
-            <w:r>
-              <w:rPr>
-                <w:sz w:val="20"/>
-                <w:szCs w:val="20"/>
-                <w:lang w:val="en-US"/>
-              </w:rPr>
-              <w:t>)</w:t>
-            </w:r>
-            <w:r>
-              <w:rPr>
-                <w:sz w:val="20"/>
-                <w:szCs w:val="20"/>
-                <w:lang w:val="en-US"/>
-              </w:rPr>
-              <w:t xml:space="preserve">, </w:t>
-            </w:r>
-            <w:r>
-              <w:rPr>
-                <w:sz w:val="20"/>
-                <w:szCs w:val="20"/>
-                <w:lang w:val="en-US"/>
-              </w:rPr>
-              <w:t xml:space="preserve">where the error is described. </w:t>
-            </w:r>
-          </w:p>
-        </w:tc>
-        <w:tc>
-          <w:tcPr>
-            <w:tcW w:w="3120" w:type="dxa"/>
-          </w:tcPr>
-          <w:p>
-            <w:pPr>
-              <w:widowControl w:val="0"/>
-              <w:jc w:val="center"/>
-              <w:rPr>
-                <w:sz w:val="20"/>
-                <w:szCs w:val="20"/>
-                <w:lang w:val="en-US"/>
-              </w:rPr>
-            </w:pPr>
-          </w:p>
-        </w:tc>
-        <w:tc>
-          <w:tcPr>
-            <w:tcW w:w="1380" w:type="dxa"/>
-          </w:tcPr>
-          <w:p>
-            <w:pPr>
-              <w:widowControl w:val="0"/>
-              <w:jc w:val="center"/>
-              <w:rPr>
-                <w:sz w:val="20"/>
-                <w:szCs w:val="20"/>
-              </w:rPr>
-            </w:pPr>
-            <w:sdt>
-              <w:sdtPr>
-                <w:rPr>
-                  <w:sz w:val="20"/>
-                  <w:szCs w:val="20"/>
-                </w:rPr>
-                <w:alias w:val="MedCom vurdering"/>
-                <w:tag w:val="MedCom vurdering"/>
-                <w:id w:val="559060751"/>
-                <w:placeholder>
-                  <w:docPart w:val="A267C0411C1E45CC931E8B852332776D"/>
-                </w:placeholder>
-                <w:dropDownList>
-                  <w:listItem w:value="Vælg"/>
-                  <w:listItem w:displayText="F1" w:value="F1"/>
-                  <w:listItem w:displayText="F2" w:value="F2"/>
-                  <w:listItem w:displayText="F3" w:value="F3"/>
-                  <w:listItem w:displayText="F4" w:value="F4"/>
-                  <w:listItem w:displayText="OK" w:value="OK"/>
-                  <w:listItem w:displayText="Ej relevant" w:value="Ej relevant"/>
-                </w:dropDownList>
-              </w:sdtPr>
-              <w:sdtEndPr/>
-              <w:sdtContent>
-                <w:r>
-                  <w:rPr>
-                    <w:rStyle w:val="Pladsholdertekst"/>
-                    <w:sz w:val="20"/>
-                    <w:szCs w:val="20"/>
-                  </w:rPr>
-                  <w:t>Choose</w:t>
-                </w:r>
-              </w:sdtContent>
-            </w:sdt>
-          </w:p>
-        </w:tc>
-      </w:tr>
-      <w:tr>
-        <w:tc>
-          <w:tcPr>
-            <w:tcW w:w="1260" w:type="dxa"/>
-          </w:tcPr>
-          <w:p>
-            <w:pPr>
-              <w:pStyle w:val="Listeafsnit"/>
-              <w:numPr>
-                <w:ilvl w:val="3"/>
-                <w:numId w:val="5"/>
-              </w:numPr>
-              <w:spacing w:line="240" w:lineRule="auto"/>
-              <w:rPr>
-                <w:sz w:val="20"/>
-                <w:szCs w:val="20"/>
-              </w:rPr>
-            </w:pPr>
-          </w:p>
-        </w:tc>
-        <w:tc>
-          <w:tcPr>
-            <w:tcW w:w="2551" w:type="dxa"/>
-          </w:tcPr>
-          <w:p>
-            <w:pPr>
-              <w:widowControl w:val="0"/>
-              <w:rPr>
-                <w:sz w:val="20"/>
-                <w:szCs w:val="20"/>
-                <w:lang w:val="en-US"/>
-              </w:rPr>
-            </w:pPr>
-            <w:r>
-              <w:rPr>
-                <w:sz w:val="20"/>
-                <w:szCs w:val="20"/>
-                <w:lang w:val="en-US"/>
-              </w:rPr>
-              <w:t>SUT does not display the invalid CareCommunication</w:t>
-            </w:r>
-            <w:r>
-              <w:rPr>
-                <w:sz w:val="20"/>
-                <w:szCs w:val="20"/>
-                <w:lang w:val="en-US"/>
-              </w:rPr>
-              <w:t xml:space="preserve">. </w:t>
-            </w:r>
-          </w:p>
-        </w:tc>
-        <w:tc>
-          <w:tcPr>
-            <w:tcW w:w="2059" w:type="dxa"/>
-          </w:tcPr>
-          <w:p>
-            <w:pPr>
-              <w:widowControl w:val="0"/>
-              <w:rPr>
-                <w:sz w:val="20"/>
-                <w:szCs w:val="20"/>
-                <w:lang w:val="en-US"/>
-              </w:rPr>
-            </w:pPr>
-          </w:p>
-        </w:tc>
-        <w:tc>
-          <w:tcPr>
-            <w:tcW w:w="3056" w:type="dxa"/>
-          </w:tcPr>
-          <w:p>
-            <w:pPr>
-              <w:widowControl w:val="0"/>
-              <w:rPr>
-                <w:sz w:val="20"/>
-                <w:szCs w:val="20"/>
-                <w:lang w:val="en-US"/>
-              </w:rPr>
-            </w:pPr>
-            <w:r>
-              <w:rPr>
-                <w:sz w:val="20"/>
-                <w:szCs w:val="20"/>
-                <w:lang w:val="en-US"/>
-              </w:rPr>
-              <w:t xml:space="preserve">The SUT does not show the </w:t>
-            </w:r>
-            <w:r>
-              <w:rPr>
-                <w:sz w:val="20"/>
-                <w:szCs w:val="20"/>
-                <w:lang w:val="en-US"/>
-              </w:rPr>
-              <w:t>invalid</w:t>
-            </w:r>
-            <w:r>
-              <w:rPr>
-                <w:sz w:val="20"/>
-                <w:szCs w:val="20"/>
-                <w:lang w:val="en-US"/>
-              </w:rPr>
-              <w:t xml:space="preserve"> message.</w:t>
-            </w:r>
-          </w:p>
-        </w:tc>
-        <w:tc>
-          <w:tcPr>
-            <w:tcW w:w="3120" w:type="dxa"/>
-          </w:tcPr>
-          <w:p>
-            <w:pPr>
-              <w:widowControl w:val="0"/>
-              <w:jc w:val="center"/>
-              <w:rPr>
-                <w:sz w:val="20"/>
-                <w:szCs w:val="20"/>
-                <w:lang w:val="en-US"/>
-              </w:rPr>
-            </w:pPr>
-          </w:p>
-        </w:tc>
-        <w:tc>
-          <w:tcPr>
-            <w:tcW w:w="1380" w:type="dxa"/>
-          </w:tcPr>
-          <w:p>
-            <w:pPr>
-              <w:widowControl w:val="0"/>
-              <w:jc w:val="center"/>
-              <w:rPr>
-                <w:sz w:val="20"/>
-                <w:szCs w:val="20"/>
-              </w:rPr>
-            </w:pPr>
-            <w:sdt>
-              <w:sdtPr>
-                <w:rPr>
-                  <w:sz w:val="20"/>
-                  <w:szCs w:val="20"/>
-                </w:rPr>
-                <w:alias w:val="MedCom vurdering"/>
-                <w:tag w:val="MedCom vurdering"/>
-                <w:id w:val="2107844931"/>
-                <w:placeholder>
-                  <w:docPart w:val="012DDCE9416C4D5EAFAC977E2BFA361C"/>
-                </w:placeholder>
-                <w:dropDownList>
-                  <w:listItem w:value="Vælg"/>
-                  <w:listItem w:displayText="F1" w:value="F1"/>
-                  <w:listItem w:displayText="F2" w:value="F2"/>
-                  <w:listItem w:displayText="F3" w:value="F3"/>
-                  <w:listItem w:displayText="F4" w:value="F4"/>
-                  <w:listItem w:displayText="OK" w:value="OK"/>
-                  <w:listItem w:displayText="Ej relevant" w:value="Ej relevant"/>
-                </w:dropDownList>
-              </w:sdtPr>
-              <w:sdtEndPr/>
-              <w:sdtContent>
-                <w:r>
-                  <w:rPr>
-                    <w:rStyle w:val="Pladsholdertekst"/>
-                    <w:sz w:val="20"/>
-                    <w:szCs w:val="20"/>
-                  </w:rPr>
-                  <w:t>Choose</w:t>
-                </w:r>
-              </w:sdtContent>
-            </w:sdt>
-          </w:p>
-        </w:tc>
-      </w:tr>
-    </w:tbl>
-    <w:p>
-      <w:pPr>
-        <w:pStyle w:val="Overskrift3"/>
-      </w:pPr>
-    </w:p>
     <w:p/>
     <w:sectPr>
-      <w:headerReference w:type="default" r:id="rId24"/>
-      <w:footerReference w:type="default" r:id="rId25"/>
+      <w:headerReference w:type="default" r:id="rId25"/>
+      <w:footerReference w:type="default" r:id="rId26"/>
       <w:pgSz w:w="16838" w:h="11906" w:orient="landscape"/>
       <w:pgMar w:top="1134" w:right="1701" w:bottom="1134" w:left="1701" w:header="708" w:footer="708" w:gutter="0"/>
       <w:cols w:space="708"/>
@@ -25092,6 +25463,9 @@
       <w:gridCol w:w="1654"/>
     </w:tblGrid>
     <w:tr>
+      <w:trPr>
+        <w:trHeight w:val="315"/>
+      </w:trPr>
       <w:tc>
         <w:tcPr>
           <w:tcW w:w="700" w:type="pct"/>
@@ -25558,6 +25932,14 @@
             </w:rPr>
             <w:t>5.0</w:t>
           </w:r>
+          <w:r>
+            <w:rPr>
+              <w:rFonts w:ascii="Calibri" w:hAnsi="Calibri" w:cs="Times New Roman"/>
+              <w:sz w:val="16"/>
+              <w:szCs w:val="16"/>
+            </w:rPr>
+            <w:t>.1</w:t>
+          </w:r>
         </w:p>
       </w:tc>
       <w:tc>
@@ -25582,14 +25964,6 @@
               <w:sz w:val="16"/>
               <w:szCs w:val="16"/>
             </w:rPr>
-            <w:t>October</w:t>
-          </w:r>
-          <w:r>
-            <w:rPr>
-              <w:rFonts w:ascii="Calibri" w:hAnsi="Calibri" w:cs="Times New Roman"/>
-              <w:sz w:val="16"/>
-              <w:szCs w:val="16"/>
-            </w:rPr>
             <w:t xml:space="preserve"> </w:t>
           </w:r>
           <w:r>
@@ -25598,7 +25972,15 @@
               <w:sz w:val="16"/>
               <w:szCs w:val="16"/>
             </w:rPr>
-            <w:t>2025</w:t>
+            <w:t>July</w:t>
+          </w:r>
+          <w:r>
+            <w:rPr>
+              <w:rFonts w:ascii="Calibri" w:hAnsi="Calibri" w:cs="Times New Roman"/>
+              <w:sz w:val="16"/>
+              <w:szCs w:val="16"/>
+            </w:rPr>
+            <w:t xml:space="preserve"> 2026</w:t>
           </w:r>
         </w:p>
       </w:tc>
@@ -27419,7 +27801,7 @@
       <w:lvlText w:val="2.%1"/>
       <w:lvlJc w:val="left"/>
       <w:pPr>
-        <w:ind w:left="720" w:hanging="360"/>
+        <w:ind w:left="360" w:hanging="360"/>
       </w:pPr>
       <w:rPr>
         <w:rFonts w:hint="default"/>
@@ -27431,7 +27813,7 @@
       <w:lvlText w:val="%2."/>
       <w:lvlJc w:val="left"/>
       <w:pPr>
-        <w:ind w:left="1440" w:hanging="360"/>
+        <w:ind w:left="1080" w:hanging="360"/>
       </w:pPr>
     </w:lvl>
     <w:lvl w:ilvl="2" w:tplc="0406001B" w:tentative="1">
@@ -27440,7 +27822,7 @@
       <w:lvlText w:val="%3."/>
       <w:lvlJc w:val="right"/>
       <w:pPr>
-        <w:ind w:left="2160" w:hanging="180"/>
+        <w:ind w:left="1800" w:hanging="180"/>
       </w:pPr>
     </w:lvl>
     <w:lvl w:ilvl="3" w:tplc="0406000F" w:tentative="1">
@@ -27449,7 +27831,7 @@
       <w:lvlText w:val="%4."/>
       <w:lvlJc w:val="left"/>
       <w:pPr>
-        <w:ind w:left="2880" w:hanging="360"/>
+        <w:ind w:left="2520" w:hanging="360"/>
       </w:pPr>
     </w:lvl>
     <w:lvl w:ilvl="4" w:tplc="04060019" w:tentative="1">
@@ -27458,7 +27840,7 @@
       <w:lvlText w:val="%5."/>
       <w:lvlJc w:val="left"/>
       <w:pPr>
-        <w:ind w:left="3600" w:hanging="360"/>
+        <w:ind w:left="3240" w:hanging="360"/>
       </w:pPr>
     </w:lvl>
     <w:lvl w:ilvl="5" w:tplc="0406001B" w:tentative="1">
@@ -27467,7 +27849,7 @@
       <w:lvlText w:val="%6."/>
       <w:lvlJc w:val="right"/>
       <w:pPr>
-        <w:ind w:left="4320" w:hanging="180"/>
+        <w:ind w:left="3960" w:hanging="180"/>
       </w:pPr>
     </w:lvl>
     <w:lvl w:ilvl="6" w:tplc="0406000F" w:tentative="1">
@@ -27476,7 +27858,7 @@
       <w:lvlText w:val="%7."/>
       <w:lvlJc w:val="left"/>
       <w:pPr>
-        <w:ind w:left="5040" w:hanging="360"/>
+        <w:ind w:left="4680" w:hanging="360"/>
       </w:pPr>
     </w:lvl>
     <w:lvl w:ilvl="7" w:tplc="04060019" w:tentative="1">
@@ -27485,7 +27867,7 @@
       <w:lvlText w:val="%8."/>
       <w:lvlJc w:val="left"/>
       <w:pPr>
-        <w:ind w:left="5760" w:hanging="360"/>
+        <w:ind w:left="5400" w:hanging="360"/>
       </w:pPr>
     </w:lvl>
     <w:lvl w:ilvl="8" w:tplc="0406001B" w:tentative="1">
@@ -27494,7 +27876,7 @@
       <w:lvlText w:val="%9."/>
       <w:lvlJc w:val="right"/>
       <w:pPr>
-        <w:ind w:left="6480" w:hanging="180"/>
+        <w:ind w:left="6120" w:hanging="180"/>
       </w:pPr>
     </w:lvl>
   </w:abstractNum>
@@ -27621,7 +28003,7 @@
       <w:lvlText w:val="%1"/>
       <w:lvlJc w:val="left"/>
       <w:pPr>
-        <w:ind w:left="720" w:hanging="360"/>
+        <w:ind w:left="360" w:hanging="360"/>
       </w:pPr>
       <w:rPr>
         <w:rFonts w:hint="default"/>
@@ -27633,7 +28015,7 @@
       <w:lvlText w:val="%2."/>
       <w:lvlJc w:val="left"/>
       <w:pPr>
-        <w:ind w:left="1440" w:hanging="360"/>
+        <w:ind w:left="1080" w:hanging="360"/>
       </w:pPr>
     </w:lvl>
     <w:lvl w:ilvl="2" w:tplc="0406001B" w:tentative="1">
@@ -27642,7 +28024,7 @@
       <w:lvlText w:val="%3."/>
       <w:lvlJc w:val="right"/>
       <w:pPr>
-        <w:ind w:left="2160" w:hanging="180"/>
+        <w:ind w:left="1800" w:hanging="180"/>
       </w:pPr>
     </w:lvl>
     <w:lvl w:ilvl="3" w:tplc="0406000F" w:tentative="1">
@@ -27651,7 +28033,7 @@
       <w:lvlText w:val="%4."/>
       <w:lvlJc w:val="left"/>
       <w:pPr>
-        <w:ind w:left="2880" w:hanging="360"/>
+        <w:ind w:left="2520" w:hanging="360"/>
       </w:pPr>
     </w:lvl>
     <w:lvl w:ilvl="4" w:tplc="04060019" w:tentative="1">
@@ -27660,7 +28042,7 @@
       <w:lvlText w:val="%5."/>
       <w:lvlJc w:val="left"/>
       <w:pPr>
-        <w:ind w:left="3600" w:hanging="360"/>
+        <w:ind w:left="3240" w:hanging="360"/>
       </w:pPr>
     </w:lvl>
     <w:lvl w:ilvl="5" w:tplc="0406001B" w:tentative="1">
@@ -27669,7 +28051,7 @@
       <w:lvlText w:val="%6."/>
       <w:lvlJc w:val="right"/>
       <w:pPr>
-        <w:ind w:left="4320" w:hanging="180"/>
+        <w:ind w:left="3960" w:hanging="180"/>
       </w:pPr>
     </w:lvl>
     <w:lvl w:ilvl="6" w:tplc="0406000F" w:tentative="1">
@@ -27678,7 +28060,7 @@
       <w:lvlText w:val="%7."/>
       <w:lvlJc w:val="left"/>
       <w:pPr>
-        <w:ind w:left="5040" w:hanging="360"/>
+        <w:ind w:left="4680" w:hanging="360"/>
       </w:pPr>
     </w:lvl>
     <w:lvl w:ilvl="7" w:tplc="04060019" w:tentative="1">
@@ -27687,7 +28069,7 @@
       <w:lvlText w:val="%8."/>
       <w:lvlJc w:val="left"/>
       <w:pPr>
-        <w:ind w:left="5760" w:hanging="360"/>
+        <w:ind w:left="5400" w:hanging="360"/>
       </w:pPr>
     </w:lvl>
     <w:lvl w:ilvl="8" w:tplc="0406001B" w:tentative="1">
@@ -27696,7 +28078,7 @@
       <w:lvlText w:val="%9."/>
       <w:lvlJc w:val="right"/>
       <w:pPr>
-        <w:ind w:left="6480" w:hanging="180"/>
+        <w:ind w:left="6120" w:hanging="180"/>
       </w:pPr>
     </w:lvl>
   </w:abstractNum>
@@ -30108,7 +30490,7 @@
   <w:style w:type="paragraph" w:default="1" w:styleId="Normal">
     <w:name w:val="Normal"/>
     <w:qFormat/>
-    <w:rsid w:val="00B32C7A"/>
+    <w:rsid w:val="009F5BC1"/>
   </w:style>
   <w:style w:type="paragraph" w:styleId="Overskrift1">
     <w:name w:val="heading 1"/>
@@ -31830,36 +32212,6 @@
     </w:docPart>
     <w:docPart>
       <w:docPartPr>
-        <w:name w:val="012DDCE9416C4D5EAFAC977E2BFA361C"/>
-        <w:category>
-          <w:name w:val="Generelt"/>
-          <w:gallery w:val="placeholder"/>
-        </w:category>
-        <w:types>
-          <w:type w:val="bbPlcHdr"/>
-        </w:types>
-        <w:behaviors>
-          <w:behavior w:val="content"/>
-        </w:behaviors>
-        <w:guid w:val="{FC14A38D-4ACB-4072-BD55-73312D0AC128}"/>
-      </w:docPartPr>
-      <w:docPartBody>
-        <w:p>
-          <w:pPr>
-            <w:pStyle w:val="012DDCE9416C4D5EAFAC977E2BFA361C"/>
-          </w:pPr>
-          <w:r>
-            <w:rPr>
-              <w:rStyle w:val="Pladsholdertekst"/>
-              <w:rFonts w:eastAsia="Calibri"/>
-            </w:rPr>
-            <w:t>Vælg</w:t>
-          </w:r>
-        </w:p>
-      </w:docPartBody>
-    </w:docPart>
-    <w:docPart>
-      <w:docPartPr>
         <w:name w:val="984D7A0E53AB41B8860987009552F125"/>
         <w:category>
           <w:name w:val="Generelt"/>
@@ -32087,36 +32439,6 @@
         <w:p>
           <w:pPr>
             <w:pStyle w:val="C17981797AA94B9984E0FE4E20ABFC66"/>
-          </w:pPr>
-          <w:r>
-            <w:rPr>
-              <w:rStyle w:val="Pladsholdertekst"/>
-              <w:rFonts w:eastAsia="Calibri"/>
-            </w:rPr>
-            <w:t>Vælg</w:t>
-          </w:r>
-        </w:p>
-      </w:docPartBody>
-    </w:docPart>
-    <w:docPart>
-      <w:docPartPr>
-        <w:name w:val="A267C0411C1E45CC931E8B852332776D"/>
-        <w:category>
-          <w:name w:val="Generelt"/>
-          <w:gallery w:val="placeholder"/>
-        </w:category>
-        <w:types>
-          <w:type w:val="bbPlcHdr"/>
-        </w:types>
-        <w:behaviors>
-          <w:behavior w:val="content"/>
-        </w:behaviors>
-        <w:guid w:val="{EC12CC46-3567-4B65-AA8D-FD21DBF80797}"/>
-      </w:docPartPr>
-      <w:docPartBody>
-        <w:p>
-          <w:pPr>
-            <w:pStyle w:val="A267C0411C1E45CC931E8B852332776D"/>
           </w:pPr>
           <w:r>
             <w:rPr>
@@ -32490,36 +32812,6 @@
     </w:docPart>
     <w:docPart>
       <w:docPartPr>
-        <w:name w:val="77ECC03760164BECBDE97E2846ABB61D"/>
-        <w:category>
-          <w:name w:val="Generelt"/>
-          <w:gallery w:val="placeholder"/>
-        </w:category>
-        <w:types>
-          <w:type w:val="bbPlcHdr"/>
-        </w:types>
-        <w:behaviors>
-          <w:behavior w:val="content"/>
-        </w:behaviors>
-        <w:guid w:val="{69B4AB06-D9E4-4354-A78F-9A88AA1E706D}"/>
-      </w:docPartPr>
-      <w:docPartBody>
-        <w:p>
-          <w:pPr>
-            <w:pStyle w:val="77ECC03760164BECBDE97E2846ABB61D"/>
-          </w:pPr>
-          <w:r>
-            <w:rPr>
-              <w:rStyle w:val="Pladsholdertekst"/>
-              <w:rFonts w:eastAsia="Calibri"/>
-            </w:rPr>
-            <w:t>Vælg</w:t>
-          </w:r>
-        </w:p>
-      </w:docPartBody>
-    </w:docPart>
-    <w:docPart>
-      <w:docPartPr>
         <w:name w:val="F147564D24424CEF8E6CEFF4421BBF1E"/>
         <w:category>
           <w:name w:val="Generelt"/>
@@ -32878,6 +33170,96 @@
         </w:p>
       </w:docPartBody>
     </w:docPart>
+    <w:docPart>
+      <w:docPartPr>
+        <w:name w:val="04316D5D34F84F3CA200EFAAD972C321"/>
+        <w:category>
+          <w:name w:val="Generelt"/>
+          <w:gallery w:val="placeholder"/>
+        </w:category>
+        <w:types>
+          <w:type w:val="bbPlcHdr"/>
+        </w:types>
+        <w:behaviors>
+          <w:behavior w:val="content"/>
+        </w:behaviors>
+        <w:guid w:val="{75CEE035-8FB3-4DDC-B312-EA088B6918D4}"/>
+      </w:docPartPr>
+      <w:docPartBody>
+        <w:p>
+          <w:pPr>
+            <w:pStyle w:val="04316D5D34F84F3CA200EFAAD972C321"/>
+          </w:pPr>
+          <w:r>
+            <w:rPr>
+              <w:rStyle w:val="Pladsholdertekst"/>
+              <w:rFonts w:eastAsia="Calibri"/>
+            </w:rPr>
+            <w:t>Vælg</w:t>
+          </w:r>
+        </w:p>
+      </w:docPartBody>
+    </w:docPart>
+    <w:docPart>
+      <w:docPartPr>
+        <w:name w:val="292480F98CB24E75961EF69BAB33D828"/>
+        <w:category>
+          <w:name w:val="Generelt"/>
+          <w:gallery w:val="placeholder"/>
+        </w:category>
+        <w:types>
+          <w:type w:val="bbPlcHdr"/>
+        </w:types>
+        <w:behaviors>
+          <w:behavior w:val="content"/>
+        </w:behaviors>
+        <w:guid w:val="{62EB5C90-8BEB-48B0-A47F-88AC517885BE}"/>
+      </w:docPartPr>
+      <w:docPartBody>
+        <w:p>
+          <w:pPr>
+            <w:pStyle w:val="292480F98CB24E75961EF69BAB33D828"/>
+          </w:pPr>
+          <w:r>
+            <w:rPr>
+              <w:rStyle w:val="Pladsholdertekst"/>
+              <w:rFonts w:eastAsia="Calibri"/>
+            </w:rPr>
+            <w:t>Vælg</w:t>
+          </w:r>
+        </w:p>
+      </w:docPartBody>
+    </w:docPart>
+    <w:docPart>
+      <w:docPartPr>
+        <w:name w:val="22B6ABDDFAB0477480575E68CFC89193"/>
+        <w:category>
+          <w:name w:val="Generelt"/>
+          <w:gallery w:val="placeholder"/>
+        </w:category>
+        <w:types>
+          <w:type w:val="bbPlcHdr"/>
+        </w:types>
+        <w:behaviors>
+          <w:behavior w:val="content"/>
+        </w:behaviors>
+        <w:guid w:val="{521B6A63-3D13-447C-9C31-7807520E9404}"/>
+      </w:docPartPr>
+      <w:docPartBody>
+        <w:p>
+          <w:pPr>
+            <w:pStyle w:val="22B6ABDDFAB0477480575E68CFC89193"/>
+          </w:pPr>
+          <w:r>
+            <w:rPr>
+              <w:rStyle w:val="Pladsholdertekst"/>
+              <w:rFonts w:eastAsia="Calibri"/>
+            </w:rPr>
+            <w:t>Vælg</w:t>
+          </w:r>
+        </w:p>
+      </w:docPartBody>
+    </w:docPart>
   </w:docParts>
 </w:glossaryDocument>
 </file>
@@ -32942,7 +33324,6 @@
     <w:sig w:usb0="E4002EFF" w:usb1="C200247B" w:usb2="00000009" w:usb3="00000000" w:csb0="000001FF" w:csb1="00000000"/>
   </w:font>
   <w:font w:name="Yu Mincho">
-    <w:altName w:val="游明朝"/>
     <w:charset w:val="80"/>
     <w:family w:val="roman"/>
     <w:pitch w:val="variable"/>
@@ -33006,7 +33387,9 @@
     <w:rsid w:val="00041FB4"/>
     <w:rsid w:val="00074E69"/>
     <w:rsid w:val="000847EF"/>
+    <w:rsid w:val="0009073B"/>
     <w:rsid w:val="000B3BD9"/>
+    <w:rsid w:val="000B48E6"/>
     <w:rsid w:val="000C1180"/>
     <w:rsid w:val="000F2867"/>
     <w:rsid w:val="000F2D0C"/>
@@ -33017,6 +33400,7 @@
     <w:rsid w:val="00165538"/>
     <w:rsid w:val="00181D4B"/>
     <w:rsid w:val="00184A4B"/>
+    <w:rsid w:val="00194C75"/>
     <w:rsid w:val="00197B57"/>
     <w:rsid w:val="001A1580"/>
     <w:rsid w:val="001A1954"/>
@@ -33024,6 +33408,7 @@
     <w:rsid w:val="001B313E"/>
     <w:rsid w:val="001B6378"/>
     <w:rsid w:val="0020067A"/>
+    <w:rsid w:val="002058FD"/>
     <w:rsid w:val="002137E5"/>
     <w:rsid w:val="00240FED"/>
     <w:rsid w:val="002470F5"/>
@@ -33033,8 +33418,11 @@
     <w:rsid w:val="002963FA"/>
     <w:rsid w:val="002C15F9"/>
     <w:rsid w:val="002C20A9"/>
+    <w:rsid w:val="002F26B4"/>
     <w:rsid w:val="00303856"/>
     <w:rsid w:val="00331D75"/>
+    <w:rsid w:val="00333908"/>
+    <w:rsid w:val="003357B4"/>
     <w:rsid w:val="00344DE2"/>
     <w:rsid w:val="00346D48"/>
     <w:rsid w:val="00361390"/>
@@ -33048,12 +33436,14 @@
     <w:rsid w:val="003D3508"/>
     <w:rsid w:val="003F2423"/>
     <w:rsid w:val="003F2B24"/>
+    <w:rsid w:val="00410597"/>
     <w:rsid w:val="004112C3"/>
     <w:rsid w:val="004115BD"/>
     <w:rsid w:val="00450784"/>
     <w:rsid w:val="00450B46"/>
     <w:rsid w:val="00460FA1"/>
     <w:rsid w:val="004C0914"/>
+    <w:rsid w:val="004D7D14"/>
     <w:rsid w:val="0050139A"/>
     <w:rsid w:val="0052532C"/>
     <w:rsid w:val="0054545A"/>
@@ -33067,14 +33457,17 @@
     <w:rsid w:val="00606FF9"/>
     <w:rsid w:val="00651CAC"/>
     <w:rsid w:val="00663886"/>
+    <w:rsid w:val="00665C5D"/>
     <w:rsid w:val="006A663F"/>
     <w:rsid w:val="006E3F24"/>
     <w:rsid w:val="007030A9"/>
+    <w:rsid w:val="00705061"/>
     <w:rsid w:val="00782E63"/>
     <w:rsid w:val="00786105"/>
     <w:rsid w:val="0079596F"/>
     <w:rsid w:val="007A22F3"/>
     <w:rsid w:val="007C03E7"/>
+    <w:rsid w:val="007C2BE7"/>
     <w:rsid w:val="007D7B94"/>
     <w:rsid w:val="007E17B2"/>
     <w:rsid w:val="007F3538"/>
@@ -33082,6 +33475,7 @@
     <w:rsid w:val="007F4581"/>
     <w:rsid w:val="00813795"/>
     <w:rsid w:val="00824CCA"/>
+    <w:rsid w:val="00850FB3"/>
     <w:rsid w:val="0085113F"/>
     <w:rsid w:val="00853057"/>
     <w:rsid w:val="00860772"/>
@@ -33112,22 +33506,22 @@
     <w:rsid w:val="00B971A0"/>
     <w:rsid w:val="00BA2BCC"/>
     <w:rsid w:val="00BD3370"/>
-    <w:rsid w:val="00BD4547"/>
     <w:rsid w:val="00BD7E08"/>
     <w:rsid w:val="00BD7F21"/>
     <w:rsid w:val="00BF5A99"/>
     <w:rsid w:val="00C04483"/>
     <w:rsid w:val="00C121E5"/>
     <w:rsid w:val="00C36B9D"/>
+    <w:rsid w:val="00C57F81"/>
     <w:rsid w:val="00C673FF"/>
     <w:rsid w:val="00C9249C"/>
     <w:rsid w:val="00C95CBC"/>
     <w:rsid w:val="00CB4C08"/>
     <w:rsid w:val="00CC122A"/>
     <w:rsid w:val="00CD6D4C"/>
-    <w:rsid w:val="00D13355"/>
     <w:rsid w:val="00D62667"/>
     <w:rsid w:val="00D93DF2"/>
+    <w:rsid w:val="00DA249C"/>
     <w:rsid w:val="00E31757"/>
     <w:rsid w:val="00E35D24"/>
     <w:rsid w:val="00E703E2"/>
@@ -33139,6 +33533,7 @@
     <w:rsid w:val="00EF4B9F"/>
     <w:rsid w:val="00F20357"/>
     <w:rsid w:val="00FB53F5"/>
+    <w:rsid w:val="00FB5C54"/>
     <w:rsid w:val="00FC25D0"/>
     <w:rsid w:val="00FC72C7"/>
     <w:rsid w:val="00FF0845"/>
@@ -33595,6 +33990,7 @@
     <w:basedOn w:val="Standardskrifttypeiafsnit"/>
     <w:uiPriority w:val="99"/>
     <w:semiHidden/>
+    <w:rsid w:val="00194C75"/>
     <w:rPr>
       <w:color w:val="808080"/>
     </w:rPr>
@@ -33921,11 +34317,29 @@
       <w14:ligatures w14:val="standardContextual"/>
     </w:rPr>
   </w:style>
-  <w:style w:type="paragraph" w:customStyle="1" w:styleId="012DDCE9416C4D5EAFAC977E2BFA361C">
-    <w:name w:val="012DDCE9416C4D5EAFAC977E2BFA361C"/>
-    <w:rsid w:val="008C236E"/>
+  <w:style w:type="paragraph" w:customStyle="1" w:styleId="22B6ABDDFAB0477480575E68CFC89193">
+    <w:name w:val="22B6ABDDFAB0477480575E68CFC89193"/>
+    <w:rsid w:val="00194C75"/>
+    <w:pPr>
+      <w:spacing w:line="278" w:lineRule="auto"/>
+    </w:pPr>
     <w:rPr>
       <w:kern w:val="2"/>
+      <w:sz w:val="24"/>
+      <w:szCs w:val="24"/>
+      <w14:ligatures w14:val="standardContextual"/>
+    </w:rPr>
+  </w:style>
+  <w:style w:type="paragraph" w:customStyle="1" w:styleId="04316D5D34F84F3CA200EFAAD972C321">
+    <w:name w:val="04316D5D34F84F3CA200EFAAD972C321"/>
+    <w:rsid w:val="002F26B4"/>
+    <w:pPr>
+      <w:spacing w:line="278" w:lineRule="auto"/>
+    </w:pPr>
+    <w:rPr>
+      <w:kern w:val="2"/>
+      <w:sz w:val="24"/>
+      <w:szCs w:val="24"/>
       <w14:ligatures w14:val="standardContextual"/>
     </w:rPr>
   </w:style>
@@ -34009,19 +34423,6 @@
   </w:style>
   <w:style w:type="paragraph" w:customStyle="1" w:styleId="C17981797AA94B9984E0FE4E20ABFC66">
     <w:name w:val="C17981797AA94B9984E0FE4E20ABFC66"/>
-    <w:rsid w:val="002137E5"/>
-    <w:pPr>
-      <w:spacing w:line="278" w:lineRule="auto"/>
-    </w:pPr>
-    <w:rPr>
-      <w:kern w:val="2"/>
-      <w:sz w:val="24"/>
-      <w:szCs w:val="24"/>
-      <w14:ligatures w14:val="standardContextual"/>
-    </w:rPr>
-  </w:style>
-  <w:style w:type="paragraph" w:customStyle="1" w:styleId="A267C0411C1E45CC931E8B852332776D">
-    <w:name w:val="A267C0411C1E45CC931E8B852332776D"/>
     <w:rsid w:val="002137E5"/>
     <w:pPr>
       <w:spacing w:line="278" w:lineRule="auto"/>
@@ -34161,8 +34562,8 @@
       <w14:ligatures w14:val="standardContextual"/>
     </w:rPr>
   </w:style>
-  <w:style w:type="paragraph" w:customStyle="1" w:styleId="77ECC03760164BECBDE97E2846ABB61D">
-    <w:name w:val="77ECC03760164BECBDE97E2846ABB61D"/>
+  <w:style w:type="paragraph" w:customStyle="1" w:styleId="F147564D24424CEF8E6CEFF4421BBF1E">
+    <w:name w:val="F147564D24424CEF8E6CEFF4421BBF1E"/>
     <w:pPr>
       <w:spacing w:line="278" w:lineRule="auto"/>
     </w:pPr>
@@ -34173,8 +34574,9 @@
       <w14:ligatures w14:val="standardContextual"/>
     </w:rPr>
   </w:style>
-  <w:style w:type="paragraph" w:customStyle="1" w:styleId="F147564D24424CEF8E6CEFF4421BBF1E">
-    <w:name w:val="F147564D24424CEF8E6CEFF4421BBF1E"/>
+  <w:style w:type="paragraph" w:customStyle="1" w:styleId="292480F98CB24E75961EF69BAB33D828">
+    <w:name w:val="292480F98CB24E75961EF69BAB33D828"/>
+    <w:rsid w:val="002F26B4"/>
     <w:pPr>
       <w:spacing w:line="278" w:lineRule="auto"/>
     </w:pPr>
@@ -34611,17 +35013,8 @@
 </file>
 
 <file path=customXml/item1.xml><?xml version="1.0" encoding="utf-8"?>
-<?mso-contentType ?>
-<FormTemplates xmlns="http://schemas.microsoft.com/sharepoint/v3/contenttype/forms">
-  <Display>DocumentLibraryForm</Display>
-  <Edit>DocumentLibraryForm</Edit>
-  <New>DocumentLibraryForm</New>
-</FormTemplates>
-</file>
-
-<file path=customXml/item2.xml><?xml version="1.0" encoding="utf-8"?>
-<ct:contentTypeSchema xmlns:ct="http://schemas.microsoft.com/office/2006/metadata/contentType" xmlns:ma="http://schemas.microsoft.com/office/2006/metadata/properties/metaAttributes" ct:_="" ma:_="" ma:contentTypeName="Dokument" ma:contentTypeID="0x010100CE3A8153F207434E9AE9E016B63FAED4" ma:contentTypeVersion="14" ma:contentTypeDescription="Opret et nyt dokument." ma:contentTypeScope="" ma:versionID="52bf93efd82d4e5a4b2dd25d42b7cc87">
-  <xsd:schema xmlns:xsd="http://www.w3.org/2001/XMLSchema" xmlns:xs="http://www.w3.org/2001/XMLSchema" xmlns:p="http://schemas.microsoft.com/office/2006/metadata/properties" xmlns:ns2="ee8ef5dc-6422-4132-ba28-a9150fefde4c" xmlns:ns3="672a50b0-1df9-4341-9d54-48b9c706e195" targetNamespace="http://schemas.microsoft.com/office/2006/metadata/properties" ma:root="true" ma:fieldsID="02e2b7d272b82d896a959b2d413e6733" ns2:_="" ns3:_="">
+<ct:contentTypeSchema xmlns:ct="http://schemas.microsoft.com/office/2006/metadata/contentType" xmlns:ma="http://schemas.microsoft.com/office/2006/metadata/properties/metaAttributes" ct:_="" ma:_="" ma:contentTypeName="Dokument" ma:contentTypeID="0x010100CE3A8153F207434E9AE9E016B63FAED4" ma:contentTypeVersion="14" ma:contentTypeDescription="Opret et nyt dokument." ma:contentTypeScope="" ma:versionID="4db7d70616debe2b560b99cfd97c8c41">
+  <xsd:schema xmlns:xsd="http://www.w3.org/2001/XMLSchema" xmlns:xs="http://www.w3.org/2001/XMLSchema" xmlns:p="http://schemas.microsoft.com/office/2006/metadata/properties" xmlns:ns2="ee8ef5dc-6422-4132-ba28-a9150fefde4c" xmlns:ns3="672a50b0-1df9-4341-9d54-48b9c706e195" targetNamespace="http://schemas.microsoft.com/office/2006/metadata/properties" ma:root="true" ma:fieldsID="7d79f90df4c2ae1b98b3ae311fc82e69" ns2:_="" ns3:_="">
     <xsd:import namespace="ee8ef5dc-6422-4132-ba28-a9150fefde4c"/>
     <xsd:import namespace="672a50b0-1df9-4341-9d54-48b9c706e195"/>
     <xsd:element name="properties">
@@ -34848,7 +35241,7 @@
 </ct:contentTypeSchema>
 </file>
 
-<file path=customXml/item3.xml><?xml version="1.0" encoding="utf-8"?>
+<file path=customXml/item2.xml><?xml version="1.0" encoding="utf-8"?>
 <p:properties xmlns:p="http://schemas.microsoft.com/office/2006/metadata/properties" xmlns:xsi="http://www.w3.org/2001/XMLSchema-instance" xmlns:pc="http://schemas.microsoft.com/office/infopath/2007/PartnerControls">
   <documentManagement>
     <lcf76f155ced4ddcb4097134ff3c332f xmlns="ee8ef5dc-6422-4132-ba28-a9150fefde4c">
@@ -34859,20 +35252,21 @@
 </p:properties>
 </file>
 
-<file path=customXml/item4.xml><?xml version="1.0" encoding="utf-8"?>
+<file path=customXml/item3.xml><?xml version="1.0" encoding="utf-8"?>
 <b:Sources xmlns:b="http://schemas.openxmlformats.org/officeDocument/2006/bibliography" xmlns="http://schemas.openxmlformats.org/officeDocument/2006/bibliography" SelectedStyle="\APASixthEditionOfficeOnline.xsl" StyleName="APA" Version="6"/>
 </file>
 
-<file path=customXml/itemProps1.xml><?xml version="1.0" encoding="utf-8"?>
-<ds:datastoreItem xmlns:ds="http://schemas.openxmlformats.org/officeDocument/2006/customXml" ds:itemID="{4C1D6B20-F8BE-413B-AE2E-76A50948A943}">
-  <ds:schemaRefs>
-    <ds:schemaRef ds:uri="http://schemas.microsoft.com/sharepoint/v3/contenttype/forms"/>
-  </ds:schemaRefs>
-</ds:datastoreItem>
+<file path=customXml/item4.xml><?xml version="1.0" encoding="utf-8"?>
+<?mso-contentType ?>
+<FormTemplates xmlns="http://schemas.microsoft.com/sharepoint/v3/contenttype/forms">
+  <Display>DocumentLibraryForm</Display>
+  <Edit>DocumentLibraryForm</Edit>
+  <New>DocumentLibraryForm</New>
+</FormTemplates>
 </file>
 
-<file path=customXml/itemProps2.xml><?xml version="1.0" encoding="utf-8"?>
-<ds:datastoreItem xmlns:ds="http://schemas.openxmlformats.org/officeDocument/2006/customXml" ds:itemID="{42F455F7-98EA-4863-8660-93F3A48933F3}">
+<file path=customXml/itemProps1.xml><?xml version="1.0" encoding="utf-8"?>
+<ds:datastoreItem xmlns:ds="http://schemas.openxmlformats.org/officeDocument/2006/customXml" ds:itemID="{E0C10802-6F9D-4B17-BE6F-443DFE2C8AE1}">
   <ds:schemaRefs>
     <ds:schemaRef ds:uri="http://schemas.microsoft.com/office/2006/metadata/contentType"/>
     <ds:schemaRef ds:uri="http://schemas.microsoft.com/office/2006/metadata/properties/metaAttributes"/>
@@ -34890,7 +35284,7 @@
 </ds:datastoreItem>
 </file>
 
-<file path=customXml/itemProps3.xml><?xml version="1.0" encoding="utf-8"?>
+<file path=customXml/itemProps2.xml><?xml version="1.0" encoding="utf-8"?>
 <ds:datastoreItem xmlns:ds="http://schemas.openxmlformats.org/officeDocument/2006/customXml" ds:itemID="{D00219BE-D6D3-49D3-A6E0-533534996ACF}">
   <ds:schemaRefs>
     <ds:schemaRef ds:uri="http://schemas.microsoft.com/office/2006/metadata/properties"/>
@@ -34901,10 +35295,18 @@
 </ds:datastoreItem>
 </file>
 
-<file path=customXml/itemProps4.xml><?xml version="1.0" encoding="utf-8"?>
+<file path=customXml/itemProps3.xml><?xml version="1.0" encoding="utf-8"?>
 <ds:datastoreItem xmlns:ds="http://schemas.openxmlformats.org/officeDocument/2006/customXml" ds:itemID="{18CEAC93-67DE-4A44-82DF-9DCF67599B3D}">
   <ds:schemaRefs>
     <ds:schemaRef ds:uri="http://schemas.openxmlformats.org/officeDocument/2006/bibliography"/>
   </ds:schemaRefs>
 </ds:datastoreItem>
+</file>
+
+<file path=customXml/itemProps4.xml><?xml version="1.0" encoding="utf-8"?>
+<ds:datastoreItem xmlns:ds="http://schemas.openxmlformats.org/officeDocument/2006/customXml" ds:itemID="{4C1D6B20-F8BE-413B-AE2E-76A50948A943}">
+  <ds:schemaRefs>
+    <ds:schemaRef ds:uri="http://schemas.microsoft.com/sharepoint/v3/contenttype/forms"/>
+  </ds:schemaRefs>
+</ds:datastoreItem>
 </file>
</xml_diff>